<commit_message>
feat: geolocation-based DTR geofencing
- DB: add latitude, longitude, geofence_radius to companies table (migrate_geolocation.js)
- Backend: companyController now returns GPS fields; new PUT /:id/location endpoint
- Backend: studentController getDeployment JOINs companies to include companyLat/Lng/geofenceRadius
- Backend: authController loadProfile now maps GPS fields for company users
- Frontend: new geolocation.ts utility (Haversine, checkGeofence, getCurrentPosition)
- Frontend: company ProfileTab - replaced Country/State/City dropdowns with plain address field + GPS capture + geofence radius slider + Save Location button
- Frontend: StudentDashboard - geofence gate on Time In/Out (grace mode if no GPS set)
- Frontend: DTRTab - geofence status banner (checking/allowed/out_of_range/denied/no_gps)
- Frontend: AddCompanyModal - reverted to simple form (GPS is set by HTE supervisor)
</commit_message>
<xml_diff>
--- a/public/JournalTemplate.docx
+++ b/public/JournalTemplate.docx
@@ -569,42 +569,7 @@
                                 <w:b/>
                                 <w:sz w:val="24"/>
                               </w:rPr>
-                              <w:t>1x1</w:t>
-                            </w:r>
-                            <w:r>
-                              <w:rPr>
-                                <w:rFonts w:ascii="Calibri"/>
-                                <w:b/>
-                                <w:spacing w:val="-7"/>
-                                <w:sz w:val="24"/>
-                              </w:rPr>
-                              <w:t xml:space="preserve"> </w:t>
-                            </w:r>
-                            <w:r>
-                              <w:rPr>
-                                <w:rFonts w:ascii="Calibri"/>
-                                <w:b/>
-                                <w:sz w:val="24"/>
-                              </w:rPr>
-                              <w:t>ID</w:t>
-                            </w:r>
-                            <w:r>
-                              <w:rPr>
-                                <w:rFonts w:ascii="Calibri"/>
-                                <w:b/>
-                                <w:spacing w:val="-4"/>
-                                <w:sz w:val="24"/>
-                              </w:rPr>
-                              <w:t xml:space="preserve"> </w:t>
-                            </w:r>
-                            <w:r>
-                              <w:rPr>
-                                <w:rFonts w:ascii="Calibri"/>
-                                <w:b/>
-                                <w:spacing w:val="-2"/>
-                                <w:sz w:val="24"/>
-                              </w:rPr>
-                              <w:t>Picture</w:t>
+                              <w:t>{profilepicture2x2}</w:t>
                             </w:r>
                           </w:p>
                         </w:txbxContent>
@@ -661,42 +626,7 @@
                           <w:b/>
                           <w:sz w:val="24"/>
                         </w:rPr>
-                        <w:t>1x1</w:t>
-                      </w:r>
-                      <w:r>
-                        <w:rPr>
-                          <w:rFonts w:ascii="Calibri"/>
-                          <w:b/>
-                          <w:spacing w:val="-7"/>
-                          <w:sz w:val="24"/>
-                        </w:rPr>
-                        <w:t xml:space="preserve"> </w:t>
-                      </w:r>
-                      <w:r>
-                        <w:rPr>
-                          <w:rFonts w:ascii="Calibri"/>
-                          <w:b/>
-                          <w:sz w:val="24"/>
-                        </w:rPr>
-                        <w:t>ID</w:t>
-                      </w:r>
-                      <w:r>
-                        <w:rPr>
-                          <w:rFonts w:ascii="Calibri"/>
-                          <w:b/>
-                          <w:spacing w:val="-4"/>
-                          <w:sz w:val="24"/>
-                        </w:rPr>
-                        <w:t xml:space="preserve"> </w:t>
-                      </w:r>
-                      <w:r>
-                        <w:rPr>
-                          <w:rFonts w:ascii="Calibri"/>
-                          <w:b/>
-                          <w:spacing w:val="-2"/>
-                          <w:sz w:val="24"/>
-                        </w:rPr>
-                        <w:t>Picture</w:t>
+                        <w:t>{profilepicture2x2}</w:t>
                       </w:r>
                     </w:p>
                   </w:txbxContent>
@@ -745,6 +675,24 @@
       </w:r>
       <w:r>
         <w:rPr>
+          <w:spacing w:val="-2"/>
+        </w:rPr>
+        <w:t xml:space="preserve">             </w:t>
+      </w:r>
+      <w:r>
+        <w:rPr>
+          <w:spacing w:val="-2"/>
+        </w:rPr>
+        <w:t xml:space="preserve">      </w:t>
+      </w:r>
+      <w:r>
+        <w:rPr>
+          <w:spacing w:val="-2"/>
+        </w:rPr>
+        <w:t xml:space="preserve">    {lastName}                                {firstName}                          {middleInitial}</w:t>
+      </w:r>
+      <w:r>
+        <w:rPr>
           <w:u w:val="single"/>
         </w:rPr>
         <w:tab/>
@@ -760,7 +708,7 @@
           <w:tab w:val="left" w:pos="9711"/>
           <w:tab w:val="left" w:pos="9747"/>
         </w:tabs>
-        <w:spacing w:before="21" w:line="362" w:lineRule="auto"/>
+        <w:spacing w:before="21" w:line="480" w:lineRule="auto"/>
         <w:ind w:left="360" w:right="307" w:firstLine="1619"/>
         <w:rPr>
           <w:sz w:val="24"/>
@@ -792,27 +740,35 @@
           <w:sz w:val="24"/>
           <w:u w:val="single"/>
         </w:rPr>
-        <w:tab/>
+        <w:t>{course}</w:t>
       </w:r>
       <w:r>
         <w:rPr>
           <w:sz w:val="24"/>
           <w:u w:val="single"/>
         </w:rPr>
-        <w:tab/>
+        <w:t xml:space="preserve">                    </w:t>
       </w:r>
       <w:r>
         <w:rPr>
           <w:sz w:val="24"/>
           <w:u w:val="single"/>
         </w:rPr>
-        <w:tab/>
-      </w:r>
-      <w:r>
-        <w:rPr>
-          <w:u w:val="single"/>
-        </w:rPr>
-        <w:tab/>
+        <w:t>{year}</w:t>
+      </w:r>
+      <w:r>
+        <w:rPr>
+          <w:sz w:val="24"/>
+          <w:u w:val="single"/>
+        </w:rPr>
+        <w:t xml:space="preserve">                </w:t>
+      </w:r>
+      <w:r>
+        <w:rPr>
+          <w:sz w:val="24"/>
+          <w:u w:val="single"/>
+        </w:rPr>
+        <w:t>{section}</w:t>
       </w:r>
     </w:p>
     <w:p>
@@ -825,7 +781,7 @@
           <w:tab w:val="left" w:pos="9711"/>
           <w:tab w:val="left" w:pos="9747"/>
         </w:tabs>
-        <w:spacing w:before="21" w:line="362" w:lineRule="auto"/>
+        <w:spacing w:before="21" w:line="480" w:lineRule="auto"/>
         <w:ind w:left="360" w:right="307"/>
         <w:rPr>
           <w:sz w:val="24"/>
@@ -851,28 +807,21 @@
           <w:sz w:val="24"/>
           <w:u w:val="single"/>
         </w:rPr>
-        <w:tab/>
+        <w:t>{address}</w:t>
       </w:r>
       <w:r>
         <w:rPr>
           <w:sz w:val="24"/>
           <w:u w:val="single"/>
         </w:rPr>
-        <w:tab/>
+        <w:t xml:space="preserve">‎ ‎ ‎ ‎ ‎ ‎ ‎ ‎ ‎ ‎ ‎ ‎ ‎ ‎ ‎ ‎ ‎ ‎ ‎ ‎ ‎ ‎ ‎ ‎ ‎ ‎ ‎ ‎ ‎ ‎ ‎ ‎ ‎ ‎ ‎ ‎ ‎ ‎ ‎ ‎ ‎ ‎ ‎ ‎ ‎ ‎ ‎ ‎ ‎ </w:t>
       </w:r>
       <w:r>
         <w:rPr>
           <w:sz w:val="24"/>
           <w:u w:val="single"/>
         </w:rPr>
-        <w:tab/>
-      </w:r>
-      <w:r>
-        <w:rPr>
-          <w:sz w:val="24"/>
-          <w:u w:val="single"/>
-        </w:rPr>
-        <w:tab/>
+        <w:t xml:space="preserve">       </w:t>
       </w:r>
     </w:p>
     <w:p>
@@ -885,7 +834,7 @@
           <w:tab w:val="left" w:pos="9711"/>
           <w:tab w:val="left" w:pos="9747"/>
         </w:tabs>
-        <w:spacing w:before="21" w:line="362" w:lineRule="auto"/>
+        <w:spacing w:before="21" w:line="480" w:lineRule="auto"/>
         <w:ind w:left="360" w:right="307"/>
         <w:rPr>
           <w:sz w:val="24"/>
@@ -902,42 +851,27 @@
           <w:sz w:val="24"/>
           <w:u w:val="single"/>
         </w:rPr>
-        <w:tab/>
+        <w:t xml:space="preserve">{dateOfBirth}                                 </w:t>
       </w:r>
       <w:r>
         <w:rPr>
           <w:sz w:val="24"/>
-          <w:u w:val="single"/>
-        </w:rPr>
-        <w:tab/>
+        </w:rPr>
+        <w:t xml:space="preserve">Age: </w:t>
       </w:r>
       <w:r>
         <w:rPr>
           <w:sz w:val="24"/>
-        </w:rPr>
-        <w:t xml:space="preserve">Age: </w:t>
+          <w:u w:val="single"/>
+        </w:rPr>
+        <w:t>{age}</w:t>
       </w:r>
       <w:r>
         <w:rPr>
           <w:sz w:val="24"/>
           <w:u w:val="single"/>
         </w:rPr>
-        <w:tab/>
-      </w:r>
-      <w:r>
-        <w:rPr>
-          <w:sz w:val="24"/>
-          <w:u w:val="single"/>
-        </w:rPr>
-        <w:tab/>
-      </w:r>
-      <w:r>
-        <w:rPr>
-          <w:spacing w:val="-31"/>
-          <w:sz w:val="24"/>
-          <w:u w:val="single"/>
-        </w:rPr>
-        <w:t xml:space="preserve"> </w:t>
+        <w:t>‎ ‎ ‎ ‎ ‎ ‎ ‎ ‎ ‎ ‎ ‎ ‎ ‎ ‎ ‎ ‎ ‎ ‎ ‎ ‎ ‎ ‎ ‎ ‎ ‎ ‎ ‎ ‎ ‎ ‎ ‎ ‎ ‎ ‎ ‎ ‎‎ ‎ ‎ ‎ ‎ ‎ ‎ ‎ ‎ ‎ ‎ ‎ ‎ ‎ ‎ ‎ ‎ ‎ ‎ ‎ ‎ ‎ ‎ ‎ ‎ ‎</w:t>
       </w:r>
       <w:r>
         <w:rPr>
@@ -956,7 +890,7 @@
           <w:tab w:val="left" w:pos="9711"/>
           <w:tab w:val="left" w:pos="9747"/>
         </w:tabs>
-        <w:spacing w:before="21" w:line="362" w:lineRule="auto"/>
+        <w:spacing w:before="21" w:line="480" w:lineRule="auto"/>
         <w:ind w:left="360" w:right="307"/>
         <w:rPr>
           <w:sz w:val="24"/>
@@ -974,14 +908,7 @@
           <w:sz w:val="24"/>
           <w:u w:val="single"/>
         </w:rPr>
-        <w:tab/>
-      </w:r>
-      <w:r>
-        <w:rPr>
-          <w:sz w:val="24"/>
-          <w:u w:val="single"/>
-        </w:rPr>
-        <w:tab/>
+        <w:t xml:space="preserve">{civilStatus}                                        </w:t>
       </w:r>
       <w:r>
         <w:rPr>
@@ -995,14 +922,60 @@
           <w:sz w:val="24"/>
           <w:u w:val="single"/>
         </w:rPr>
+        <w:t xml:space="preserve"> {religion}</w:t>
+      </w:r>
+      <w:r>
+        <w:rPr>
+          <w:sz w:val="24"/>
+          <w:u w:val="single"/>
+        </w:rPr>
+        <w:t>‎ ‎ ‎ ‎ ‎ ‎ ‎ ‎ ‎ ‎ ‎ ‎ ‎ ‎ ‎ ‎ ‎ ‎ ‎ ‎ ‎ ‎ ‎ ‎ ‎ ‎ ‎ ‎ ‎ ‎ ‎ ‎ ‎ ‎ ‎ ‎ ‎ ‎ ‎ ‎ ‎ ‎ ‎ ‎ ‎ ‎ ‎</w:t>
+      </w:r>
+      <w:r>
+        <w:rPr>
+          <w:sz w:val="24"/>
+        </w:rPr>
+        <w:t xml:space="preserve">Father’s Name: </w:t>
+      </w:r>
+      <w:r>
+        <w:rPr>
+          <w:rFonts w:ascii="Times New Roman" w:hAnsi="Times New Roman"/>
+          <w:sz w:val="24"/>
+          <w:u w:val="single"/>
+        </w:rPr>
         <w:tab/>
       </w:r>
       <w:r>
         <w:rPr>
+          <w:rFonts w:ascii="Times New Roman" w:hAnsi="Times New Roman"/>
           <w:sz w:val="24"/>
           <w:u w:val="single"/>
         </w:rPr>
         <w:tab/>
+      </w:r>
+      <w:r>
+        <w:rPr>
+          <w:rFonts w:ascii="Times New Roman" w:hAnsi="Times New Roman"/>
+          <w:sz w:val="24"/>
+          <w:u w:val="single"/>
+        </w:rPr>
+        <w:tab/>
+      </w:r>
+      <w:r>
+        <w:rPr>
+          <w:rFonts w:ascii="Times New Roman" w:hAnsi="Times New Roman"/>
+          <w:sz w:val="24"/>
+          <w:u w:val="single"/>
+        </w:rPr>
+        <w:tab/>
+      </w:r>
+      <w:r>
+        <w:rPr>
+          <w:rFonts w:ascii="Times New Roman" w:hAnsi="Times New Roman"/>
+          <w:sz w:val="24"/>
+          <w:u w:val="single"/>
+        </w:rPr>
+        <w:t>‎‎‎‎‎‎‎‎‎‎‎‎‎‎‎‎‎‎‎‎‎‎‎‎‎‎</w:t>
       </w:r>
     </w:p>
     <w:p>
@@ -1015,10 +988,9 @@
           <w:tab w:val="left" w:pos="9711"/>
           <w:tab w:val="left" w:pos="9747"/>
         </w:tabs>
-        <w:spacing w:before="21" w:line="362" w:lineRule="auto"/>
+        <w:spacing w:before="21" w:line="480" w:lineRule="auto"/>
         <w:ind w:left="360" w:right="307"/>
         <w:rPr>
-          <w:rFonts w:ascii="Times New Roman" w:hAnsi="Times New Roman"/>
           <w:sz w:val="24"/>
           <w:u w:val="single"/>
         </w:rPr>
@@ -1027,7 +999,7 @@
         <w:rPr>
           <w:sz w:val="24"/>
         </w:rPr>
-        <w:t xml:space="preserve">Father’s Name: </w:t>
+        <w:t xml:space="preserve">Mother’s Name: </w:t>
       </w:r>
       <w:r>
         <w:rPr>
@@ -1072,71 +1044,7 @@
           <w:tab w:val="left" w:pos="9711"/>
           <w:tab w:val="left" w:pos="9747"/>
         </w:tabs>
-        <w:spacing w:before="21" w:line="362" w:lineRule="auto"/>
-        <w:ind w:left="360" w:right="307"/>
-        <w:rPr>
-          <w:rFonts w:ascii="Times New Roman" w:hAnsi="Times New Roman"/>
-          <w:sz w:val="24"/>
-          <w:u w:val="single"/>
-        </w:rPr>
-      </w:pPr>
-      <w:r>
-        <w:rPr>
-          <w:rFonts w:ascii="Times New Roman" w:hAnsi="Times New Roman"/>
-          <w:sz w:val="24"/>
-        </w:rPr>
-        <w:t xml:space="preserve"> </w:t>
-      </w:r>
-      <w:r>
-        <w:rPr>
-          <w:sz w:val="24"/>
-        </w:rPr>
-        <w:t xml:space="preserve">Mother’s Name: </w:t>
-      </w:r>
-      <w:r>
-        <w:rPr>
-          <w:rFonts w:ascii="Times New Roman" w:hAnsi="Times New Roman"/>
-          <w:sz w:val="24"/>
-          <w:u w:val="single"/>
-        </w:rPr>
-        <w:tab/>
-      </w:r>
-      <w:r>
-        <w:rPr>
-          <w:rFonts w:ascii="Times New Roman" w:hAnsi="Times New Roman"/>
-          <w:sz w:val="24"/>
-          <w:u w:val="single"/>
-        </w:rPr>
-        <w:tab/>
-      </w:r>
-      <w:r>
-        <w:rPr>
-          <w:rFonts w:ascii="Times New Roman" w:hAnsi="Times New Roman"/>
-          <w:sz w:val="24"/>
-          <w:u w:val="single"/>
-        </w:rPr>
-        <w:tab/>
-      </w:r>
-      <w:r>
-        <w:rPr>
-          <w:rFonts w:ascii="Times New Roman" w:hAnsi="Times New Roman"/>
-          <w:sz w:val="24"/>
-          <w:u w:val="single"/>
-        </w:rPr>
-        <w:tab/>
-      </w:r>
-    </w:p>
-    <w:p>
-      <w:pPr>
-        <w:tabs>
-          <w:tab w:val="left" w:pos="4594"/>
-          <w:tab w:val="left" w:pos="4839"/>
-          <w:tab w:val="left" w:pos="6968"/>
-          <w:tab w:val="left" w:pos="7184"/>
-          <w:tab w:val="left" w:pos="9711"/>
-          <w:tab w:val="left" w:pos="9747"/>
-        </w:tabs>
-        <w:spacing w:before="21" w:line="362" w:lineRule="auto"/>
+        <w:spacing w:before="21" w:line="480" w:lineRule="auto"/>
         <w:ind w:left="360" w:right="307"/>
         <w:rPr>
           <w:sz w:val="24"/>
@@ -1959,11 +1867,18 @@
           <w:tab w:val="left" w:pos="7066"/>
         </w:tabs>
         <w:ind w:left="720"/>
-        <w:jc w:val="right"/>
+        <w:jc w:val="center"/>
         <w:rPr>
           <w:sz w:val="28"/>
-        </w:rPr>
-      </w:pPr>
+          <w:u w:val="single"/>
+        </w:rPr>
+      </w:pPr>
+      <w:r>
+        <w:rPr>
+          <w:sz w:val="28"/>
+        </w:rPr>
+        <w:t xml:space="preserve">                     </w:t>
+      </w:r>
       <w:r>
         <w:rPr>
           <w:sz w:val="28"/>
@@ -1979,10 +1894,260 @@
       </w:r>
       <w:r>
         <w:rPr>
+          <w:spacing w:val="80"/>
           <w:sz w:val="28"/>
+          <w:u w:val="single"/>
+        </w:rPr>
+        <w:t xml:space="preserve">‎ ‎ ‎ </w:t>
+      </w:r>
+      <w:r>
+        <w:rPr>
+          <w:sz w:val="28"/>
+          <w:u w:val="single"/>
         </w:rPr>
         <w:t>{totalHours}</w:t>
       </w:r>
+      <w:r>
+        <w:rPr>
+          <w:sz w:val="28"/>
+          <w:u w:val="single"/>
+        </w:rPr>
+        <w:t>‎ ‎ ‎ ‎ ‎ ‎ ‎ ‎‎‎‎‎‎‎‎‎‎‎‎‎‎‎‎‎‎‎</w:t>
+      </w:r>
+    </w:p>
+    <w:p>
+      <w:pPr>
+        <w:ind w:left="14"/>
+        <w:rPr>
+          <w:sz w:val="28"/>
+        </w:rPr>
+      </w:pPr>
+      <w:r>
+        <w:rPr>
+          <w:spacing w:val="-2"/>
+          <w:sz w:val="28"/>
+        </w:rPr>
+        <w:t>Noted:</w:t>
+      </w:r>
+    </w:p>
+    <w:p>
+      <w:pPr>
+        <w:pStyle w:val="BodyText"/>
+        <w:spacing w:before="321"/>
+        <w:rPr>
+          <w:sz w:val="28"/>
+        </w:rPr>
+      </w:pPr>
+    </w:p>
+    <w:p>
+      <w:pPr>
+        <w:tabs>
+          <w:tab w:val="left" w:pos="952"/>
+          <w:tab w:val="left" w:pos="3833"/>
+          <w:tab w:val="left" w:pos="4553"/>
+          <w:tab w:val="left" w:pos="5273"/>
+          <w:tab w:val="left" w:pos="8153"/>
+        </w:tabs>
+        <w:spacing w:before="1"/>
+        <w:ind w:left="292"/>
+        <w:rPr>
+          <w:sz w:val="28"/>
+        </w:rPr>
+      </w:pPr>
+      <w:r>
+        <w:rPr>
+          <w:sz w:val="28"/>
+          <w:u w:val="single"/>
+        </w:rPr>
+        <w:t xml:space="preserve">            {studentname}</w:t>
+      </w:r>
+      <w:r>
+        <w:rPr>
+          <w:sz w:val="28"/>
+          <w:u w:val="single"/>
+        </w:rPr>
+        <w:t xml:space="preserve">             </w:t>
+      </w:r>
+      <w:r>
+        <w:rPr>
+          <w:sz w:val="28"/>
+        </w:rPr>
+        <w:t xml:space="preserve">     </w:t>
+      </w:r>
+      <w:r>
+        <w:rPr>
+          <w:sz w:val="28"/>
+        </w:rPr>
+        <w:tab/>
+      </w:r>
+      <w:r>
+        <w:rPr>
+          <w:sz w:val="28"/>
+        </w:rPr>
+        <w:t xml:space="preserve">        </w:t>
+      </w:r>
+      <w:r>
+        <w:rPr>
+          <w:sz w:val="28"/>
+          <w:u w:val="single"/>
+        </w:rPr>
+        <w:t xml:space="preserve">          </w:t>
+      </w:r>
+      <w:r>
+        <w:rPr>
+          <w:sz w:val="28"/>
+          <w:u w:val="single"/>
+        </w:rPr>
+        <w:t xml:space="preserve">        </w:t>
+      </w:r>
+      <w:r>
+        <w:rPr>
+          <w:sz w:val="28"/>
+          <w:u w:val="single"/>
+        </w:rPr>
+        <w:t xml:space="preserve"> </w:t>
+      </w:r>
+      <w:r>
+        <w:rPr>
+          <w:rFonts w:cstheme="minorHAnsi"/>
+          <w:sz w:val="28"/>
+          <w:szCs w:val="28"/>
+          <w:u w:val="single"/>
+        </w:rPr>
+        <w:t>{superviso</w:t>
+      </w:r>
+      <w:r>
+        <w:rPr>
+          <w:rFonts w:cstheme="minorHAnsi"/>
+          <w:sz w:val="28"/>
+          <w:szCs w:val="28"/>
+          <w:u w:val="single"/>
+        </w:rPr>
+        <w:t>r</w:t>
+      </w:r>
+      <w:r>
+        <w:rPr>
+          <w:rFonts w:cstheme="minorHAnsi"/>
+          <w:sz w:val="28"/>
+          <w:szCs w:val="28"/>
+          <w:u w:val="single"/>
+        </w:rPr>
+        <w:t>}</w:t>
+      </w:r>
+      <w:r>
+        <w:rPr>
+          <w:rFonts w:cstheme="minorHAnsi"/>
+          <w:sz w:val="28"/>
+          <w:szCs w:val="28"/>
+          <w:u w:val="single"/>
+        </w:rPr>
+        <w:t xml:space="preserve">‎‎ ‎ ‎ ‎ ‎ ‎ ‎ ‎ ‎ ‎ ‎ ‎ ‎ ‎ ‎ ‎ ‎ </w:t>
+      </w:r>
+      <w:r>
+        <w:rPr>
+          <w:sz w:val="28"/>
+          <w:u w:val="single"/>
+        </w:rPr>
+        <w:t xml:space="preserve">             </w:t>
+      </w:r>
+      <w:r>
+        <w:rPr>
+          <w:rFonts w:cstheme="minorHAnsi"/>
+          <w:sz w:val="28"/>
+          <w:szCs w:val="28"/>
+          <w:u w:val="single"/>
+        </w:rPr>
+        <w:t xml:space="preserve">   </w:t>
+      </w:r>
+      <w:r>
+        <w:rPr>
+          <w:rFonts w:cstheme="minorHAnsi"/>
+          <w:sz w:val="28"/>
+          <w:szCs w:val="28"/>
+          <w:u w:val="single"/>
+        </w:rPr>
+        <w:t xml:space="preserve">                    </w:t>
+      </w:r>
+    </w:p>
+    <w:p>
+      <w:pPr>
+        <w:pStyle w:val="BodyText"/>
+        <w:tabs>
+          <w:tab w:val="left" w:pos="4982"/>
+          <w:tab w:val="left" w:pos="5633"/>
+        </w:tabs>
+        <w:spacing w:before="37" w:line="247" w:lineRule="auto"/>
+        <w:ind w:left="720" w:right="659" w:hanging="516"/>
+        <w:jc w:val="center"/>
+      </w:pPr>
+      <w:r>
+        <w:t xml:space="preserve">     Student Intern</w:t>
+      </w:r>
+      <w:r>
+        <w:tab/>
+      </w:r>
+      <w:r>
+        <w:t xml:space="preserve">HTE Point/Focal Person </w:t>
+      </w:r>
+    </w:p>
+    <w:p>
+      <w:pPr>
+        <w:pStyle w:val="BodyText"/>
+        <w:tabs>
+          <w:tab w:val="left" w:pos="4982"/>
+          <w:tab w:val="left" w:pos="5633"/>
+        </w:tabs>
+        <w:spacing w:before="37" w:line="247" w:lineRule="auto"/>
+        <w:ind w:left="720" w:right="659" w:hanging="516"/>
+        <w:jc w:val="center"/>
+      </w:pPr>
+      <w:r>
+        <w:tab/>
+      </w:r>
+      <w:r>
+        <w:t>Printed Name</w:t>
+      </w:r>
+      <w:r>
+        <w:tab/>
+        <w:t>Signature</w:t>
+      </w:r>
+      <w:r>
+        <w:rPr>
+          <w:spacing w:val="-14"/>
+        </w:rPr>
+        <w:t xml:space="preserve"> </w:t>
+      </w:r>
+      <w:r>
+        <w:t>over</w:t>
+      </w:r>
+      <w:r>
+        <w:rPr>
+          <w:spacing w:val="-12"/>
+        </w:rPr>
+        <w:t xml:space="preserve"> </w:t>
+      </w:r>
+      <w:r>
+        <w:t>Printed</w:t>
+      </w:r>
+      <w:r>
+        <w:rPr>
+          <w:spacing w:val="-14"/>
+        </w:rPr>
+        <w:t xml:space="preserve"> </w:t>
+      </w:r>
+      <w:r>
+        <w:t>Name</w:t>
+      </w:r>
+    </w:p>
+    <w:p>
+      <w:pPr>
+        <w:tabs>
+          <w:tab w:val="left" w:pos="7066"/>
+        </w:tabs>
+        <w:rPr>
+          <w:sz w:val="28"/>
+        </w:rPr>
+      </w:pPr>
     </w:p>
     <w:p>
       <w:pPr>
@@ -3780,6 +3945,7 @@
   <w:style w:type="character" w:default="1" w:styleId="DefaultParagraphFont">
     <w:name w:val="Default Paragraph Font"/>
     <w:uiPriority w:val="1"/>
+    <w:semiHidden/>
     <w:unhideWhenUsed/>
   </w:style>
   <w:style w:type="table" w:default="1" w:styleId="TableNormal">

</xml_diff>

<commit_message>
Modernize Admin DTR layout, add functional profile picture upload, skills management, and journal grid image support
</commit_message>
<xml_diff>
--- a/public/JournalTemplate.docx
+++ b/public/JournalTemplate.docx
@@ -203,6 +203,7 @@
         </w:rPr>
         <w:t xml:space="preserve"> </w:t>
       </w:r>
+      <w:proofErr w:type="spellStart"/>
       <w:r>
         <w:rPr>
           <w:rFonts w:ascii="Cambria" w:hAnsi="Cambria"/>
@@ -210,7 +211,17 @@
           <w:sz w:val="32"/>
           <w:szCs w:val="32"/>
         </w:rPr>
-        <w:t>Bacolor,</w:t>
+        <w:t>Bacolor</w:t>
+      </w:r>
+      <w:proofErr w:type="spellEnd"/>
+      <w:r>
+        <w:rPr>
+          <w:rFonts w:ascii="Cambria" w:hAnsi="Cambria"/>
+          <w:color w:val="auto"/>
+          <w:sz w:val="32"/>
+          <w:szCs w:val="32"/>
+        </w:rPr>
+        <w:t>,</w:t>
       </w:r>
       <w:r>
         <w:rPr>
@@ -482,166 +493,38 @@
     </w:p>
     <w:p>
       <w:pPr>
+        <w:ind w:left="173"/>
+        <w:jc w:val="center"/>
+        <w:rPr>
+          <w:rFonts w:ascii="Calibri"/>
+          <w:b/>
+          <w:sz w:val="24"/>
+        </w:rPr>
+      </w:pPr>
+      <w:r>
+        <w:rPr>
+          <w:rFonts w:ascii="Calibri"/>
+          <w:b/>
+          <w:sz w:val="24"/>
+        </w:rPr>
+        <w:t>{%profilepicture2x2}</w:t>
+      </w:r>
+    </w:p>
+    <w:p>
+      <w:pPr>
         <w:pStyle w:val="BodyText"/>
         <w:spacing w:before="43"/>
+        <w:jc w:val="center"/>
         <w:rPr>
           <w:b/>
           <w:sz w:val="20"/>
         </w:rPr>
       </w:pPr>
-      <w:r>
-        <w:rPr>
-          <w:b/>
-          <w:noProof/>
-          <w:sz w:val="20"/>
-        </w:rPr>
-        <mc:AlternateContent>
-          <mc:Choice Requires="wps">
-            <w:drawing>
-              <wp:anchor distT="0" distB="0" distL="0" distR="0" simplePos="0" relativeHeight="251659264" behindDoc="1" locked="0" layoutInCell="1" allowOverlap="1" wp14:anchorId="026ABE71" wp14:editId="54189A37">
-                <wp:simplePos x="0" y="0"/>
-                <wp:positionH relativeFrom="page">
-                  <wp:posOffset>3380232</wp:posOffset>
-                </wp:positionH>
-                <wp:positionV relativeFrom="paragraph">
-                  <wp:posOffset>196810</wp:posOffset>
-                </wp:positionV>
-                <wp:extent cx="1094740" cy="982980"/>
-                <wp:effectExtent l="0" t="0" r="0" b="0"/>
-                <wp:wrapTopAndBottom/>
-                <wp:docPr id="32" name="Textbox 32"/>
-                <wp:cNvGraphicFramePr>
-                  <a:graphicFrameLocks xmlns:a="http://schemas.openxmlformats.org/drawingml/2006/main"/>
-                </wp:cNvGraphicFramePr>
-                <a:graphic xmlns:a="http://schemas.openxmlformats.org/drawingml/2006/main">
-                  <a:graphicData uri="http://schemas.microsoft.com/office/word/2010/wordprocessingShape">
-                    <wps:wsp>
-                      <wps:cNvSpPr txBox="1">
-                        <a:spLocks/>
-                      </wps:cNvSpPr>
-                      <wps:spPr>
-                        <a:xfrm>
-                          <a:off x="0" y="0"/>
-                          <a:ext cx="1094740" cy="982980"/>
-                        </a:xfrm>
-                        <a:prstGeom prst="rect">
-                          <a:avLst/>
-                        </a:prstGeom>
-                        <a:ln w="9144">
-                          <a:solidFill>
-                            <a:srgbClr val="000000"/>
-                          </a:solidFill>
-                          <a:prstDash val="solid"/>
-                        </a:ln>
-                      </wps:spPr>
-                      <wps:txbx>
-                        <w:txbxContent>
-                          <w:p>
-                            <w:pPr>
-                              <w:pStyle w:val="BodyText"/>
-                              <w:spacing w:before="0"/>
-                              <w:rPr>
-                                <w:b/>
-                              </w:rPr>
-                            </w:pPr>
-                          </w:p>
-                          <w:p>
-                            <w:pPr>
-                              <w:pStyle w:val="BodyText"/>
-                              <w:spacing w:before="13"/>
-                              <w:rPr>
-                                <w:b/>
-                              </w:rPr>
-                            </w:pPr>
-                          </w:p>
-                          <w:p>
-                            <w:pPr>
-                              <w:ind w:left="173"/>
-                              <w:rPr>
-                                <w:rFonts w:ascii="Calibri"/>
-                                <w:b/>
-                                <w:sz w:val="24"/>
-                              </w:rPr>
-                            </w:pPr>
-                            <w:r>
-                              <w:rPr>
-                                <w:rFonts w:ascii="Calibri"/>
-                                <w:b/>
-                                <w:sz w:val="24"/>
-                              </w:rPr>
-                              <w:t>{profilepicture2x2}</w:t>
-                            </w:r>
-                          </w:p>
-                        </w:txbxContent>
-                      </wps:txbx>
-                      <wps:bodyPr wrap="square" lIns="0" tIns="0" rIns="0" bIns="0" rtlCol="0">
-                        <a:noAutofit/>
-                      </wps:bodyPr>
-                    </wps:wsp>
-                  </a:graphicData>
-                </a:graphic>
-              </wp:anchor>
-            </w:drawing>
-          </mc:Choice>
-          <mc:Fallback>
-            <w:pict>
-              <v:shapetype w14:anchorId="026ABE71" id="_x0000_t202" coordsize="21600,21600" o:spt="202" path="m,l,21600r21600,l21600,xe">
-                <v:stroke joinstyle="miter"/>
-                <v:path gradientshapeok="t" o:connecttype="rect"/>
-              </v:shapetype>
-              <v:shape id="Textbox 32" o:spid="_x0000_s1026" type="#_x0000_t202" style="position:absolute;margin-left:266.15pt;margin-top:15.5pt;width:86.2pt;height:77.4pt;z-index:-251657216;visibility:visible;mso-wrap-style:square;mso-wrap-distance-left:0;mso-wrap-distance-top:0;mso-wrap-distance-right:0;mso-wrap-distance-bottom:0;mso-position-horizontal:absolute;mso-position-horizontal-relative:page;mso-position-vertical:absolute;mso-position-vertical-relative:text;v-text-anchor:top" o:gfxdata="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" filled="f" strokeweight=".72pt">
-                <v:path arrowok="t"/>
-                <v:textbox inset="0,0,0,0">
-                  <w:txbxContent>
-                    <w:p>
-                      <w:pPr>
-                        <w:pStyle w:val="BodyText"/>
-                        <w:spacing w:before="0"/>
-                        <w:rPr>
-                          <w:b/>
-                        </w:rPr>
-                      </w:pPr>
-                    </w:p>
-                    <w:p>
-                      <w:pPr>
-                        <w:pStyle w:val="BodyText"/>
-                        <w:spacing w:before="13"/>
-                        <w:rPr>
-                          <w:b/>
-                        </w:rPr>
-                      </w:pPr>
-                    </w:p>
-                    <w:p>
-                      <w:pPr>
-                        <w:ind w:left="173"/>
-                        <w:rPr>
-                          <w:rFonts w:ascii="Calibri"/>
-                          <w:b/>
-                          <w:sz w:val="24"/>
-                        </w:rPr>
-                      </w:pPr>
-                      <w:r>
-                        <w:rPr>
-                          <w:rFonts w:ascii="Calibri"/>
-                          <w:b/>
-                          <w:sz w:val="24"/>
-                        </w:rPr>
-                        <w:t>{profilepicture2x2}</w:t>
-                      </w:r>
-                    </w:p>
-                  </w:txbxContent>
-                </v:textbox>
-                <w10:wrap type="topAndBottom" anchorx="page"/>
-              </v:shape>
-            </w:pict>
-          </mc:Fallback>
-        </mc:AlternateContent>
-      </w:r>
     </w:p>
     <w:p>
       <w:pPr>
         <w:pStyle w:val="BodyText"/>
-        <w:spacing w:before="0"/>
+        <w:spacing w:before="177"/>
         <w:rPr>
           <w:b/>
           <w:sz w:val="28"/>
@@ -651,21 +534,16 @@
     <w:p>
       <w:pPr>
         <w:pStyle w:val="BodyText"/>
-        <w:spacing w:before="177"/>
-        <w:rPr>
-          <w:b/>
-          <w:sz w:val="28"/>
-        </w:rPr>
-      </w:pPr>
-    </w:p>
-    <w:p>
-      <w:pPr>
-        <w:pStyle w:val="BodyText"/>
         <w:tabs>
           <w:tab w:val="left" w:pos="9698"/>
         </w:tabs>
         <w:spacing w:before="0"/>
         <w:ind w:left="360"/>
+        <w:rPr>
+          <w:rFonts w:asciiTheme="minorHAnsi" w:eastAsiaTheme="minorHAnsi" w:hAnsiTheme="minorHAnsi" w:cstheme="minorBidi"/>
+          <w:sz w:val="22"/>
+          <w:szCs w:val="22"/>
+        </w:rPr>
       </w:pPr>
       <w:r>
         <w:rPr>
@@ -677,26 +555,87 @@
         <w:rPr>
           <w:spacing w:val="-2"/>
         </w:rPr>
-        <w:t xml:space="preserve">             </w:t>
+        <w:t xml:space="preserve"> </w:t>
       </w:r>
       <w:r>
         <w:rPr>
           <w:spacing w:val="-2"/>
-        </w:rPr>
-        <w:t xml:space="preserve">      </w:t>
-      </w:r>
+          <w:u w:val="single"/>
+        </w:rPr>
+        <w:t>{</w:t>
+      </w:r>
+      <w:proofErr w:type="spellStart"/>
       <w:r>
         <w:rPr>
           <w:spacing w:val="-2"/>
-        </w:rPr>
-        <w:t xml:space="preserve">    {lastName}                                {firstName}                          {middleInitial}</w:t>
-      </w:r>
-      <w:r>
-        <w:rPr>
-          <w:u w:val="single"/>
-        </w:rPr>
-        <w:tab/>
-      </w:r>
+          <w:u w:val="single"/>
+        </w:rPr>
+        <w:t>lastName</w:t>
+      </w:r>
+      <w:proofErr w:type="spellEnd"/>
+      <w:r>
+        <w:rPr>
+          <w:spacing w:val="-2"/>
+          <w:u w:val="single"/>
+        </w:rPr>
+        <w:t>}</w:t>
+      </w:r>
+      <w:r>
+        <w:rPr>
+          <w:spacing w:val="-2"/>
+          <w:u w:val="single"/>
+        </w:rPr>
+        <w:t>,</w:t>
+      </w:r>
+      <w:r>
+        <w:rPr>
+          <w:spacing w:val="-2"/>
+          <w:u w:val="single"/>
+        </w:rPr>
+        <w:t xml:space="preserve"> {</w:t>
+      </w:r>
+      <w:proofErr w:type="spellStart"/>
+      <w:r>
+        <w:rPr>
+          <w:spacing w:val="-2"/>
+          <w:u w:val="single"/>
+        </w:rPr>
+        <w:t>firstName</w:t>
+      </w:r>
+      <w:proofErr w:type="spellEnd"/>
+      <w:r>
+        <w:rPr>
+          <w:spacing w:val="-2"/>
+          <w:u w:val="single"/>
+        </w:rPr>
+        <w:t>}  {</w:t>
+      </w:r>
+      <w:proofErr w:type="spellStart"/>
+      <w:r>
+        <w:rPr>
+          <w:spacing w:val="-2"/>
+          <w:u w:val="single"/>
+        </w:rPr>
+        <w:t>middleInitial</w:t>
+      </w:r>
+      <w:proofErr w:type="spellEnd"/>
+      <w:r>
+        <w:rPr>
+          <w:spacing w:val="-2"/>
+          <w:u w:val="single"/>
+        </w:rPr>
+        <w:t>}</w:t>
+      </w:r>
+    </w:p>
+    <w:p>
+      <w:pPr>
+        <w:pStyle w:val="BodyText"/>
+        <w:tabs>
+          <w:tab w:val="left" w:pos="9698"/>
+        </w:tabs>
+        <w:spacing w:before="0"/>
+        <w:ind w:left="360"/>
+      </w:pPr>
     </w:p>
     <w:p>
       <w:pPr>
@@ -709,25 +648,17 @@
           <w:tab w:val="left" w:pos="9747"/>
         </w:tabs>
         <w:spacing w:before="21" w:line="480" w:lineRule="auto"/>
-        <w:ind w:left="360" w:right="307" w:firstLine="1619"/>
-        <w:rPr>
-          <w:sz w:val="24"/>
-          <w:u w:val="single"/>
-        </w:rPr>
-      </w:pPr>
-      <w:r>
-        <w:t>(Last Name)</w:t>
-      </w:r>
-      <w:r>
-        <w:tab/>
-        <w:t>(First Name)</w:t>
-      </w:r>
-      <w:r>
-        <w:tab/>
-      </w:r>
-      <w:r>
-        <w:tab/>
-        <w:t xml:space="preserve">(Middle Name) </w:t>
+        <w:ind w:right="307"/>
+        <w:rPr>
+          <w:sz w:val="24"/>
+          <w:u w:val="single"/>
+        </w:rPr>
+      </w:pPr>
+      <w:r>
+        <w:rPr>
+          <w:sz w:val="24"/>
+        </w:rPr>
+        <w:t xml:space="preserve">      </w:t>
       </w:r>
       <w:r>
         <w:rPr>
@@ -747,7 +678,7 @@
           <w:sz w:val="24"/>
           <w:u w:val="single"/>
         </w:rPr>
-        <w:t xml:space="preserve">                    </w:t>
+        <w:t xml:space="preserve">  </w:t>
       </w:r>
       <w:r>
         <w:rPr>
@@ -761,7 +692,7 @@
           <w:sz w:val="24"/>
           <w:u w:val="single"/>
         </w:rPr>
-        <w:t xml:space="preserve">                </w:t>
+        <w:t xml:space="preserve">  </w:t>
       </w:r>
       <w:r>
         <w:rPr>
@@ -800,7 +731,7 @@
         <w:rPr>
           <w:sz w:val="24"/>
         </w:rPr>
-        <w:t xml:space="preserve"> Address: </w:t>
+        <w:t xml:space="preserve">Address: </w:t>
       </w:r>
       <w:r>
         <w:rPr>
@@ -851,7 +782,30 @@
           <w:sz w:val="24"/>
           <w:u w:val="single"/>
         </w:rPr>
-        <w:t xml:space="preserve">{dateOfBirth}                                 </w:t>
+        <w:t>{</w:t>
+      </w:r>
+      <w:proofErr w:type="spellStart"/>
+      <w:r>
+        <w:rPr>
+          <w:sz w:val="24"/>
+          <w:u w:val="single"/>
+        </w:rPr>
+        <w:t>dateOfBirth</w:t>
+      </w:r>
+      <w:proofErr w:type="spellEnd"/>
+      <w:r>
+        <w:rPr>
+          <w:sz w:val="24"/>
+          <w:u w:val="single"/>
+        </w:rPr>
+        <w:t xml:space="preserve">}                                </w:t>
+      </w:r>
+      <w:r>
+        <w:rPr>
+          <w:sz w:val="24"/>
+          <w:u w:val="single"/>
+        </w:rPr>
+        <w:t xml:space="preserve">  </w:t>
       </w:r>
       <w:r>
         <w:rPr>
@@ -908,7 +862,23 @@
           <w:sz w:val="24"/>
           <w:u w:val="single"/>
         </w:rPr>
-        <w:t xml:space="preserve">{civilStatus}                                        </w:t>
+        <w:t>{</w:t>
+      </w:r>
+      <w:proofErr w:type="spellStart"/>
+      <w:r>
+        <w:rPr>
+          <w:sz w:val="24"/>
+          <w:u w:val="single"/>
+        </w:rPr>
+        <w:t>civilStatus</w:t>
+      </w:r>
+      <w:proofErr w:type="spellEnd"/>
+      <w:r>
+        <w:rPr>
+          <w:sz w:val="24"/>
+          <w:u w:val="single"/>
+        </w:rPr>
+        <w:t xml:space="preserve">}                                        </w:t>
       </w:r>
       <w:r>
         <w:rPr>
@@ -929,53 +899,7 @@
           <w:sz w:val="24"/>
           <w:u w:val="single"/>
         </w:rPr>
-        <w:t>‎ ‎ ‎ ‎ ‎ ‎ ‎ ‎ ‎ ‎ ‎ ‎ ‎ ‎ ‎ ‎ ‎ ‎ ‎ ‎ ‎ ‎ ‎ ‎ ‎ ‎ ‎ ‎ ‎ ‎ ‎ ‎ ‎ ‎ ‎ ‎ ‎ ‎ ‎ ‎ ‎ ‎ ‎ ‎ ‎ ‎ ‎</w:t>
-      </w:r>
-      <w:r>
-        <w:rPr>
-          <w:sz w:val="24"/>
-        </w:rPr>
-        <w:t xml:space="preserve">Father’s Name: </w:t>
-      </w:r>
-      <w:r>
-        <w:rPr>
-          <w:rFonts w:ascii="Times New Roman" w:hAnsi="Times New Roman"/>
-          <w:sz w:val="24"/>
-          <w:u w:val="single"/>
-        </w:rPr>
-        <w:tab/>
-      </w:r>
-      <w:r>
-        <w:rPr>
-          <w:rFonts w:ascii="Times New Roman" w:hAnsi="Times New Roman"/>
-          <w:sz w:val="24"/>
-          <w:u w:val="single"/>
-        </w:rPr>
-        <w:tab/>
-      </w:r>
-      <w:r>
-        <w:rPr>
-          <w:rFonts w:ascii="Times New Roman" w:hAnsi="Times New Roman"/>
-          <w:sz w:val="24"/>
-          <w:u w:val="single"/>
-        </w:rPr>
-        <w:tab/>
-      </w:r>
-      <w:r>
-        <w:rPr>
-          <w:rFonts w:ascii="Times New Roman" w:hAnsi="Times New Roman"/>
-          <w:sz w:val="24"/>
-          <w:u w:val="single"/>
-        </w:rPr>
-        <w:tab/>
-      </w:r>
-      <w:r>
-        <w:rPr>
-          <w:rFonts w:ascii="Times New Roman" w:hAnsi="Times New Roman"/>
-          <w:sz w:val="24"/>
-          <w:u w:val="single"/>
-        </w:rPr>
-        <w:t>‎‎‎‎‎‎‎‎‎‎‎‎‎‎‎‎‎‎‎‎‎‎‎‎‎‎</w:t>
+        <w:t xml:space="preserve">‎ ‎ ‎ ‎ ‎ ‎ ‎ ‎ ‎ ‎ ‎ ‎ </w:t>
       </w:r>
     </w:p>
     <w:p>
@@ -998,8 +922,15 @@
       <w:r>
         <w:rPr>
           <w:sz w:val="24"/>
-        </w:rPr>
-        <w:t xml:space="preserve">Mother’s Name: </w:t>
+          <w:u w:val="single"/>
+        </w:rPr>
+        <w:t>‎</w:t>
+      </w:r>
+      <w:r>
+        <w:rPr>
+          <w:sz w:val="24"/>
+        </w:rPr>
+        <w:t xml:space="preserve">Father’s Name: </w:t>
       </w:r>
       <w:r>
         <w:rPr>
@@ -1032,6 +963,14 @@
           <w:u w:val="single"/>
         </w:rPr>
         <w:tab/>
+      </w:r>
+      <w:r>
+        <w:rPr>
+          <w:rFonts w:ascii="Times New Roman" w:hAnsi="Times New Roman"/>
+          <w:sz w:val="24"/>
+          <w:u w:val="single"/>
+        </w:rPr>
+        <w:t>‎‎‎‎‎‎‎‎‎‎‎‎‎‎‎‎‎‎‎‎‎‎‎‎‎‎</w:t>
       </w:r>
     </w:p>
     <w:p>
@@ -1052,6 +991,62 @@
         </w:rPr>
       </w:pPr>
       <w:r>
+        <w:rPr>
+          <w:sz w:val="24"/>
+        </w:rPr>
+        <w:t xml:space="preserve">Mother’s Name: </w:t>
+      </w:r>
+      <w:r>
+        <w:rPr>
+          <w:rFonts w:ascii="Times New Roman" w:hAnsi="Times New Roman"/>
+          <w:sz w:val="24"/>
+          <w:u w:val="single"/>
+        </w:rPr>
+        <w:tab/>
+      </w:r>
+      <w:r>
+        <w:rPr>
+          <w:rFonts w:ascii="Times New Roman" w:hAnsi="Times New Roman"/>
+          <w:sz w:val="24"/>
+          <w:u w:val="single"/>
+        </w:rPr>
+        <w:tab/>
+      </w:r>
+      <w:r>
+        <w:rPr>
+          <w:rFonts w:ascii="Times New Roman" w:hAnsi="Times New Roman"/>
+          <w:sz w:val="24"/>
+          <w:u w:val="single"/>
+        </w:rPr>
+        <w:tab/>
+      </w:r>
+      <w:r>
+        <w:rPr>
+          <w:rFonts w:ascii="Times New Roman" w:hAnsi="Times New Roman"/>
+          <w:sz w:val="24"/>
+          <w:u w:val="single"/>
+        </w:rPr>
+        <w:tab/>
+      </w:r>
+    </w:p>
+    <w:p>
+      <w:pPr>
+        <w:tabs>
+          <w:tab w:val="left" w:pos="4594"/>
+          <w:tab w:val="left" w:pos="4839"/>
+          <w:tab w:val="left" w:pos="6968"/>
+          <w:tab w:val="left" w:pos="7184"/>
+          <w:tab w:val="left" w:pos="9711"/>
+          <w:tab w:val="left" w:pos="9747"/>
+        </w:tabs>
+        <w:spacing w:before="21" w:line="480" w:lineRule="auto"/>
+        <w:ind w:left="360" w:right="307"/>
+        <w:rPr>
+          <w:sz w:val="24"/>
+          <w:u w:val="single"/>
+        </w:rPr>
+      </w:pPr>
+      <w:r>
         <w:t xml:space="preserve">Contact Number/s: </w:t>
       </w:r>
       <w:r>
@@ -1152,6 +1147,7 @@
           <w:b/>
           <w:bCs/>
         </w:rPr>
+        <w:lastRenderedPageBreak/>
         <w:t>BRIEF BACKGROUND OF THE HOST TRAINING ESTABLISHMENT</w:t>
       </w:r>
     </w:p>
@@ -1206,7 +1202,21 @@
         <w:rPr>
           <w:rFonts w:ascii="Times New Roman" w:hAnsi="Times New Roman" w:cs="Times New Roman"/>
         </w:rPr>
-        <w:t>{companyAddress}</w:t>
+        <w:t>{</w:t>
+      </w:r>
+      <w:proofErr w:type="spellStart"/>
+      <w:r>
+        <w:rPr>
+          <w:rFonts w:ascii="Times New Roman" w:hAnsi="Times New Roman" w:cs="Times New Roman"/>
+        </w:rPr>
+        <w:t>companyAddress</w:t>
+      </w:r>
+      <w:proofErr w:type="spellEnd"/>
+      <w:r>
+        <w:rPr>
+          <w:rFonts w:ascii="Times New Roman" w:hAnsi="Times New Roman" w:cs="Times New Roman"/>
+        </w:rPr>
+        <w:t>}</w:t>
       </w:r>
     </w:p>
     <w:p>
@@ -1268,7 +1278,21 @@
         <w:rPr>
           <w:rFonts w:ascii="Times New Roman" w:hAnsi="Times New Roman" w:cs="Times New Roman"/>
         </w:rPr>
-        <w:t xml:space="preserve"> {supervisorContact}</w:t>
+        <w:t xml:space="preserve"> {</w:t>
+      </w:r>
+      <w:proofErr w:type="spellStart"/>
+      <w:r>
+        <w:rPr>
+          <w:rFonts w:ascii="Times New Roman" w:hAnsi="Times New Roman" w:cs="Times New Roman"/>
+        </w:rPr>
+        <w:t>supervisorContact</w:t>
+      </w:r>
+      <w:proofErr w:type="spellEnd"/>
+      <w:r>
+        <w:rPr>
+          <w:rFonts w:ascii="Times New Roman" w:hAnsi="Times New Roman" w:cs="Times New Roman"/>
+        </w:rPr>
+        <w:t>}</w:t>
       </w:r>
     </w:p>
     <w:p>
@@ -1328,61 +1352,62 @@
         <w:rPr>
           <w:color w:val="auto"/>
           <w:spacing w:val="-2"/>
-        </w:rPr>
-      </w:pPr>
+          <w:sz w:val="24"/>
+          <w:szCs w:val="24"/>
+        </w:rPr>
+      </w:pPr>
+      <w:r>
+        <w:rPr>
+          <w:color w:val="auto"/>
+          <w:spacing w:val="-2"/>
+          <w:sz w:val="24"/>
+          <w:szCs w:val="24"/>
+        </w:rPr>
+        <w:lastRenderedPageBreak/>
+        <w:t>{#months}</w:t>
+      </w:r>
     </w:p>
     <w:p>
       <w:pPr>
         <w:pStyle w:val="Heading1"/>
         <w:ind w:right="746"/>
         <w:rPr>
+          <w:b/>
+          <w:bCs/>
+          <w:color w:val="auto"/>
+        </w:rPr>
+      </w:pPr>
+      <w:r>
+        <w:rPr>
+          <w:b/>
+          <w:bCs/>
           <w:color w:val="auto"/>
           <w:spacing w:val="-2"/>
-          <w:sz w:val="24"/>
-          <w:szCs w:val="24"/>
-        </w:rPr>
-      </w:pPr>
-      <w:r>
-        <w:rPr>
+        </w:rPr>
+        <w:t>DAILY</w:t>
+      </w:r>
+      <w:r>
+        <w:rPr>
+          <w:b/>
+          <w:bCs/>
+          <w:color w:val="auto"/>
+          <w:spacing w:val="-26"/>
+        </w:rPr>
+        <w:t xml:space="preserve"> </w:t>
+      </w:r>
+      <w:r>
+        <w:rPr>
+          <w:b/>
+          <w:bCs/>
           <w:color w:val="auto"/>
           <w:spacing w:val="-2"/>
-          <w:sz w:val="24"/>
-          <w:szCs w:val="24"/>
-        </w:rPr>
-        <w:t>{#months}</w:t>
-      </w:r>
-    </w:p>
-    <w:p>
-      <w:pPr>
-        <w:pStyle w:val="Heading1"/>
-        <w:ind w:right="746"/>
-        <w:rPr>
-          <w:color w:val="auto"/>
-        </w:rPr>
-      </w:pPr>
-      <w:r>
-        <w:rPr>
-          <w:color w:val="auto"/>
-          <w:spacing w:val="-2"/>
-        </w:rPr>
-        <w:t>DAILY</w:t>
-      </w:r>
-      <w:r>
-        <w:rPr>
-          <w:color w:val="auto"/>
-          <w:spacing w:val="-26"/>
-        </w:rPr>
-        <w:t xml:space="preserve"> </w:t>
-      </w:r>
-      <w:r>
-        <w:rPr>
-          <w:color w:val="auto"/>
-          <w:spacing w:val="-2"/>
         </w:rPr>
         <w:t>WORK</w:t>
       </w:r>
       <w:r>
         <w:rPr>
+          <w:b/>
+          <w:bCs/>
           <w:color w:val="auto"/>
           <w:spacing w:val="-25"/>
         </w:rPr>
@@ -1390,6 +1415,8 @@
       </w:r>
       <w:r>
         <w:rPr>
+          <w:b/>
+          <w:bCs/>
           <w:color w:val="auto"/>
           <w:spacing w:val="-2"/>
         </w:rPr>
@@ -1905,7 +1932,23 @@
           <w:sz w:val="28"/>
           <w:u w:val="single"/>
         </w:rPr>
-        <w:t>{totalHours}</w:t>
+        <w:t>{</w:t>
+      </w:r>
+      <w:proofErr w:type="spellStart"/>
+      <w:r>
+        <w:rPr>
+          <w:sz w:val="28"/>
+          <w:u w:val="single"/>
+        </w:rPr>
+        <w:t>totalHours</w:t>
+      </w:r>
+      <w:proofErr w:type="spellEnd"/>
+      <w:r>
+        <w:rPr>
+          <w:sz w:val="28"/>
+          <w:u w:val="single"/>
+        </w:rPr>
+        <w:t>}</w:t>
       </w:r>
       <w:r>
         <w:rPr>
@@ -1959,7 +2002,23 @@
           <w:sz w:val="28"/>
           <w:u w:val="single"/>
         </w:rPr>
-        <w:t xml:space="preserve">            {studentname}</w:t>
+        <w:t xml:space="preserve">            {</w:t>
+      </w:r>
+      <w:proofErr w:type="spellStart"/>
+      <w:r>
+        <w:rPr>
+          <w:sz w:val="28"/>
+          <w:u w:val="single"/>
+        </w:rPr>
+        <w:t>studentname</w:t>
+      </w:r>
+      <w:proofErr w:type="spellEnd"/>
+      <w:r>
+        <w:rPr>
+          <w:sz w:val="28"/>
+          <w:u w:val="single"/>
+        </w:rPr>
+        <w:t>}</w:t>
       </w:r>
       <w:r>
         <w:rPr>
@@ -2141,18 +2200,37 @@
     </w:p>
     <w:p>
       <w:pPr>
-        <w:tabs>
-          <w:tab w:val="left" w:pos="7066"/>
-        </w:tabs>
-        <w:rPr>
-          <w:sz w:val="28"/>
-        </w:rPr>
-      </w:pPr>
+        <w:pStyle w:val="BodyText"/>
+        <w:tabs>
+          <w:tab w:val="left" w:pos="4982"/>
+          <w:tab w:val="left" w:pos="5633"/>
+        </w:tabs>
+        <w:spacing w:before="37" w:line="247" w:lineRule="auto"/>
+        <w:ind w:left="720" w:right="659" w:hanging="516"/>
+      </w:pPr>
+      <w:r>
+        <w:rPr>
+          <w:spacing w:val="-2"/>
+        </w:rPr>
+        <w:t>{</w:t>
+      </w:r>
+      <w:r>
+        <w:rPr>
+          <w:spacing w:val="-2"/>
+        </w:rPr>
+        <w:t>/</w:t>
+      </w:r>
+      <w:r>
+        <w:rPr>
+          <w:spacing w:val="-2"/>
+        </w:rPr>
+        <w:t>months}</w:t>
+      </w:r>
     </w:p>
     <w:p>
       <w:pPr>
         <w:pStyle w:val="Heading1"/>
-        <w:ind w:right="746"/>
+        <w:ind w:left="2880" w:right="746" w:firstLine="720"/>
         <w:rPr>
           <w:color w:val="auto"/>
           <w:spacing w:val="-2"/>
@@ -2162,57 +2240,56 @@
       </w:pPr>
       <w:r>
         <w:rPr>
+          <w:rFonts w:asciiTheme="minorHAnsi" w:hAnsiTheme="minorHAnsi" w:cstheme="minorHAnsi"/>
+          <w:b/>
+          <w:bCs/>
           <w:color w:val="auto"/>
-          <w:spacing w:val="-2"/>
+        </w:rPr>
+        <w:t>PHOTOS</w:t>
+      </w:r>
+    </w:p>
+    <w:p>
+      <w:pPr>
+        <w:rPr>
+          <w:rFonts w:cstheme="minorHAnsi"/>
           <w:sz w:val="24"/>
           <w:szCs w:val="24"/>
         </w:rPr>
-        <w:t>{</w:t>
-      </w:r>
-      <w:r>
-        <w:rPr>
-          <w:color w:val="auto"/>
-          <w:spacing w:val="-2"/>
+      </w:pPr>
+      <w:r>
+        <w:rPr>
+          <w:rFonts w:cstheme="minorHAnsi"/>
           <w:sz w:val="24"/>
           <w:szCs w:val="24"/>
         </w:rPr>
-        <w:t>/</w:t>
-      </w:r>
-      <w:r>
-        <w:rPr>
-          <w:color w:val="auto"/>
-          <w:spacing w:val="-2"/>
+        <w:t>{%</w:t>
+      </w:r>
+      <w:proofErr w:type="spellStart"/>
+      <w:r>
+        <w:rPr>
+          <w:rFonts w:cstheme="minorHAnsi"/>
           <w:sz w:val="24"/>
           <w:szCs w:val="24"/>
         </w:rPr>
-        <w:t>months}</w:t>
-      </w:r>
-    </w:p>
-    <w:p>
-      <w:pPr>
+        <w:t>journalEntriesImages</w:t>
+      </w:r>
+      <w:proofErr w:type="spellEnd"/>
+      <w:r>
+        <w:rPr>
+          <w:rFonts w:cstheme="minorHAnsi"/>
+          <w:sz w:val="24"/>
+          <w:szCs w:val="24"/>
+        </w:rPr>
+        <w:t>}</w:t>
+      </w:r>
+    </w:p>
+    <w:p>
+      <w:pPr>
+        <w:jc w:val="center"/>
         <w:rPr>
           <w:rFonts w:ascii="Times New Roman" w:hAnsi="Times New Roman" w:cs="Times New Roman"/>
-        </w:rPr>
-      </w:pPr>
-    </w:p>
-    <w:p>
-      <w:pPr>
-        <w:rPr>
-          <w:rFonts w:ascii="Times New Roman" w:hAnsi="Times New Roman" w:cs="Times New Roman"/>
-        </w:rPr>
-      </w:pPr>
-    </w:p>
-    <w:p>
-      <w:pPr>
-        <w:rPr>
-          <w:rFonts w:ascii="Times New Roman" w:hAnsi="Times New Roman" w:cs="Times New Roman"/>
-        </w:rPr>
-      </w:pPr>
-    </w:p>
-    <w:p>
-      <w:pPr>
-        <w:rPr>
-          <w:rFonts w:ascii="Times New Roman" w:hAnsi="Times New Roman" w:cs="Times New Roman"/>
+          <w:sz w:val="14"/>
+          <w:szCs w:val="14"/>
         </w:rPr>
       </w:pPr>
     </w:p>

</xml_diff>

<commit_message>
Replace Emergency Contact with Religion field, rename Generate Journal button, add profile completeness note
</commit_message>
<xml_diff>
--- a/public/JournalTemplate.docx
+++ b/public/JournalTemplate.docx
@@ -532,34 +532,14 @@
       </w:pPr>
     </w:p>
     <w:p>
-      <w:pPr>
-        <w:pStyle w:val="BodyText"/>
-        <w:tabs>
-          <w:tab w:val="left" w:pos="9698"/>
-        </w:tabs>
-        <w:spacing w:before="0"/>
-        <w:ind w:left="360"/>
-        <w:rPr>
-          <w:rFonts w:asciiTheme="minorHAnsi" w:eastAsiaTheme="minorHAnsi" w:hAnsiTheme="minorHAnsi" w:cstheme="minorBidi"/>
-          <w:sz w:val="22"/>
-          <w:szCs w:val="22"/>
-        </w:rPr>
-      </w:pPr>
-      <w:r>
-        <w:rPr>
-          <w:spacing w:val="-2"/>
-        </w:rPr>
+      <w:r>
         <w:t>Name:</w:t>
       </w:r>
       <w:r>
-        <w:rPr>
-          <w:spacing w:val="-2"/>
-        </w:rPr>
         <w:t xml:space="preserve"> </w:t>
       </w:r>
       <w:r>
         <w:rPr>
-          <w:spacing w:val="-2"/>
           <w:u w:val="single"/>
         </w:rPr>
         <w:t>{</w:t>
@@ -567,7 +547,6 @@
       <w:proofErr w:type="spellStart"/>
       <w:r>
         <w:rPr>
-          <w:spacing w:val="-2"/>
           <w:u w:val="single"/>
         </w:rPr>
         <w:t>lastName</w:t>
@@ -575,21 +554,18 @@
       <w:proofErr w:type="spellEnd"/>
       <w:r>
         <w:rPr>
-          <w:spacing w:val="-2"/>
           <w:u w:val="single"/>
         </w:rPr>
         <w:t>}</w:t>
       </w:r>
       <w:r>
         <w:rPr>
-          <w:spacing w:val="-2"/>
           <w:u w:val="single"/>
         </w:rPr>
         <w:t>,</w:t>
       </w:r>
       <w:r>
         <w:rPr>
-          <w:spacing w:val="-2"/>
           <w:u w:val="single"/>
         </w:rPr>
         <w:t xml:space="preserve"> {</w:t>
@@ -597,7 +573,6 @@
       <w:proofErr w:type="spellStart"/>
       <w:r>
         <w:rPr>
-          <w:spacing w:val="-2"/>
           <w:u w:val="single"/>
         </w:rPr>
         <w:t>firstName</w:t>
@@ -605,15 +580,13 @@
       <w:proofErr w:type="spellEnd"/>
       <w:r>
         <w:rPr>
-          <w:spacing w:val="-2"/>
-          <w:u w:val="single"/>
-        </w:rPr>
-        <w:t>}  {</w:t>
+          <w:u w:val="single"/>
+        </w:rPr>
+        <w:t>} {</w:t>
       </w:r>
       <w:proofErr w:type="spellStart"/>
       <w:r>
         <w:rPr>
-          <w:spacing w:val="-2"/>
           <w:u w:val="single"/>
         </w:rPr>
         <w:t>middleInitial</w:t>
@@ -621,245 +594,189 @@
       <w:proofErr w:type="spellEnd"/>
       <w:r>
         <w:rPr>
-          <w:spacing w:val="-2"/>
           <w:u w:val="single"/>
         </w:rPr>
         <w:t>}</w:t>
       </w:r>
     </w:p>
     <w:p>
-      <w:pPr>
-        <w:pStyle w:val="BodyText"/>
-        <w:tabs>
-          <w:tab w:val="left" w:pos="9698"/>
-        </w:tabs>
-        <w:spacing w:before="0"/>
-        <w:ind w:left="360"/>
-      </w:pPr>
-    </w:p>
-    <w:p>
-      <w:pPr>
-        <w:tabs>
-          <w:tab w:val="left" w:pos="4594"/>
-          <w:tab w:val="left" w:pos="4839"/>
-          <w:tab w:val="left" w:pos="6968"/>
-          <w:tab w:val="left" w:pos="7184"/>
-          <w:tab w:val="left" w:pos="9711"/>
-          <w:tab w:val="left" w:pos="9747"/>
-        </w:tabs>
-        <w:spacing w:before="21" w:line="480" w:lineRule="auto"/>
-        <w:ind w:right="307"/>
-        <w:rPr>
-          <w:sz w:val="24"/>
-          <w:u w:val="single"/>
-        </w:rPr>
-      </w:pPr>
-      <w:r>
-        <w:rPr>
-          <w:sz w:val="24"/>
-        </w:rPr>
-        <w:t xml:space="preserve">      </w:t>
-      </w:r>
-      <w:r>
-        <w:rPr>
-          <w:sz w:val="24"/>
-        </w:rPr>
-        <w:t xml:space="preserve">Course/Year/Section: </w:t>
-      </w:r>
-      <w:r>
-        <w:rPr>
-          <w:sz w:val="24"/>
+      <w:r>
+        <w:t>Program, Major, Yr &amp; Sec</w:t>
+      </w:r>
+      <w:r>
+        <w:t xml:space="preserve">: </w:t>
+      </w:r>
+      <w:r>
+        <w:rPr>
           <w:u w:val="single"/>
         </w:rPr>
         <w:t>{course}</w:t>
       </w:r>
       <w:r>
         <w:rPr>
-          <w:sz w:val="24"/>
-          <w:u w:val="single"/>
-        </w:rPr>
+          <w:u w:val="single"/>
+        </w:rPr>
+        <w:t xml:space="preserve"> </w:t>
+      </w:r>
+      <w:r>
+        <w:rPr>
+          <w:u w:val="single"/>
+        </w:rPr>
+        <w:t>{year}</w:t>
+      </w:r>
+      <w:r>
+        <w:rPr>
+          <w:u w:val="single"/>
+        </w:rPr>
+        <w:t xml:space="preserve"> </w:t>
+      </w:r>
+      <w:r>
+        <w:rPr>
+          <w:u w:val="single"/>
+        </w:rPr>
+        <w:t>{section}</w:t>
+      </w:r>
+    </w:p>
+    <w:p>
+      <w:r>
+        <w:rPr>
+          <w:spacing w:val="-53"/>
+        </w:rPr>
+        <w:t xml:space="preserve"> </w:t>
+      </w:r>
+      <w:r>
+        <w:t xml:space="preserve">Address: </w:t>
+      </w:r>
+      <w:r>
+        <w:rPr>
+          <w:u w:val="single"/>
+        </w:rPr>
+        <w:t>{address}</w:t>
+      </w:r>
+      <w:r>
+        <w:rPr>
+          <w:u w:val="single"/>
+        </w:rPr>
+        <w:t>‎ ‎ ‎</w:t>
+      </w:r>
+      <w:r>
+        <w:t xml:space="preserve"> ‎ ‎ ‎ ‎ ‎ ‎ ‎ ‎ ‎ ‎ ‎ ‎ ‎ ‎ ‎ ‎ ‎ ‎ ‎ ‎ ‎ ‎ ‎ ‎ ‎ ‎ ‎ ‎ ‎ ‎ ‎ ‎ ‎ ‎ ‎ ‎ ‎ ‎ ‎ ‎ ‎ ‎ ‎ ‎ ‎ ‎        </w:t>
+      </w:r>
+    </w:p>
+    <w:p>
+      <w:r>
+        <w:t xml:space="preserve">Date of Birth: </w:t>
+      </w:r>
+      <w:r>
+        <w:rPr>
+          <w:u w:val="single"/>
+        </w:rPr>
+        <w:t>{</w:t>
+      </w:r>
+      <w:proofErr w:type="spellStart"/>
+      <w:proofErr w:type="gramStart"/>
+      <w:r>
+        <w:rPr>
+          <w:u w:val="single"/>
+        </w:rPr>
+        <w:t>dateOfBirth</w:t>
+      </w:r>
+      <w:proofErr w:type="spellEnd"/>
+      <w:r>
+        <w:rPr>
+          <w:u w:val="single"/>
+        </w:rPr>
+        <w:t>}</w:t>
+      </w:r>
+      <w:r>
+        <w:t xml:space="preserve">   </w:t>
+      </w:r>
+      <w:proofErr w:type="gramEnd"/>
+      <w:r>
+        <w:t xml:space="preserve">                             </w:t>
+      </w:r>
+      <w:r>
         <w:t xml:space="preserve">  </w:t>
       </w:r>
       <w:r>
-        <w:rPr>
-          <w:sz w:val="24"/>
-          <w:u w:val="single"/>
-        </w:rPr>
-        <w:t>{year}</w:t>
-      </w:r>
-      <w:r>
-        <w:rPr>
-          <w:sz w:val="24"/>
-          <w:u w:val="single"/>
-        </w:rPr>
-        <w:t xml:space="preserve">  </w:t>
-      </w:r>
-      <w:r>
-        <w:rPr>
-          <w:sz w:val="24"/>
-          <w:u w:val="single"/>
-        </w:rPr>
-        <w:t>{section}</w:t>
-      </w:r>
-    </w:p>
-    <w:p>
-      <w:pPr>
-        <w:tabs>
-          <w:tab w:val="left" w:pos="4594"/>
-          <w:tab w:val="left" w:pos="4839"/>
-          <w:tab w:val="left" w:pos="6968"/>
-          <w:tab w:val="left" w:pos="7184"/>
-          <w:tab w:val="left" w:pos="9711"/>
-          <w:tab w:val="left" w:pos="9747"/>
-        </w:tabs>
-        <w:spacing w:before="21" w:line="480" w:lineRule="auto"/>
-        <w:ind w:left="360" w:right="307"/>
-        <w:rPr>
-          <w:sz w:val="24"/>
-          <w:u w:val="single"/>
-        </w:rPr>
-      </w:pPr>
-      <w:r>
-        <w:rPr>
-          <w:spacing w:val="-53"/>
-          <w:sz w:val="24"/>
-          <w:u w:val="single"/>
-        </w:rPr>
+        <w:t xml:space="preserve">Age: </w:t>
+      </w:r>
+      <w:r>
+        <w:rPr>
+          <w:u w:val="single"/>
+        </w:rPr>
+        <w:t>{age}</w:t>
+      </w:r>
+      <w:r>
+        <w:rPr>
+          <w:u w:val="single"/>
+        </w:rPr>
+        <w:t>‎ ‎</w:t>
+      </w:r>
+      <w:r>
+        <w:t xml:space="preserve"> ‎ ‎ ‎ ‎ ‎ ‎ ‎ ‎ ‎ ‎ ‎ ‎ ‎ ‎ ‎ ‎ ‎ ‎ ‎ ‎ ‎ ‎ ‎ ‎ ‎ ‎ ‎ ‎ ‎ ‎ ‎ ‎ ‎ ‎‎ ‎ ‎ ‎ ‎ ‎ ‎ ‎ ‎ ‎ ‎ ‎ ‎ ‎ ‎ ‎ ‎ ‎ ‎ ‎ ‎ ‎ ‎ ‎ ‎ ‎</w:t>
+      </w:r>
+      <w:r>
         <w:t xml:space="preserve"> </w:t>
       </w:r>
-      <w:r>
-        <w:rPr>
-          <w:sz w:val="24"/>
-        </w:rPr>
-        <w:t xml:space="preserve">Address: </w:t>
-      </w:r>
-      <w:r>
-        <w:rPr>
-          <w:sz w:val="24"/>
-          <w:u w:val="single"/>
-        </w:rPr>
-        <w:t>{address}</w:t>
-      </w:r>
-      <w:r>
-        <w:rPr>
-          <w:sz w:val="24"/>
-          <w:u w:val="single"/>
-        </w:rPr>
-        <w:t xml:space="preserve">‎ ‎ ‎ ‎ ‎ ‎ ‎ ‎ ‎ ‎ ‎ ‎ ‎ ‎ ‎ ‎ ‎ ‎ ‎ ‎ ‎ ‎ ‎ ‎ ‎ ‎ ‎ ‎ ‎ ‎ ‎ ‎ ‎ ‎ ‎ ‎ ‎ ‎ ‎ ‎ ‎ ‎ ‎ ‎ ‎ ‎ ‎ ‎ ‎ </w:t>
-      </w:r>
-      <w:r>
-        <w:rPr>
-          <w:sz w:val="24"/>
-          <w:u w:val="single"/>
-        </w:rPr>
-        <w:t xml:space="preserve">       </w:t>
-      </w:r>
-    </w:p>
-    <w:p>
-      <w:pPr>
-        <w:tabs>
-          <w:tab w:val="left" w:pos="4594"/>
-          <w:tab w:val="left" w:pos="4839"/>
-          <w:tab w:val="left" w:pos="6968"/>
-          <w:tab w:val="left" w:pos="7184"/>
-          <w:tab w:val="left" w:pos="9711"/>
-          <w:tab w:val="left" w:pos="9747"/>
-        </w:tabs>
-        <w:spacing w:before="21" w:line="480" w:lineRule="auto"/>
-        <w:ind w:left="360" w:right="307"/>
-        <w:rPr>
-          <w:sz w:val="24"/>
-        </w:rPr>
-      </w:pPr>
-      <w:r>
-        <w:rPr>
-          <w:sz w:val="24"/>
-        </w:rPr>
-        <w:t xml:space="preserve">Date of Birth: </w:t>
-      </w:r>
-      <w:r>
-        <w:rPr>
-          <w:sz w:val="24"/>
-          <w:u w:val="single"/>
-        </w:rPr>
+    </w:p>
+    <w:p>
+      <w:r>
+        <w:t xml:space="preserve">Civil Status: </w:t>
+      </w:r>
+      <w:r>
         <w:t>{</w:t>
       </w:r>
       <w:proofErr w:type="spellStart"/>
-      <w:r>
-        <w:rPr>
-          <w:sz w:val="24"/>
-          <w:u w:val="single"/>
-        </w:rPr>
-        <w:t>dateOfBirth</w:t>
+      <w:proofErr w:type="gramStart"/>
+      <w:r>
+        <w:t>civilStatus</w:t>
       </w:r>
       <w:proofErr w:type="spellEnd"/>
       <w:r>
-        <w:rPr>
-          <w:sz w:val="24"/>
-          <w:u w:val="single"/>
-        </w:rPr>
-        <w:t xml:space="preserve">}                                </w:t>
-      </w:r>
-      <w:r>
-        <w:rPr>
-          <w:sz w:val="24"/>
-          <w:u w:val="single"/>
-        </w:rPr>
-        <w:t xml:space="preserve">  </w:t>
-      </w:r>
-      <w:r>
-        <w:rPr>
-          <w:sz w:val="24"/>
-        </w:rPr>
-        <w:t xml:space="preserve">Age: </w:t>
-      </w:r>
-      <w:r>
-        <w:rPr>
-          <w:sz w:val="24"/>
-          <w:u w:val="single"/>
-        </w:rPr>
-        <w:t>{age}</w:t>
-      </w:r>
-      <w:r>
-        <w:rPr>
-          <w:sz w:val="24"/>
-          <w:u w:val="single"/>
-        </w:rPr>
-        <w:t>‎ ‎ ‎ ‎ ‎ ‎ ‎ ‎ ‎ ‎ ‎ ‎ ‎ ‎ ‎ ‎ ‎ ‎ ‎ ‎ ‎ ‎ ‎ ‎ ‎ ‎ ‎ ‎ ‎ ‎ ‎ ‎ ‎ ‎ ‎ ‎‎ ‎ ‎ ‎ ‎ ‎ ‎ ‎ ‎ ‎ ‎ ‎ ‎ ‎ ‎ ‎ ‎ ‎ ‎ ‎ ‎ ‎ ‎ ‎ ‎ ‎</w:t>
-      </w:r>
-      <w:r>
-        <w:rPr>
-          <w:sz w:val="24"/>
-        </w:rPr>
+        <w:t xml:space="preserve">}   </w:t>
+      </w:r>
+      <w:proofErr w:type="gramEnd"/>
+      <w:r>
+        <w:t xml:space="preserve">                                     </w:t>
+      </w:r>
+      <w:r>
+        <w:t>Religion:</w:t>
+      </w:r>
+      <w:r>
+        <w:rPr>
+          <w:u w:val="single"/>
+        </w:rPr>
+        <w:t xml:space="preserve"> {religion}</w:t>
+      </w:r>
+      <w:r>
+        <w:rPr>
+          <w:u w:val="single"/>
+        </w:rPr>
+        <w:t xml:space="preserve">‎ ‎ ‎ </w:t>
+      </w:r>
+      <w:r>
+        <w:t xml:space="preserve">‎ ‎ ‎ ‎ ‎ ‎ ‎ ‎ ‎ </w:t>
+      </w:r>
+    </w:p>
+    <w:p>
+      <w:r>
+        <w:t>‎</w:t>
+      </w:r>
+      <w:r>
         <w:t xml:space="preserve"> </w:t>
       </w:r>
-    </w:p>
-    <w:p>
-      <w:pPr>
-        <w:tabs>
-          <w:tab w:val="left" w:pos="4594"/>
-          <w:tab w:val="left" w:pos="4839"/>
-          <w:tab w:val="left" w:pos="6968"/>
-          <w:tab w:val="left" w:pos="7184"/>
-          <w:tab w:val="left" w:pos="9711"/>
-          <w:tab w:val="left" w:pos="9747"/>
-        </w:tabs>
-        <w:spacing w:before="21" w:line="480" w:lineRule="auto"/>
-        <w:ind w:left="360" w:right="307"/>
-        <w:rPr>
-          <w:sz w:val="24"/>
-          <w:u w:val="single"/>
-        </w:rPr>
-      </w:pPr>
-      <w:r>
-        <w:rPr>
-          <w:sz w:val="24"/>
-        </w:rPr>
-        <w:t xml:space="preserve">Civil Status: </w:t>
-      </w:r>
-      <w:r>
-        <w:rPr>
-          <w:sz w:val="24"/>
+      <w:r>
+        <w:t>Father’s Name:</w:t>
+      </w:r>
+      <w:r>
+        <w:rPr>
+          <w:spacing w:val="40"/>
+        </w:rPr>
+        <w:t xml:space="preserve"> </w:t>
+      </w:r>
+      <w:r>
+        <w:rPr>
           <w:u w:val="single"/>
         </w:rPr>
         <w:t>{</w:t>
@@ -867,224 +784,348 @@
       <w:proofErr w:type="spellStart"/>
       <w:r>
         <w:rPr>
-          <w:sz w:val="24"/>
-          <w:u w:val="single"/>
-        </w:rPr>
-        <w:t>civilStatus</w:t>
+          <w:u w:val="single"/>
+        </w:rPr>
+        <w:t>fatherName</w:t>
       </w:r>
       <w:proofErr w:type="spellEnd"/>
       <w:r>
         <w:rPr>
-          <w:sz w:val="24"/>
-          <w:u w:val="single"/>
-        </w:rPr>
-        <w:t xml:space="preserve">}                                        </w:t>
-      </w:r>
-      <w:r>
-        <w:rPr>
-          <w:spacing w:val="-2"/>
-          <w:sz w:val="24"/>
-        </w:rPr>
-        <w:t>Religion:</w:t>
-      </w:r>
-      <w:r>
-        <w:rPr>
-          <w:sz w:val="24"/>
-          <w:u w:val="single"/>
-        </w:rPr>
-        <w:t xml:space="preserve"> {religion}</w:t>
-      </w:r>
-      <w:r>
-        <w:rPr>
-          <w:sz w:val="24"/>
-          <w:u w:val="single"/>
-        </w:rPr>
-        <w:t xml:space="preserve">‎ ‎ ‎ ‎ ‎ ‎ ‎ ‎ ‎ ‎ ‎ ‎ </w:t>
-      </w:r>
-    </w:p>
-    <w:p>
-      <w:pPr>
-        <w:tabs>
-          <w:tab w:val="left" w:pos="4594"/>
-          <w:tab w:val="left" w:pos="4839"/>
-          <w:tab w:val="left" w:pos="6968"/>
-          <w:tab w:val="left" w:pos="7184"/>
-          <w:tab w:val="left" w:pos="9711"/>
-          <w:tab w:val="left" w:pos="9747"/>
-        </w:tabs>
-        <w:spacing w:before="21" w:line="480" w:lineRule="auto"/>
-        <w:ind w:left="360" w:right="307"/>
-        <w:rPr>
-          <w:sz w:val="24"/>
-          <w:u w:val="single"/>
-        </w:rPr>
-      </w:pPr>
-      <w:r>
-        <w:rPr>
-          <w:sz w:val="24"/>
-          <w:u w:val="single"/>
-        </w:rPr>
-        <w:t>‎</w:t>
-      </w:r>
-      <w:r>
-        <w:rPr>
-          <w:sz w:val="24"/>
-        </w:rPr>
-        <w:t xml:space="preserve">Father’s Name: </w:t>
-      </w:r>
-      <w:r>
-        <w:rPr>
-          <w:rFonts w:ascii="Times New Roman" w:hAnsi="Times New Roman"/>
-          <w:sz w:val="24"/>
-          <w:u w:val="single"/>
-        </w:rPr>
+          <w:u w:val="single"/>
+        </w:rPr>
+        <w:t>}</w:t>
+      </w:r>
+      <w:r>
         <w:tab/>
       </w:r>
       <w:r>
-        <w:rPr>
-          <w:rFonts w:ascii="Times New Roman" w:hAnsi="Times New Roman"/>
-          <w:sz w:val="24"/>
-          <w:u w:val="single"/>
-        </w:rPr>
         <w:tab/>
       </w:r>
       <w:r>
-        <w:rPr>
-          <w:rFonts w:ascii="Times New Roman" w:hAnsi="Times New Roman"/>
-          <w:sz w:val="24"/>
-          <w:u w:val="single"/>
-        </w:rPr>
         <w:tab/>
-      </w:r>
-      <w:r>
-        <w:rPr>
-          <w:rFonts w:ascii="Times New Roman" w:hAnsi="Times New Roman"/>
-          <w:sz w:val="24"/>
-          <w:u w:val="single"/>
-        </w:rPr>
+        <w:t xml:space="preserve"> </w:t>
+      </w:r>
+    </w:p>
+    <w:p>
+      <w:r>
+        <w:t>Occupation:</w:t>
+      </w:r>
+      <w:r>
+        <w:rPr>
+          <w:rFonts w:ascii="Courier New" w:hAnsi="Courier New" w:cs="Courier New"/>
+          <w:color w:val="CCCCCC"/>
+          <w:sz w:val="17"/>
+          <w:szCs w:val="17"/>
+        </w:rPr>
+        <w:t xml:space="preserve"> </w:t>
+      </w:r>
+      <w:r>
+        <w:rPr>
+          <w:rFonts w:ascii="Cambria" w:hAnsi="Cambria"/>
+          <w:spacing w:val="40"/>
+          <w:u w:val="single"/>
+        </w:rPr>
+        <w:t>{</w:t>
+      </w:r>
+      <w:proofErr w:type="spellStart"/>
+      <w:r>
+        <w:rPr>
+          <w:rFonts w:ascii="Cambria" w:hAnsi="Cambria"/>
+          <w:spacing w:val="40"/>
+          <w:u w:val="single"/>
+        </w:rPr>
+        <w:t>fatherOccupation</w:t>
+      </w:r>
+      <w:proofErr w:type="spellEnd"/>
+      <w:r>
+        <w:rPr>
+          <w:rFonts w:ascii="Cambria" w:hAnsi="Cambria"/>
+          <w:spacing w:val="40"/>
+          <w:u w:val="single"/>
+        </w:rPr>
+        <w:t>}</w:t>
+      </w:r>
+      <w:r>
         <w:tab/>
       </w:r>
       <w:r>
         <w:rPr>
-          <w:rFonts w:ascii="Times New Roman" w:hAnsi="Times New Roman"/>
-          <w:sz w:val="24"/>
-          <w:u w:val="single"/>
-        </w:rPr>
-        <w:t>‎‎‎‎‎‎‎‎‎‎‎‎‎‎‎‎‎‎‎‎‎‎‎‎‎‎</w:t>
-      </w:r>
-    </w:p>
-    <w:p>
-      <w:pPr>
-        <w:tabs>
-          <w:tab w:val="left" w:pos="4594"/>
-          <w:tab w:val="left" w:pos="4839"/>
-          <w:tab w:val="left" w:pos="6968"/>
-          <w:tab w:val="left" w:pos="7184"/>
-          <w:tab w:val="left" w:pos="9711"/>
-          <w:tab w:val="left" w:pos="9747"/>
-        </w:tabs>
-        <w:spacing w:before="21" w:line="480" w:lineRule="auto"/>
-        <w:ind w:left="360" w:right="307"/>
-        <w:rPr>
-          <w:sz w:val="24"/>
-          <w:u w:val="single"/>
-        </w:rPr>
-      </w:pPr>
-      <w:r>
-        <w:rPr>
-          <w:sz w:val="24"/>
-        </w:rPr>
-        <w:t xml:space="preserve">Mother’s Name: </w:t>
-      </w:r>
-      <w:r>
-        <w:rPr>
-          <w:rFonts w:ascii="Times New Roman" w:hAnsi="Times New Roman"/>
-          <w:sz w:val="24"/>
-          <w:u w:val="single"/>
-        </w:rPr>
+          <w:spacing w:val="80"/>
+        </w:rPr>
+        <w:t xml:space="preserve"> </w:t>
+      </w:r>
+      <w:r>
+        <w:t>Contact No:</w:t>
+      </w:r>
+      <w:r>
+        <w:rPr>
+          <w:spacing w:val="40"/>
+        </w:rPr>
+        <w:t xml:space="preserve"> </w:t>
+      </w:r>
+      <w:r>
+        <w:rPr>
+          <w:u w:val="single"/>
+        </w:rPr>
+        <w:t>{</w:t>
+      </w:r>
+      <w:proofErr w:type="spellStart"/>
+      <w:r>
+        <w:rPr>
+          <w:u w:val="single"/>
+        </w:rPr>
+        <w:t>fatherPhone</w:t>
+      </w:r>
+      <w:proofErr w:type="spellEnd"/>
+      <w:r>
+        <w:rPr>
+          <w:u w:val="single"/>
+        </w:rPr>
+        <w:t>}</w:t>
+      </w:r>
+      <w:r>
+        <w:t xml:space="preserve"> </w:t>
+      </w:r>
+    </w:p>
+    <w:p>
+      <w:r>
+        <w:t>Mother’s Name:</w:t>
+      </w:r>
+      <w:r>
+        <w:rPr>
+          <w:spacing w:val="40"/>
+        </w:rPr>
+        <w:t xml:space="preserve"> </w:t>
+      </w:r>
+      <w:r>
+        <w:rPr>
+          <w:u w:val="single"/>
+        </w:rPr>
+        <w:t>{</w:t>
+      </w:r>
+      <w:proofErr w:type="spellStart"/>
+      <w:r>
+        <w:rPr>
+          <w:u w:val="single"/>
+        </w:rPr>
+        <w:t>motherName</w:t>
+      </w:r>
+      <w:proofErr w:type="spellEnd"/>
+      <w:r>
+        <w:rPr>
+          <w:u w:val="single"/>
+        </w:rPr>
+        <w:t>}</w:t>
+      </w:r>
+      <w:r>
         <w:tab/>
       </w:r>
       <w:r>
-        <w:rPr>
-          <w:rFonts w:ascii="Times New Roman" w:hAnsi="Times New Roman"/>
-          <w:sz w:val="24"/>
-          <w:u w:val="single"/>
-        </w:rPr>
         <w:tab/>
       </w:r>
       <w:r>
-        <w:rPr>
-          <w:rFonts w:ascii="Times New Roman" w:hAnsi="Times New Roman"/>
-          <w:sz w:val="24"/>
-          <w:u w:val="single"/>
-        </w:rPr>
         <w:tab/>
-      </w:r>
-      <w:r>
-        <w:rPr>
-          <w:rFonts w:ascii="Times New Roman" w:hAnsi="Times New Roman"/>
-          <w:sz w:val="24"/>
-          <w:u w:val="single"/>
-        </w:rPr>
+        <w:t xml:space="preserve"> </w:t>
+      </w:r>
+    </w:p>
+    <w:p>
+      <w:r>
+        <w:t>Occupation:</w:t>
+      </w:r>
+      <w:r>
+        <w:rPr>
+          <w:spacing w:val="40"/>
+        </w:rPr>
+        <w:t xml:space="preserve"> </w:t>
+      </w:r>
+      <w:r>
+        <w:rPr>
+          <w:u w:val="single"/>
+        </w:rPr>
+        <w:t>{</w:t>
+      </w:r>
+      <w:proofErr w:type="spellStart"/>
+      <w:r>
+        <w:rPr>
+          <w:u w:val="single"/>
+        </w:rPr>
+        <w:t>motherOccupation</w:t>
+      </w:r>
+      <w:proofErr w:type="spellEnd"/>
+      <w:r>
+        <w:rPr>
+          <w:u w:val="single"/>
+        </w:rPr>
+        <w:t>}</w:t>
+      </w:r>
+      <w:r>
         <w:tab/>
       </w:r>
-    </w:p>
-    <w:p>
-      <w:pPr>
-        <w:tabs>
-          <w:tab w:val="left" w:pos="4594"/>
-          <w:tab w:val="left" w:pos="4839"/>
-          <w:tab w:val="left" w:pos="6968"/>
-          <w:tab w:val="left" w:pos="7184"/>
-          <w:tab w:val="left" w:pos="9711"/>
-          <w:tab w:val="left" w:pos="9747"/>
-        </w:tabs>
-        <w:spacing w:before="21" w:line="480" w:lineRule="auto"/>
-        <w:ind w:left="360" w:right="307"/>
-        <w:rPr>
-          <w:sz w:val="24"/>
-          <w:u w:val="single"/>
-        </w:rPr>
-      </w:pPr>
-      <w:r>
-        <w:t xml:space="preserve">Contact Number/s: </w:t>
-      </w:r>
-      <w:r>
-        <w:rPr>
-          <w:u w:val="single"/>
-        </w:rPr>
+      <w:r>
+        <w:rPr>
+          <w:spacing w:val="80"/>
+        </w:rPr>
+        <w:t xml:space="preserve"> </w:t>
+      </w:r>
+      <w:r>
+        <w:t>Contact No:</w:t>
+      </w:r>
+      <w:r>
+        <w:rPr>
+          <w:spacing w:val="40"/>
+        </w:rPr>
+        <w:t xml:space="preserve"> </w:t>
+      </w:r>
+      <w:r>
+        <w:rPr>
+          <w:u w:val="single"/>
+        </w:rPr>
+        <w:t>{</w:t>
+      </w:r>
+      <w:proofErr w:type="spellStart"/>
+      <w:r>
+        <w:rPr>
+          <w:u w:val="single"/>
+        </w:rPr>
+        <w:t>motherPhone</w:t>
+      </w:r>
+      <w:proofErr w:type="spellEnd"/>
+      <w:r>
+        <w:rPr>
+          <w:u w:val="single"/>
+        </w:rPr>
+        <w:t>}</w:t>
+      </w:r>
+      <w:r>
         <w:tab/>
-      </w:r>
-      <w:r>
-        <w:rPr>
-          <w:u w:val="single"/>
-        </w:rPr>
+        <w:t xml:space="preserve"> </w:t>
+      </w:r>
+    </w:p>
+    <w:p>
+      <w:r>
+        <w:t>Guardian’s Name:</w:t>
+      </w:r>
+      <w:r>
+        <w:rPr>
+          <w:spacing w:val="40"/>
+        </w:rPr>
+        <w:t xml:space="preserve"> </w:t>
+      </w:r>
+      <w:r>
+        <w:rPr>
+          <w:u w:val="single"/>
+        </w:rPr>
+        <w:t>{</w:t>
+      </w:r>
+      <w:proofErr w:type="spellStart"/>
+      <w:r>
+        <w:rPr>
+          <w:u w:val="single"/>
+        </w:rPr>
+        <w:t>guardianName</w:t>
+      </w:r>
+      <w:proofErr w:type="spellEnd"/>
+      <w:r>
+        <w:rPr>
+          <w:u w:val="single"/>
+        </w:rPr>
+        <w:t>}</w:t>
+      </w:r>
+      <w:r>
         <w:tab/>
       </w:r>
       <w:r>
-        <w:rPr>
-          <w:u w:val="single"/>
-        </w:rPr>
         <w:tab/>
-      </w:r>
-      <w:r>
-        <w:rPr>
-          <w:u w:val="single"/>
-        </w:rPr>
+        <w:t xml:space="preserve"> </w:t>
+      </w:r>
+    </w:p>
+    <w:p>
+      <w:pPr>
+        <w:rPr>
+          <w:b/>
+          <w:bCs/>
+        </w:rPr>
+      </w:pPr>
+      <w:r>
+        <w:t>Relationship with Student Intern:</w:t>
+      </w:r>
+      <w:r>
+        <w:rPr>
+          <w:spacing w:val="40"/>
+        </w:rPr>
+        <w:t xml:space="preserve"> </w:t>
+      </w:r>
+      <w:r>
+        <w:rPr>
+          <w:u w:val="single"/>
+        </w:rPr>
+        <w:t>{</w:t>
+      </w:r>
+      <w:proofErr w:type="spellStart"/>
+      <w:r>
+        <w:rPr>
+          <w:u w:val="single"/>
+        </w:rPr>
+        <w:t>guardianRelationship</w:t>
+      </w:r>
+      <w:proofErr w:type="spellEnd"/>
+      <w:r>
+        <w:rPr>
+          <w:u w:val="single"/>
+        </w:rPr>
+        <w:t>}</w:t>
+      </w:r>
+      <w:r>
+        <w:t xml:space="preserve"> </w:t>
+      </w:r>
+      <w:r>
         <w:tab/>
       </w:r>
-    </w:p>
-    <w:p>
-      <w:pPr>
-        <w:pStyle w:val="Title"/>
-        <w:jc w:val="center"/>
-        <w:rPr>
-          <w:rFonts w:ascii="Cambria" w:hAnsi="Cambria"/>
+      <w:r>
+        <w:t>Contact</w:t>
+      </w:r>
+      <w:r>
+        <w:rPr>
+          <w:spacing w:val="-6"/>
+        </w:rPr>
+        <w:t xml:space="preserve"> </w:t>
+      </w:r>
+      <w:r>
+        <w:t>Number/s:</w:t>
+      </w:r>
+      <w:r>
+        <w:rPr>
+          <w:spacing w:val="-4"/>
+        </w:rPr>
+        <w:t xml:space="preserve"> </w:t>
+      </w:r>
+      <w:r>
+        <w:rPr>
+          <w:u w:val="single"/>
+        </w:rPr>
+        <w:t>{</w:t>
+      </w:r>
+      <w:proofErr w:type="spellStart"/>
+      <w:r>
+        <w:rPr>
+          <w:u w:val="single"/>
+        </w:rPr>
+        <w:t>guardianPhone</w:t>
+      </w:r>
+      <w:proofErr w:type="spellEnd"/>
+      <w:r>
+        <w:rPr>
+          <w:u w:val="single"/>
+        </w:rPr>
+        <w:t>}</w:t>
+      </w:r>
+    </w:p>
+    <w:p>
+      <w:pPr>
+        <w:rPr>
+          <w:rFonts w:ascii="Cambria" w:hAnsi="Cambria" w:cs="Times New Roman"/>
           <w:b/>
           <w:bCs/>
-          <w:spacing w:val="-2"/>
-          <w:sz w:val="144"/>
-          <w:szCs w:val="144"/>
         </w:rPr>
       </w:pPr>
     </w:p>
@@ -1123,15 +1164,14 @@
           <w:bCs/>
         </w:rPr>
       </w:pPr>
-    </w:p>
-    <w:p>
-      <w:pPr>
+      <w:r>
         <w:rPr>
           <w:rFonts w:ascii="Times New Roman" w:hAnsi="Times New Roman" w:cs="Times New Roman"/>
           <w:b/>
           <w:bCs/>
         </w:rPr>
-      </w:pPr>
+        <w:br/>
+      </w:r>
     </w:p>
     <w:p>
       <w:pPr>
@@ -1141,13 +1181,75 @@
           <w:bCs/>
         </w:rPr>
       </w:pPr>
-      <w:r>
+    </w:p>
+    <w:p>
+      <w:pPr>
         <w:rPr>
           <w:rFonts w:ascii="Times New Roman" w:hAnsi="Times New Roman" w:cs="Times New Roman"/>
           <w:b/>
           <w:bCs/>
         </w:rPr>
-        <w:lastRenderedPageBreak/>
+      </w:pPr>
+    </w:p>
+    <w:p>
+      <w:pPr>
+        <w:rPr>
+          <w:rFonts w:ascii="Times New Roman" w:hAnsi="Times New Roman" w:cs="Times New Roman"/>
+          <w:b/>
+          <w:bCs/>
+        </w:rPr>
+      </w:pPr>
+    </w:p>
+    <w:p>
+      <w:pPr>
+        <w:rPr>
+          <w:rFonts w:ascii="Times New Roman" w:hAnsi="Times New Roman" w:cs="Times New Roman"/>
+          <w:b/>
+          <w:bCs/>
+        </w:rPr>
+      </w:pPr>
+    </w:p>
+    <w:p>
+      <w:pPr>
+        <w:rPr>
+          <w:rFonts w:ascii="Times New Roman" w:hAnsi="Times New Roman" w:cs="Times New Roman"/>
+          <w:b/>
+          <w:bCs/>
+        </w:rPr>
+      </w:pPr>
+    </w:p>
+    <w:p>
+      <w:pPr>
+        <w:rPr>
+          <w:rFonts w:ascii="Times New Roman" w:hAnsi="Times New Roman" w:cs="Times New Roman"/>
+          <w:b/>
+          <w:bCs/>
+        </w:rPr>
+      </w:pPr>
+    </w:p>
+    <w:p>
+      <w:pPr>
+        <w:rPr>
+          <w:rFonts w:ascii="Times New Roman" w:hAnsi="Times New Roman" w:cs="Times New Roman"/>
+          <w:b/>
+          <w:bCs/>
+        </w:rPr>
+      </w:pPr>
+    </w:p>
+    <w:p>
+      <w:pPr>
+        <w:rPr>
+          <w:rFonts w:ascii="Times New Roman" w:hAnsi="Times New Roman" w:cs="Times New Roman"/>
+          <w:b/>
+          <w:bCs/>
+        </w:rPr>
+      </w:pPr>
+      <w:r>
+        <w:rPr>
+          <w:rFonts w:ascii="Times New Roman" w:hAnsi="Times New Roman" w:cs="Times New Roman"/>
+          <w:b/>
+          <w:bCs/>
+        </w:rPr>
         <w:t>BRIEF BACKGROUND OF THE HOST TRAINING ESTABLISHMENT</w:t>
       </w:r>
     </w:p>
@@ -2005,6 +2107,7 @@
         <w:t xml:space="preserve">            {</w:t>
       </w:r>
       <w:proofErr w:type="spellStart"/>
+      <w:proofErr w:type="gramStart"/>
       <w:r>
         <w:rPr>
           <w:sz w:val="28"/>
@@ -2025,7 +2128,15 @@
           <w:sz w:val="28"/>
           <w:u w:val="single"/>
         </w:rPr>
-        <w:t xml:space="preserve">             </w:t>
+        <w:t xml:space="preserve">   </w:t>
+      </w:r>
+      <w:proofErr w:type="gramEnd"/>
+      <w:r>
+        <w:rPr>
+          <w:sz w:val="28"/>
+          <w:u w:val="single"/>
+        </w:rPr>
+        <w:t xml:space="preserve">          </w:t>
       </w:r>
       <w:r>
         <w:rPr>
@@ -2176,9 +2287,11 @@
         </w:rPr>
         <w:t xml:space="preserve"> </w:t>
       </w:r>
+      <w:proofErr w:type="gramStart"/>
       <w:r>
         <w:t>over</w:t>
       </w:r>
+      <w:proofErr w:type="gramEnd"/>
       <w:r>
         <w:rPr>
           <w:spacing w:val="-12"/>
@@ -4022,7 +4135,6 @@
   <w:style w:type="character" w:default="1" w:styleId="DefaultParagraphFont">
     <w:name w:val="Default Paragraph Font"/>
     <w:uiPriority w:val="1"/>
-    <w:semiHidden/>
     <w:unhideWhenUsed/>
   </w:style>
   <w:style w:type="table" w:default="1" w:styleId="TableNormal">

</xml_diff>

<commit_message>
Add a device registration for DTR
</commit_message>
<xml_diff>
--- a/public/JournalTemplate.docx
+++ b/public/JournalTemplate.docx
@@ -203,7 +203,6 @@
         </w:rPr>
         <w:t xml:space="preserve"> </w:t>
       </w:r>
-      <w:proofErr w:type="spellStart"/>
       <w:r>
         <w:rPr>
           <w:rFonts w:ascii="Cambria" w:hAnsi="Cambria"/>
@@ -211,17 +210,7 @@
           <w:sz w:val="32"/>
           <w:szCs w:val="32"/>
         </w:rPr>
-        <w:t>Bacolor</w:t>
-      </w:r>
-      <w:proofErr w:type="spellEnd"/>
-      <w:r>
-        <w:rPr>
-          <w:rFonts w:ascii="Cambria" w:hAnsi="Cambria"/>
-          <w:color w:val="auto"/>
-          <w:sz w:val="32"/>
-          <w:szCs w:val="32"/>
-        </w:rPr>
-        <w:t>,</w:t>
+        <w:t>Bacolor,</w:t>
       </w:r>
       <w:r>
         <w:rPr>
@@ -523,878 +512,975 @@
     </w:p>
     <w:p>
       <w:pPr>
-        <w:pStyle w:val="BodyText"/>
-        <w:spacing w:before="177"/>
-        <w:rPr>
-          <w:b/>
-          <w:sz w:val="28"/>
-        </w:rPr>
-      </w:pPr>
-    </w:p>
-    <w:p>
-      <w:r>
-        <w:t>Name:</w:t>
-      </w:r>
-      <w:r>
+        <w:rPr>
+          <w:rFonts w:ascii="Cambria" w:hAnsi="Cambria" w:cs="Times New Roman"/>
+          <w:b/>
+          <w:bCs/>
+        </w:rPr>
+      </w:pPr>
+    </w:p>
+    <w:p>
+      <w:pPr>
+        <w:rPr>
+          <w:rFonts w:ascii="Times New Roman" w:hAnsi="Times New Roman" w:cs="Times New Roman"/>
+          <w:b/>
+          <w:bCs/>
+        </w:rPr>
+      </w:pPr>
+    </w:p>
+    <w:tbl>
+      <w:tblPr>
+        <w:tblStyle w:val="TableGrid"/>
+        <w:tblW w:w="9900" w:type="dxa"/>
+        <w:tblInd w:w="-275" w:type="dxa"/>
+        <w:tblBorders>
+          <w:top w:val="none" w:sz="0" w:space="0" w:color="auto"/>
+          <w:left w:val="none" w:sz="0" w:space="0" w:color="auto"/>
+          <w:bottom w:val="none" w:sz="0" w:space="0" w:color="auto"/>
+          <w:right w:val="none" w:sz="0" w:space="0" w:color="auto"/>
+          <w:insideH w:val="none" w:sz="0" w:space="0" w:color="auto"/>
+          <w:insideV w:val="none" w:sz="0" w:space="0" w:color="auto"/>
+        </w:tblBorders>
+        <w:tblLook w:val="04A0" w:firstRow="1" w:lastRow="0" w:firstColumn="1" w:lastColumn="0" w:noHBand="0" w:noVBand="1"/>
+      </w:tblPr>
+      <w:tblGrid>
+        <w:gridCol w:w="6120"/>
+        <w:gridCol w:w="3780"/>
+      </w:tblGrid>
+      <w:tr>
+        <w:trPr>
+          <w:trHeight w:val="432"/>
+        </w:trPr>
+        <w:tc>
+          <w:tcPr>
+            <w:tcW w:w="6120" w:type="dxa"/>
+            <w:shd w:val="clear" w:color="auto" w:fill="auto"/>
+          </w:tcPr>
+          <w:p>
+            <w:pPr>
+              <w:rPr>
+                <w:rFonts w:ascii="Cambria" w:hAnsi="Cambria"/>
+              </w:rPr>
+            </w:pPr>
+            <w:r>
+              <w:rPr>
+                <w:rFonts w:ascii="Cambria" w:hAnsi="Cambria"/>
+                <w:b/>
+                <w:bCs/>
+              </w:rPr>
+              <w:t>Name:</w:t>
+            </w:r>
+            <w:r>
+              <w:rPr>
+                <w:rFonts w:ascii="Cambria" w:hAnsi="Cambria"/>
+              </w:rPr>
+              <w:t xml:space="preserve"> {lastName}, {firstName} {middleInitial</w:t>
+            </w:r>
+            <w:r>
+              <w:rPr>
+                <w:rFonts w:ascii="Cambria" w:hAnsi="Cambria"/>
+              </w:rPr>
+              <w:t xml:space="preserve">}                </w:t>
+            </w:r>
+          </w:p>
+        </w:tc>
+        <w:tc>
+          <w:tcPr>
+            <w:tcW w:w="3780" w:type="dxa"/>
+            <w:shd w:val="clear" w:color="auto" w:fill="auto"/>
+          </w:tcPr>
+          <w:p>
+            <w:pPr>
+              <w:rPr>
+                <w:rFonts w:ascii="Times New Roman" w:hAnsi="Times New Roman" w:cs="Times New Roman"/>
+                <w:b/>
+                <w:bCs/>
+              </w:rPr>
+            </w:pPr>
+          </w:p>
+        </w:tc>
+      </w:tr>
+      <w:tr>
+        <w:trPr>
+          <w:trHeight w:val="432"/>
+        </w:trPr>
+        <w:tc>
+          <w:tcPr>
+            <w:tcW w:w="6120" w:type="dxa"/>
+            <w:shd w:val="clear" w:color="auto" w:fill="auto"/>
+          </w:tcPr>
+          <w:p>
+            <w:pPr>
+              <w:rPr>
+                <w:rFonts w:ascii="Cambria" w:hAnsi="Cambria"/>
+              </w:rPr>
+            </w:pPr>
+            <w:r>
+              <w:rPr>
+                <w:rFonts w:ascii="Cambria" w:hAnsi="Cambria"/>
+                <w:b/>
+                <w:bCs/>
+              </w:rPr>
+              <w:t>Program, Major, Yr &amp; Sec:</w:t>
+            </w:r>
+            <w:r>
+              <w:rPr>
+                <w:rFonts w:ascii="Cambria" w:hAnsi="Cambria"/>
+              </w:rPr>
+              <w:t xml:space="preserve"> {course} {year} {section}</w:t>
+            </w:r>
+          </w:p>
+        </w:tc>
+        <w:tc>
+          <w:tcPr>
+            <w:tcW w:w="3780" w:type="dxa"/>
+            <w:shd w:val="clear" w:color="auto" w:fill="auto"/>
+          </w:tcPr>
+          <w:p>
+            <w:pPr>
+              <w:rPr>
+                <w:rFonts w:ascii="Times New Roman" w:hAnsi="Times New Roman" w:cs="Times New Roman"/>
+                <w:b/>
+                <w:bCs/>
+              </w:rPr>
+            </w:pPr>
+          </w:p>
+        </w:tc>
+      </w:tr>
+      <w:tr>
+        <w:trPr>
+          <w:trHeight w:val="432"/>
+        </w:trPr>
+        <w:tc>
+          <w:tcPr>
+            <w:tcW w:w="6120" w:type="dxa"/>
+            <w:shd w:val="clear" w:color="auto" w:fill="auto"/>
+          </w:tcPr>
+          <w:p>
+            <w:pPr>
+              <w:rPr>
+                <w:rFonts w:ascii="Times New Roman" w:hAnsi="Times New Roman" w:cs="Times New Roman"/>
+                <w:b/>
+                <w:bCs/>
+              </w:rPr>
+            </w:pPr>
+            <w:r>
+              <w:rPr>
+                <w:rFonts w:ascii="Cambria" w:hAnsi="Cambria"/>
+                <w:b/>
+                <w:bCs/>
+              </w:rPr>
+              <w:t>Address:</w:t>
+            </w:r>
+            <w:r>
+              <w:rPr>
+                <w:rFonts w:ascii="Cambria" w:hAnsi="Cambria"/>
+              </w:rPr>
+              <w:t xml:space="preserve"> {address}‎ ‎ ‎ ‎</w:t>
+            </w:r>
+          </w:p>
+        </w:tc>
+        <w:tc>
+          <w:tcPr>
+            <w:tcW w:w="3780" w:type="dxa"/>
+            <w:shd w:val="clear" w:color="auto" w:fill="auto"/>
+          </w:tcPr>
+          <w:p>
+            <w:pPr>
+              <w:rPr>
+                <w:rFonts w:ascii="Times New Roman" w:hAnsi="Times New Roman" w:cs="Times New Roman"/>
+                <w:b/>
+                <w:bCs/>
+              </w:rPr>
+            </w:pPr>
+          </w:p>
+        </w:tc>
+      </w:tr>
+      <w:tr>
+        <w:trPr>
+          <w:trHeight w:val="432"/>
+        </w:trPr>
+        <w:tc>
+          <w:tcPr>
+            <w:tcW w:w="6120" w:type="dxa"/>
+            <w:shd w:val="clear" w:color="auto" w:fill="auto"/>
+          </w:tcPr>
+          <w:p>
+            <w:pPr>
+              <w:rPr>
+                <w:rFonts w:ascii="Times New Roman" w:hAnsi="Times New Roman" w:cs="Times New Roman"/>
+                <w:b/>
+                <w:bCs/>
+              </w:rPr>
+            </w:pPr>
+            <w:r>
+              <w:rPr>
+                <w:rFonts w:ascii="Cambria" w:hAnsi="Cambria"/>
+                <w:b/>
+                <w:bCs/>
+              </w:rPr>
+              <w:t>Date of Birth:</w:t>
+            </w:r>
+            <w:r>
+              <w:rPr>
+                <w:rFonts w:ascii="Cambria" w:hAnsi="Cambria"/>
+              </w:rPr>
+              <w:t xml:space="preserve"> {dateOfBirth}                                  </w:t>
+            </w:r>
+          </w:p>
+        </w:tc>
+        <w:tc>
+          <w:tcPr>
+            <w:tcW w:w="3780" w:type="dxa"/>
+            <w:shd w:val="clear" w:color="auto" w:fill="auto"/>
+          </w:tcPr>
+          <w:p>
+            <w:pPr>
+              <w:rPr>
+                <w:rFonts w:ascii="Times New Roman" w:hAnsi="Times New Roman" w:cs="Times New Roman"/>
+                <w:b/>
+                <w:bCs/>
+              </w:rPr>
+            </w:pPr>
+            <w:r>
+              <w:rPr>
+                <w:rFonts w:ascii="Cambria" w:hAnsi="Cambria"/>
+                <w:b/>
+                <w:bCs/>
+              </w:rPr>
+              <w:t>Age:</w:t>
+            </w:r>
+            <w:r>
+              <w:rPr>
+                <w:rFonts w:ascii="Cambria" w:hAnsi="Cambria"/>
+              </w:rPr>
+              <w:t xml:space="preserve"> {age}‎ ‎ ‎</w:t>
+            </w:r>
+          </w:p>
+        </w:tc>
+      </w:tr>
+      <w:tr>
+        <w:trPr>
+          <w:trHeight w:val="432"/>
+        </w:trPr>
+        <w:tc>
+          <w:tcPr>
+            <w:tcW w:w="6120" w:type="dxa"/>
+            <w:shd w:val="clear" w:color="auto" w:fill="auto"/>
+          </w:tcPr>
+          <w:p>
+            <w:pPr>
+              <w:rPr>
+                <w:rFonts w:ascii="Times New Roman" w:hAnsi="Times New Roman" w:cs="Times New Roman"/>
+                <w:b/>
+                <w:bCs/>
+              </w:rPr>
+            </w:pPr>
+            <w:r>
+              <w:rPr>
+                <w:rFonts w:ascii="Cambria" w:hAnsi="Cambria"/>
+                <w:b/>
+                <w:bCs/>
+              </w:rPr>
+              <w:t>Civil Status:</w:t>
+            </w:r>
+            <w:r>
+              <w:rPr>
+                <w:rFonts w:ascii="Cambria" w:hAnsi="Cambria"/>
+              </w:rPr>
+              <w:t xml:space="preserve"> {civilStatus}</w:t>
+            </w:r>
+          </w:p>
+        </w:tc>
+        <w:tc>
+          <w:tcPr>
+            <w:tcW w:w="3780" w:type="dxa"/>
+            <w:shd w:val="clear" w:color="auto" w:fill="auto"/>
+          </w:tcPr>
+          <w:p>
+            <w:pPr>
+              <w:rPr>
+                <w:rFonts w:ascii="Times New Roman" w:hAnsi="Times New Roman" w:cs="Times New Roman"/>
+                <w:b/>
+                <w:bCs/>
+              </w:rPr>
+            </w:pPr>
+            <w:r>
+              <w:rPr>
+                <w:rFonts w:ascii="Cambria" w:hAnsi="Cambria"/>
+                <w:b/>
+                <w:bCs/>
+              </w:rPr>
+              <w:t>Religion:</w:t>
+            </w:r>
+            <w:r>
+              <w:rPr>
+                <w:rFonts w:ascii="Cambria" w:hAnsi="Cambria"/>
+              </w:rPr>
+              <w:t xml:space="preserve"> {religion}‎ ‎ ‎</w:t>
+            </w:r>
+          </w:p>
+        </w:tc>
+      </w:tr>
+      <w:tr>
+        <w:trPr>
+          <w:trHeight w:val="432"/>
+        </w:trPr>
+        <w:tc>
+          <w:tcPr>
+            <w:tcW w:w="6120" w:type="dxa"/>
+            <w:shd w:val="clear" w:color="auto" w:fill="auto"/>
+          </w:tcPr>
+          <w:p>
+            <w:pPr>
+              <w:rPr>
+                <w:rFonts w:ascii="Times New Roman" w:hAnsi="Times New Roman" w:cs="Times New Roman"/>
+                <w:b/>
+                <w:bCs/>
+              </w:rPr>
+            </w:pPr>
+            <w:r>
+              <w:rPr>
+                <w:rFonts w:ascii="Cambria" w:hAnsi="Cambria"/>
+                <w:b/>
+                <w:bCs/>
+              </w:rPr>
+              <w:t>Father’s Name:</w:t>
+            </w:r>
+            <w:r>
+              <w:rPr>
+                <w:rFonts w:ascii="Cambria" w:hAnsi="Cambria"/>
+                <w:spacing w:val="40"/>
+              </w:rPr>
+              <w:t xml:space="preserve"> </w:t>
+            </w:r>
+            <w:r>
+              <w:rPr>
+                <w:rFonts w:ascii="Cambria" w:hAnsi="Cambria"/>
+              </w:rPr>
+              <w:t>{fatherName}</w:t>
+            </w:r>
+          </w:p>
+        </w:tc>
+        <w:tc>
+          <w:tcPr>
+            <w:tcW w:w="3780" w:type="dxa"/>
+            <w:shd w:val="clear" w:color="auto" w:fill="auto"/>
+          </w:tcPr>
+          <w:p>
+            <w:pPr>
+              <w:rPr>
+                <w:rFonts w:ascii="Times New Roman" w:hAnsi="Times New Roman" w:cs="Times New Roman"/>
+                <w:b/>
+                <w:bCs/>
+              </w:rPr>
+            </w:pPr>
+          </w:p>
+        </w:tc>
+      </w:tr>
+      <w:tr>
+        <w:trPr>
+          <w:trHeight w:val="432"/>
+        </w:trPr>
+        <w:tc>
+          <w:tcPr>
+            <w:tcW w:w="6120" w:type="dxa"/>
+            <w:shd w:val="clear" w:color="auto" w:fill="auto"/>
+          </w:tcPr>
+          <w:p>
+            <w:pPr>
+              <w:rPr>
+                <w:rFonts w:ascii="Times New Roman" w:hAnsi="Times New Roman" w:cs="Times New Roman"/>
+                <w:b/>
+                <w:bCs/>
+              </w:rPr>
+            </w:pPr>
+            <w:r>
+              <w:rPr>
+                <w:rFonts w:ascii="Cambria" w:hAnsi="Cambria"/>
+                <w:b/>
+                <w:bCs/>
+              </w:rPr>
+              <w:t>Occupation:</w:t>
+            </w:r>
+            <w:r>
+              <w:rPr>
+                <w:rFonts w:ascii="Cambria" w:hAnsi="Cambria" w:cs="Courier New"/>
+                <w:color w:val="CCCCCC"/>
+                <w:sz w:val="16"/>
+                <w:szCs w:val="16"/>
+              </w:rPr>
+              <w:t xml:space="preserve"> </w:t>
+            </w:r>
+            <w:r>
+              <w:rPr>
+                <w:rFonts w:ascii="Cambria" w:hAnsi="Cambria"/>
+                <w:spacing w:val="40"/>
+              </w:rPr>
+              <w:t>{fatherOccupation}</w:t>
+            </w:r>
+          </w:p>
+        </w:tc>
+        <w:tc>
+          <w:tcPr>
+            <w:tcW w:w="3780" w:type="dxa"/>
+            <w:shd w:val="clear" w:color="auto" w:fill="auto"/>
+          </w:tcPr>
+          <w:p>
+            <w:pPr>
+              <w:rPr>
+                <w:rFonts w:ascii="Times New Roman" w:hAnsi="Times New Roman" w:cs="Times New Roman"/>
+                <w:b/>
+                <w:bCs/>
+              </w:rPr>
+            </w:pPr>
+            <w:r>
+              <w:rPr>
+                <w:rFonts w:ascii="Cambria" w:hAnsi="Cambria"/>
+                <w:b/>
+                <w:bCs/>
+              </w:rPr>
+              <w:t>Contact No:</w:t>
+            </w:r>
+            <w:r>
+              <w:rPr>
+                <w:rFonts w:ascii="Cambria" w:hAnsi="Cambria"/>
+                <w:spacing w:val="40"/>
+              </w:rPr>
+              <w:t xml:space="preserve"> </w:t>
+            </w:r>
+            <w:r>
+              <w:rPr>
+                <w:rFonts w:ascii="Cambria" w:hAnsi="Cambria"/>
+              </w:rPr>
+              <w:t>{fatherPhone}</w:t>
+            </w:r>
+          </w:p>
+        </w:tc>
+      </w:tr>
+      <w:tr>
+        <w:trPr>
+          <w:trHeight w:val="432"/>
+        </w:trPr>
+        <w:tc>
+          <w:tcPr>
+            <w:tcW w:w="6120" w:type="dxa"/>
+            <w:shd w:val="clear" w:color="auto" w:fill="auto"/>
+          </w:tcPr>
+          <w:p>
+            <w:pPr>
+              <w:rPr>
+                <w:rFonts w:ascii="Times New Roman" w:hAnsi="Times New Roman" w:cs="Times New Roman"/>
+                <w:b/>
+                <w:bCs/>
+              </w:rPr>
+            </w:pPr>
+            <w:r>
+              <w:rPr>
+                <w:rFonts w:ascii="Cambria" w:hAnsi="Cambria"/>
+                <w:b/>
+                <w:bCs/>
+              </w:rPr>
+              <w:t>Mother’s Name:</w:t>
+            </w:r>
+            <w:r>
+              <w:rPr>
+                <w:rFonts w:ascii="Cambria" w:hAnsi="Cambria"/>
+                <w:spacing w:val="40"/>
+              </w:rPr>
+              <w:t xml:space="preserve"> </w:t>
+            </w:r>
+            <w:r>
+              <w:rPr>
+                <w:rFonts w:ascii="Cambria" w:hAnsi="Cambria"/>
+              </w:rPr>
+              <w:t>{motherName}</w:t>
+            </w:r>
+          </w:p>
+        </w:tc>
+        <w:tc>
+          <w:tcPr>
+            <w:tcW w:w="3780" w:type="dxa"/>
+            <w:shd w:val="clear" w:color="auto" w:fill="auto"/>
+          </w:tcPr>
+          <w:p>
+            <w:pPr>
+              <w:rPr>
+                <w:rFonts w:ascii="Times New Roman" w:hAnsi="Times New Roman" w:cs="Times New Roman"/>
+                <w:b/>
+                <w:bCs/>
+              </w:rPr>
+            </w:pPr>
+          </w:p>
+        </w:tc>
+      </w:tr>
+      <w:tr>
+        <w:trPr>
+          <w:trHeight w:val="432"/>
+        </w:trPr>
+        <w:tc>
+          <w:tcPr>
+            <w:tcW w:w="6120" w:type="dxa"/>
+            <w:shd w:val="clear" w:color="auto" w:fill="auto"/>
+          </w:tcPr>
+          <w:p>
+            <w:pPr>
+              <w:rPr>
+                <w:rFonts w:ascii="Times New Roman" w:hAnsi="Times New Roman" w:cs="Times New Roman"/>
+                <w:b/>
+                <w:bCs/>
+              </w:rPr>
+            </w:pPr>
+            <w:r>
+              <w:rPr>
+                <w:rFonts w:ascii="Cambria" w:hAnsi="Cambria"/>
+                <w:b/>
+                <w:bCs/>
+              </w:rPr>
+              <w:t>Occupation:</w:t>
+            </w:r>
+            <w:r>
+              <w:rPr>
+                <w:rFonts w:ascii="Cambria" w:hAnsi="Cambria"/>
+                <w:spacing w:val="40"/>
+              </w:rPr>
+              <w:t xml:space="preserve"> </w:t>
+            </w:r>
+            <w:r>
+              <w:rPr>
+                <w:rFonts w:ascii="Cambria" w:hAnsi="Cambria"/>
+              </w:rPr>
+              <w:t>{motherOccupation}</w:t>
+            </w:r>
+          </w:p>
+        </w:tc>
+        <w:tc>
+          <w:tcPr>
+            <w:tcW w:w="3780" w:type="dxa"/>
+            <w:shd w:val="clear" w:color="auto" w:fill="auto"/>
+          </w:tcPr>
+          <w:p>
+            <w:pPr>
+              <w:rPr>
+                <w:rFonts w:ascii="Times New Roman" w:hAnsi="Times New Roman" w:cs="Times New Roman"/>
+                <w:b/>
+                <w:bCs/>
+              </w:rPr>
+            </w:pPr>
+            <w:r>
+              <w:rPr>
+                <w:rFonts w:ascii="Cambria" w:hAnsi="Cambria"/>
+                <w:b/>
+                <w:bCs/>
+              </w:rPr>
+              <w:t>Contact No:</w:t>
+            </w:r>
+            <w:r>
+              <w:rPr>
+                <w:rFonts w:ascii="Cambria" w:hAnsi="Cambria"/>
+                <w:spacing w:val="40"/>
+              </w:rPr>
+              <w:t xml:space="preserve"> </w:t>
+            </w:r>
+            <w:r>
+              <w:rPr>
+                <w:rFonts w:ascii="Cambria" w:hAnsi="Cambria"/>
+              </w:rPr>
+              <w:t>{motherPhone}</w:t>
+            </w:r>
+          </w:p>
+        </w:tc>
+      </w:tr>
+      <w:tr>
+        <w:trPr>
+          <w:trHeight w:val="432"/>
+        </w:trPr>
+        <w:tc>
+          <w:tcPr>
+            <w:tcW w:w="6120" w:type="dxa"/>
+            <w:shd w:val="clear" w:color="auto" w:fill="auto"/>
+          </w:tcPr>
+          <w:p>
+            <w:pPr>
+              <w:rPr>
+                <w:rFonts w:ascii="Times New Roman" w:hAnsi="Times New Roman" w:cs="Times New Roman"/>
+                <w:b/>
+                <w:bCs/>
+              </w:rPr>
+            </w:pPr>
+            <w:r>
+              <w:rPr>
+                <w:rFonts w:ascii="Cambria" w:hAnsi="Cambria"/>
+                <w:b/>
+                <w:bCs/>
+              </w:rPr>
+              <w:t>Guardian’s Name:</w:t>
+            </w:r>
+            <w:r>
+              <w:rPr>
+                <w:rFonts w:ascii="Cambria" w:hAnsi="Cambria"/>
+                <w:spacing w:val="40"/>
+              </w:rPr>
+              <w:t xml:space="preserve"> </w:t>
+            </w:r>
+            <w:r>
+              <w:rPr>
+                <w:rFonts w:ascii="Cambria" w:hAnsi="Cambria"/>
+              </w:rPr>
+              <w:t>{guardianName}</w:t>
+            </w:r>
+          </w:p>
+        </w:tc>
+        <w:tc>
+          <w:tcPr>
+            <w:tcW w:w="3780" w:type="dxa"/>
+            <w:shd w:val="clear" w:color="auto" w:fill="auto"/>
+          </w:tcPr>
+          <w:p>
+            <w:pPr>
+              <w:rPr>
+                <w:rFonts w:ascii="Times New Roman" w:hAnsi="Times New Roman" w:cs="Times New Roman"/>
+                <w:b/>
+                <w:bCs/>
+              </w:rPr>
+            </w:pPr>
+          </w:p>
+        </w:tc>
+      </w:tr>
+      <w:tr>
+        <w:trPr>
+          <w:trHeight w:val="432"/>
+        </w:trPr>
+        <w:tc>
+          <w:tcPr>
+            <w:tcW w:w="6120" w:type="dxa"/>
+            <w:shd w:val="clear" w:color="auto" w:fill="auto"/>
+          </w:tcPr>
+          <w:p>
+            <w:pPr>
+              <w:rPr>
+                <w:rFonts w:ascii="Times New Roman" w:hAnsi="Times New Roman" w:cs="Times New Roman"/>
+                <w:b/>
+                <w:bCs/>
+              </w:rPr>
+            </w:pPr>
+            <w:r>
+              <w:rPr>
+                <w:rFonts w:ascii="Cambria" w:hAnsi="Cambria"/>
+                <w:b/>
+                <w:bCs/>
+              </w:rPr>
+              <w:t>Relationship with Student Intern:</w:t>
+            </w:r>
+            <w:r>
+              <w:rPr>
+                <w:rFonts w:ascii="Cambria" w:hAnsi="Cambria"/>
+                <w:spacing w:val="40"/>
+              </w:rPr>
+              <w:t xml:space="preserve"> </w:t>
+            </w:r>
+            <w:r>
+              <w:rPr>
+                <w:rFonts w:ascii="Cambria" w:hAnsi="Cambria"/>
+              </w:rPr>
+              <w:t>{guardianRelationship}</w:t>
+            </w:r>
+          </w:p>
+        </w:tc>
+        <w:tc>
+          <w:tcPr>
+            <w:tcW w:w="3780" w:type="dxa"/>
+            <w:shd w:val="clear" w:color="auto" w:fill="auto"/>
+          </w:tcPr>
+          <w:p>
+            <w:pPr>
+              <w:rPr>
+                <w:rFonts w:ascii="Times New Roman" w:hAnsi="Times New Roman" w:cs="Times New Roman"/>
+                <w:b/>
+                <w:bCs/>
+              </w:rPr>
+            </w:pPr>
+            <w:r>
+              <w:rPr>
+                <w:rFonts w:ascii="Cambria" w:hAnsi="Cambria"/>
+                <w:b/>
+                <w:bCs/>
+              </w:rPr>
+              <w:t>Contact</w:t>
+            </w:r>
+            <w:r>
+              <w:rPr>
+                <w:rFonts w:ascii="Cambria" w:hAnsi="Cambria"/>
+                <w:b/>
+                <w:bCs/>
+                <w:spacing w:val="-6"/>
+              </w:rPr>
+              <w:t xml:space="preserve"> </w:t>
+            </w:r>
+            <w:r>
+              <w:rPr>
+                <w:rFonts w:ascii="Cambria" w:hAnsi="Cambria"/>
+                <w:b/>
+                <w:bCs/>
+                <w:spacing w:val="-6"/>
+              </w:rPr>
+              <w:t>No</w:t>
+            </w:r>
+            <w:r>
+              <w:rPr>
+                <w:rFonts w:ascii="Cambria" w:hAnsi="Cambria"/>
+                <w:b/>
+                <w:bCs/>
+              </w:rPr>
+              <w:t>:</w:t>
+            </w:r>
+            <w:r>
+              <w:rPr>
+                <w:rFonts w:ascii="Cambria" w:hAnsi="Cambria"/>
+                <w:spacing w:val="-4"/>
+              </w:rPr>
+              <w:t xml:space="preserve"> </w:t>
+            </w:r>
+            <w:r>
+              <w:rPr>
+                <w:rFonts w:ascii="Cambria" w:hAnsi="Cambria"/>
+              </w:rPr>
+              <w:t>{guardianPhone}</w:t>
+            </w:r>
+          </w:p>
+        </w:tc>
+      </w:tr>
+    </w:tbl>
+    <w:p>
+      <w:pPr>
+        <w:rPr>
+          <w:rFonts w:ascii="Times New Roman" w:hAnsi="Times New Roman" w:cs="Times New Roman"/>
+          <w:b/>
+          <w:bCs/>
+        </w:rPr>
+      </w:pPr>
+    </w:p>
+    <w:p>
+      <w:pPr>
+        <w:rPr>
+          <w:rFonts w:ascii="Times New Roman" w:hAnsi="Times New Roman" w:cs="Times New Roman"/>
+          <w:b/>
+          <w:bCs/>
+        </w:rPr>
+      </w:pPr>
+    </w:p>
+    <w:p>
+      <w:pPr>
+        <w:rPr>
+          <w:rFonts w:ascii="Times New Roman" w:hAnsi="Times New Roman" w:cs="Times New Roman"/>
+          <w:b/>
+          <w:bCs/>
+        </w:rPr>
+      </w:pPr>
+      <w:r>
+        <w:rPr>
+          <w:rFonts w:ascii="Times New Roman" w:hAnsi="Times New Roman" w:cs="Times New Roman"/>
+          <w:b/>
+          <w:bCs/>
+        </w:rPr>
+        <w:br/>
+      </w:r>
+    </w:p>
+    <w:p>
+      <w:pPr>
+        <w:rPr>
+          <w:rFonts w:ascii="Times New Roman" w:hAnsi="Times New Roman" w:cs="Times New Roman"/>
+          <w:b/>
+          <w:bCs/>
+        </w:rPr>
+      </w:pPr>
+    </w:p>
+    <w:p>
+      <w:pPr>
+        <w:rPr>
+          <w:rFonts w:ascii="Times New Roman" w:hAnsi="Times New Roman" w:cs="Times New Roman"/>
+          <w:b/>
+          <w:bCs/>
+        </w:rPr>
+      </w:pPr>
+    </w:p>
+    <w:p>
+      <w:pPr>
+        <w:rPr>
+          <w:rFonts w:ascii="Times New Roman" w:hAnsi="Times New Roman" w:cs="Times New Roman"/>
+          <w:b/>
+          <w:bCs/>
+        </w:rPr>
+      </w:pPr>
+    </w:p>
+    <w:p>
+      <w:pPr>
+        <w:rPr>
+          <w:rFonts w:ascii="Times New Roman" w:hAnsi="Times New Roman" w:cs="Times New Roman"/>
+          <w:b/>
+          <w:bCs/>
+        </w:rPr>
+      </w:pPr>
+    </w:p>
+    <w:p>
+      <w:pPr>
+        <w:rPr>
+          <w:rFonts w:ascii="Times New Roman" w:hAnsi="Times New Roman" w:cs="Times New Roman"/>
+          <w:b/>
+          <w:bCs/>
+        </w:rPr>
+      </w:pPr>
+    </w:p>
+    <w:p>
+      <w:pPr>
+        <w:rPr>
+          <w:rFonts w:ascii="Times New Roman" w:hAnsi="Times New Roman" w:cs="Times New Roman"/>
+          <w:b/>
+          <w:bCs/>
+        </w:rPr>
+      </w:pPr>
+    </w:p>
+    <w:p>
+      <w:pPr>
+        <w:rPr>
+          <w:rFonts w:ascii="Times New Roman" w:hAnsi="Times New Roman" w:cs="Times New Roman"/>
+          <w:b/>
+          <w:bCs/>
+        </w:rPr>
+      </w:pPr>
+    </w:p>
+    <w:p>
+      <w:pPr>
+        <w:rPr>
+          <w:rFonts w:ascii="Times New Roman" w:hAnsi="Times New Roman" w:cs="Times New Roman"/>
+          <w:b/>
+          <w:bCs/>
+        </w:rPr>
+      </w:pPr>
+      <w:r>
+        <w:rPr>
+          <w:rFonts w:ascii="Times New Roman" w:hAnsi="Times New Roman" w:cs="Times New Roman"/>
+          <w:b/>
+          <w:bCs/>
+        </w:rPr>
+        <w:lastRenderedPageBreak/>
+        <w:t>BRIEF BACKGROUND OF THE HOST TRAINING ESTABLISHMENT</w:t>
+      </w:r>
+    </w:p>
+    <w:p>
+      <w:pPr>
+        <w:rPr>
+          <w:rFonts w:ascii="Times New Roman" w:hAnsi="Times New Roman" w:cs="Times New Roman"/>
+        </w:rPr>
+      </w:pPr>
+      <w:r>
+        <w:rPr>
+          <w:rFonts w:ascii="Times New Roman" w:hAnsi="Times New Roman" w:cs="Times New Roman"/>
+          <w:b/>
+          <w:bCs/>
+        </w:rPr>
+        <w:t>Name of HTE:</w:t>
+      </w:r>
+      <w:r>
+        <w:rPr>
+          <w:rFonts w:ascii="Times New Roman" w:hAnsi="Times New Roman" w:cs="Times New Roman"/>
+        </w:rPr>
         <w:t xml:space="preserve"> </w:t>
       </w:r>
       <w:r>
         <w:rPr>
-          <w:u w:val="single"/>
-        </w:rPr>
-        <w:t>{</w:t>
-      </w:r>
-      <w:proofErr w:type="spellStart"/>
-      <w:r>
-        <w:rPr>
-          <w:u w:val="single"/>
-        </w:rPr>
-        <w:t>lastName</w:t>
-      </w:r>
-      <w:proofErr w:type="spellEnd"/>
-      <w:r>
-        <w:rPr>
-          <w:u w:val="single"/>
-        </w:rPr>
-        <w:t>}</w:t>
-      </w:r>
-      <w:r>
-        <w:rPr>
-          <w:u w:val="single"/>
-        </w:rPr>
-        <w:t>,</w:t>
-      </w:r>
-      <w:r>
-        <w:rPr>
-          <w:u w:val="single"/>
-        </w:rPr>
-        <w:t xml:space="preserve"> {</w:t>
-      </w:r>
-      <w:proofErr w:type="spellStart"/>
-      <w:r>
-        <w:rPr>
-          <w:u w:val="single"/>
-        </w:rPr>
-        <w:t>firstName</w:t>
-      </w:r>
-      <w:proofErr w:type="spellEnd"/>
-      <w:r>
-        <w:rPr>
-          <w:u w:val="single"/>
-        </w:rPr>
-        <w:t>} {</w:t>
-      </w:r>
-      <w:proofErr w:type="spellStart"/>
-      <w:r>
-        <w:rPr>
-          <w:u w:val="single"/>
-        </w:rPr>
-        <w:t>middleInitial</w:t>
-      </w:r>
-      <w:proofErr w:type="spellEnd"/>
-      <w:r>
-        <w:rPr>
-          <w:u w:val="single"/>
-        </w:rPr>
-        <w:t>}</w:t>
-      </w:r>
-    </w:p>
-    <w:p>
-      <w:r>
-        <w:t>Program, Major, Yr &amp; Sec</w:t>
-      </w:r>
-      <w:r>
+          <w:rFonts w:ascii="Times New Roman" w:hAnsi="Times New Roman" w:cs="Times New Roman"/>
+        </w:rPr>
+        <w:t>{company}</w:t>
+      </w:r>
+    </w:p>
+    <w:p>
+      <w:pPr>
+        <w:rPr>
+          <w:rFonts w:ascii="Times New Roman" w:hAnsi="Times New Roman" w:cs="Times New Roman"/>
+        </w:rPr>
+      </w:pPr>
+      <w:r>
+        <w:rPr>
+          <w:rFonts w:ascii="Times New Roman" w:hAnsi="Times New Roman" w:cs="Times New Roman"/>
+          <w:b/>
+          <w:bCs/>
+        </w:rPr>
+        <w:t>HTE Address</w:t>
+      </w:r>
+      <w:r>
+        <w:rPr>
+          <w:rFonts w:ascii="Times New Roman" w:hAnsi="Times New Roman" w:cs="Times New Roman"/>
+        </w:rPr>
         <w:t xml:space="preserve">: </w:t>
       </w:r>
       <w:r>
         <w:rPr>
-          <w:u w:val="single"/>
-        </w:rPr>
-        <w:t>{course}</w:t>
-      </w:r>
-      <w:r>
-        <w:rPr>
-          <w:u w:val="single"/>
+          <w:rFonts w:ascii="Times New Roman" w:hAnsi="Times New Roman" w:cs="Times New Roman"/>
+        </w:rPr>
+        <w:t>{companyAddress}</w:t>
+      </w:r>
+    </w:p>
+    <w:p>
+      <w:pPr>
+        <w:rPr>
+          <w:rFonts w:ascii="Times New Roman" w:hAnsi="Times New Roman" w:cs="Times New Roman"/>
+        </w:rPr>
+      </w:pPr>
+      <w:r>
+        <w:rPr>
+          <w:rFonts w:ascii="Times New Roman" w:hAnsi="Times New Roman" w:cs="Times New Roman"/>
+          <w:b/>
+          <w:bCs/>
+        </w:rPr>
+        <w:t>HTE Point/Focal Person:</w:t>
+      </w:r>
+      <w:r>
+        <w:rPr>
+          <w:rFonts w:ascii="Times New Roman" w:hAnsi="Times New Roman" w:cs="Times New Roman"/>
         </w:rPr>
         <w:t xml:space="preserve"> </w:t>
       </w:r>
       <w:r>
         <w:rPr>
-          <w:u w:val="single"/>
-        </w:rPr>
-        <w:t>{year}</w:t>
-      </w:r>
-      <w:r>
-        <w:rPr>
-          <w:u w:val="single"/>
-        </w:rPr>
-        <w:t xml:space="preserve"> </w:t>
-      </w:r>
-      <w:r>
-        <w:rPr>
-          <w:u w:val="single"/>
-        </w:rPr>
-        <w:t>{section}</w:t>
-      </w:r>
-    </w:p>
-    <w:p>
-      <w:r>
-        <w:rPr>
-          <w:spacing w:val="-53"/>
-        </w:rPr>
-        <w:t xml:space="preserve"> </w:t>
-      </w:r>
-      <w:r>
-        <w:t xml:space="preserve">Address: </w:t>
-      </w:r>
-      <w:r>
-        <w:rPr>
-          <w:u w:val="single"/>
-        </w:rPr>
-        <w:t>{address}</w:t>
-      </w:r>
-      <w:r>
-        <w:rPr>
-          <w:u w:val="single"/>
-        </w:rPr>
-        <w:t>‎ ‎ ‎</w:t>
-      </w:r>
-      <w:r>
-        <w:t xml:space="preserve"> ‎ ‎ ‎ ‎ ‎ ‎ ‎ ‎ ‎ ‎ ‎ ‎ ‎ ‎ ‎ ‎ ‎ ‎ ‎ ‎ ‎ ‎ ‎ ‎ ‎ ‎ ‎ ‎ ‎ ‎ ‎ ‎ ‎ ‎ ‎ ‎ ‎ ‎ ‎ ‎ ‎ ‎ ‎ ‎ ‎ ‎        </w:t>
-      </w:r>
-    </w:p>
-    <w:p>
-      <w:r>
-        <w:t xml:space="preserve">Date of Birth: </w:t>
-      </w:r>
-      <w:r>
-        <w:rPr>
-          <w:u w:val="single"/>
-        </w:rPr>
-        <w:t>{</w:t>
-      </w:r>
-      <w:proofErr w:type="spellStart"/>
-      <w:proofErr w:type="gramStart"/>
-      <w:r>
-        <w:rPr>
-          <w:u w:val="single"/>
-        </w:rPr>
-        <w:t>dateOfBirth</w:t>
-      </w:r>
-      <w:proofErr w:type="spellEnd"/>
-      <w:r>
-        <w:rPr>
-          <w:u w:val="single"/>
-        </w:rPr>
-        <w:t>}</w:t>
-      </w:r>
-      <w:r>
-        <w:t xml:space="preserve">   </w:t>
-      </w:r>
-      <w:proofErr w:type="gramEnd"/>
-      <w:r>
-        <w:t xml:space="preserve">                             </w:t>
-      </w:r>
-      <w:r>
-        <w:t xml:space="preserve">  </w:t>
-      </w:r>
-      <w:r>
-        <w:t xml:space="preserve">Age: </w:t>
-      </w:r>
-      <w:r>
-        <w:rPr>
-          <w:u w:val="single"/>
-        </w:rPr>
-        <w:t>{age}</w:t>
-      </w:r>
-      <w:r>
-        <w:rPr>
-          <w:u w:val="single"/>
-        </w:rPr>
-        <w:t>‎ ‎</w:t>
-      </w:r>
-      <w:r>
-        <w:t xml:space="preserve"> ‎ ‎ ‎ ‎ ‎ ‎ ‎ ‎ ‎ ‎ ‎ ‎ ‎ ‎ ‎ ‎ ‎ ‎ ‎ ‎ ‎ ‎ ‎ ‎ ‎ ‎ ‎ ‎ ‎ ‎ ‎ ‎ ‎ ‎‎ ‎ ‎ ‎ ‎ ‎ ‎ ‎ ‎ ‎ ‎ ‎ ‎ ‎ ‎ ‎ ‎ ‎ ‎ ‎ ‎ ‎ ‎ ‎ ‎ ‎</w:t>
-      </w:r>
-      <w:r>
-        <w:t xml:space="preserve"> </w:t>
-      </w:r>
-    </w:p>
-    <w:p>
-      <w:r>
-        <w:t xml:space="preserve">Civil Status: </w:t>
-      </w:r>
-      <w:r>
-        <w:t>{</w:t>
-      </w:r>
-      <w:proofErr w:type="spellStart"/>
-      <w:proofErr w:type="gramStart"/>
-      <w:r>
-        <w:t>civilStatus</w:t>
-      </w:r>
-      <w:proofErr w:type="spellEnd"/>
-      <w:r>
-        <w:t xml:space="preserve">}   </w:t>
-      </w:r>
-      <w:proofErr w:type="gramEnd"/>
-      <w:r>
-        <w:t xml:space="preserve">                                     </w:t>
-      </w:r>
-      <w:r>
-        <w:t>Religion:</w:t>
-      </w:r>
-      <w:r>
-        <w:rPr>
-          <w:u w:val="single"/>
-        </w:rPr>
-        <w:t xml:space="preserve"> {religion}</w:t>
-      </w:r>
-      <w:r>
-        <w:rPr>
-          <w:u w:val="single"/>
-        </w:rPr>
-        <w:t xml:space="preserve">‎ ‎ ‎ </w:t>
-      </w:r>
-      <w:r>
-        <w:t xml:space="preserve">‎ ‎ ‎ ‎ ‎ ‎ ‎ ‎ ‎ </w:t>
-      </w:r>
-    </w:p>
-    <w:p>
-      <w:r>
-        <w:t>‎</w:t>
-      </w:r>
-      <w:r>
-        <w:t xml:space="preserve"> </w:t>
-      </w:r>
-      <w:r>
-        <w:t>Father’s Name:</w:t>
-      </w:r>
-      <w:r>
-        <w:rPr>
-          <w:spacing w:val="40"/>
-        </w:rPr>
-        <w:t xml:space="preserve"> </w:t>
-      </w:r>
-      <w:r>
-        <w:rPr>
-          <w:u w:val="single"/>
-        </w:rPr>
-        <w:t>{</w:t>
-      </w:r>
-      <w:proofErr w:type="spellStart"/>
-      <w:r>
-        <w:rPr>
-          <w:u w:val="single"/>
-        </w:rPr>
-        <w:t>fatherName</w:t>
-      </w:r>
-      <w:proofErr w:type="spellEnd"/>
-      <w:r>
-        <w:rPr>
-          <w:u w:val="single"/>
-        </w:rPr>
-        <w:t>}</w:t>
-      </w:r>
-      <w:r>
-        <w:tab/>
-      </w:r>
-      <w:r>
-        <w:tab/>
-      </w:r>
-      <w:r>
-        <w:tab/>
-        <w:t xml:space="preserve"> </w:t>
-      </w:r>
-    </w:p>
-    <w:p>
-      <w:r>
-        <w:t>Occupation:</w:t>
-      </w:r>
-      <w:r>
-        <w:rPr>
-          <w:rFonts w:ascii="Courier New" w:hAnsi="Courier New" w:cs="Courier New"/>
-          <w:color w:val="CCCCCC"/>
-          <w:sz w:val="17"/>
-          <w:szCs w:val="17"/>
-        </w:rPr>
-        <w:t xml:space="preserve"> </w:t>
-      </w:r>
-      <w:r>
-        <w:rPr>
-          <w:rFonts w:ascii="Cambria" w:hAnsi="Cambria"/>
-          <w:spacing w:val="40"/>
-          <w:u w:val="single"/>
-        </w:rPr>
-        <w:t>{</w:t>
-      </w:r>
-      <w:proofErr w:type="spellStart"/>
-      <w:r>
-        <w:rPr>
-          <w:rFonts w:ascii="Cambria" w:hAnsi="Cambria"/>
-          <w:spacing w:val="40"/>
-          <w:u w:val="single"/>
-        </w:rPr>
-        <w:t>fatherOccupation</w:t>
-      </w:r>
-      <w:proofErr w:type="spellEnd"/>
-      <w:r>
-        <w:rPr>
-          <w:rFonts w:ascii="Cambria" w:hAnsi="Cambria"/>
-          <w:spacing w:val="40"/>
-          <w:u w:val="single"/>
-        </w:rPr>
-        <w:t>}</w:t>
-      </w:r>
-      <w:r>
-        <w:tab/>
-      </w:r>
-      <w:r>
-        <w:rPr>
-          <w:spacing w:val="80"/>
-        </w:rPr>
-        <w:t xml:space="preserve"> </w:t>
-      </w:r>
-      <w:r>
-        <w:t>Contact No:</w:t>
-      </w:r>
-      <w:r>
-        <w:rPr>
-          <w:spacing w:val="40"/>
-        </w:rPr>
-        <w:t xml:space="preserve"> </w:t>
-      </w:r>
-      <w:r>
-        <w:rPr>
-          <w:u w:val="single"/>
-        </w:rPr>
-        <w:t>{</w:t>
-      </w:r>
-      <w:proofErr w:type="spellStart"/>
-      <w:r>
-        <w:rPr>
-          <w:u w:val="single"/>
-        </w:rPr>
-        <w:t>fatherPhone</w:t>
-      </w:r>
-      <w:proofErr w:type="spellEnd"/>
-      <w:r>
-        <w:rPr>
-          <w:u w:val="single"/>
-        </w:rPr>
-        <w:t>}</w:t>
-      </w:r>
-      <w:r>
-        <w:t xml:space="preserve"> </w:t>
-      </w:r>
-    </w:p>
-    <w:p>
-      <w:r>
-        <w:t>Mother’s Name:</w:t>
-      </w:r>
-      <w:r>
-        <w:rPr>
-          <w:spacing w:val="40"/>
-        </w:rPr>
-        <w:t xml:space="preserve"> </w:t>
-      </w:r>
-      <w:r>
-        <w:rPr>
-          <w:u w:val="single"/>
-        </w:rPr>
-        <w:t>{</w:t>
-      </w:r>
-      <w:proofErr w:type="spellStart"/>
-      <w:r>
-        <w:rPr>
-          <w:u w:val="single"/>
-        </w:rPr>
-        <w:t>motherName</w:t>
-      </w:r>
-      <w:proofErr w:type="spellEnd"/>
-      <w:r>
-        <w:rPr>
-          <w:u w:val="single"/>
-        </w:rPr>
-        <w:t>}</w:t>
-      </w:r>
-      <w:r>
-        <w:tab/>
-      </w:r>
-      <w:r>
-        <w:tab/>
-      </w:r>
-      <w:r>
-        <w:tab/>
-        <w:t xml:space="preserve"> </w:t>
-      </w:r>
-    </w:p>
-    <w:p>
-      <w:r>
-        <w:t>Occupation:</w:t>
-      </w:r>
-      <w:r>
-        <w:rPr>
-          <w:spacing w:val="40"/>
-        </w:rPr>
-        <w:t xml:space="preserve"> </w:t>
-      </w:r>
-      <w:r>
-        <w:rPr>
-          <w:u w:val="single"/>
-        </w:rPr>
-        <w:t>{</w:t>
-      </w:r>
-      <w:proofErr w:type="spellStart"/>
-      <w:r>
-        <w:rPr>
-          <w:u w:val="single"/>
-        </w:rPr>
-        <w:t>motherOccupation</w:t>
-      </w:r>
-      <w:proofErr w:type="spellEnd"/>
-      <w:r>
-        <w:rPr>
-          <w:u w:val="single"/>
-        </w:rPr>
-        <w:t>}</w:t>
-      </w:r>
-      <w:r>
-        <w:tab/>
-      </w:r>
-      <w:r>
-        <w:rPr>
-          <w:spacing w:val="80"/>
-        </w:rPr>
-        <w:t xml:space="preserve"> </w:t>
-      </w:r>
-      <w:r>
-        <w:t>Contact No:</w:t>
-      </w:r>
-      <w:r>
-        <w:rPr>
-          <w:spacing w:val="40"/>
-        </w:rPr>
-        <w:t xml:space="preserve"> </w:t>
-      </w:r>
-      <w:r>
-        <w:rPr>
-          <w:u w:val="single"/>
-        </w:rPr>
-        <w:t>{</w:t>
-      </w:r>
-      <w:proofErr w:type="spellStart"/>
-      <w:r>
-        <w:rPr>
-          <w:u w:val="single"/>
-        </w:rPr>
-        <w:t>motherPhone</w:t>
-      </w:r>
-      <w:proofErr w:type="spellEnd"/>
-      <w:r>
-        <w:rPr>
-          <w:u w:val="single"/>
-        </w:rPr>
-        <w:t>}</w:t>
-      </w:r>
-      <w:r>
-        <w:tab/>
-        <w:t xml:space="preserve"> </w:t>
-      </w:r>
-    </w:p>
-    <w:p>
-      <w:r>
-        <w:t>Guardian’s Name:</w:t>
-      </w:r>
-      <w:r>
-        <w:rPr>
-          <w:spacing w:val="40"/>
-        </w:rPr>
-        <w:t xml:space="preserve"> </w:t>
-      </w:r>
-      <w:r>
-        <w:rPr>
-          <w:u w:val="single"/>
-        </w:rPr>
-        <w:t>{</w:t>
-      </w:r>
-      <w:proofErr w:type="spellStart"/>
-      <w:r>
-        <w:rPr>
-          <w:u w:val="single"/>
-        </w:rPr>
-        <w:t>guardianName</w:t>
-      </w:r>
-      <w:proofErr w:type="spellEnd"/>
-      <w:r>
-        <w:rPr>
-          <w:u w:val="single"/>
-        </w:rPr>
-        <w:t>}</w:t>
-      </w:r>
-      <w:r>
-        <w:tab/>
-      </w:r>
-      <w:r>
-        <w:tab/>
-        <w:t xml:space="preserve"> </w:t>
-      </w:r>
-    </w:p>
-    <w:p>
-      <w:pPr>
-        <w:rPr>
+          <w:rFonts w:ascii="Times New Roman" w:hAnsi="Times New Roman" w:cs="Times New Roman"/>
+        </w:rPr>
+        <w:t>{supervisor}</w:t>
+      </w:r>
+    </w:p>
+    <w:p>
+      <w:pPr>
+        <w:rPr>
+          <w:rFonts w:ascii="Times New Roman" w:hAnsi="Times New Roman" w:cs="Times New Roman"/>
+        </w:rPr>
+      </w:pPr>
+      <w:r>
+        <w:rPr>
+          <w:rFonts w:ascii="Times New Roman" w:hAnsi="Times New Roman" w:cs="Times New Roman"/>
           <w:b/>
           <w:bCs/>
         </w:rPr>
-      </w:pPr>
-      <w:r>
-        <w:t>Relationship with Student Intern:</w:t>
-      </w:r>
-      <w:r>
-        <w:rPr>
-          <w:spacing w:val="40"/>
-        </w:rPr>
-        <w:t xml:space="preserve"> </w:t>
-      </w:r>
-      <w:r>
-        <w:rPr>
-          <w:u w:val="single"/>
-        </w:rPr>
-        <w:t>{</w:t>
-      </w:r>
-      <w:proofErr w:type="spellStart"/>
-      <w:r>
-        <w:rPr>
-          <w:u w:val="single"/>
-        </w:rPr>
-        <w:t>guardianRelationship</w:t>
-      </w:r>
-      <w:proofErr w:type="spellEnd"/>
-      <w:r>
-        <w:rPr>
-          <w:u w:val="single"/>
-        </w:rPr>
-        <w:t>}</w:t>
-      </w:r>
-      <w:r>
-        <w:t xml:space="preserve"> </w:t>
-      </w:r>
-      <w:r>
-        <w:tab/>
-      </w:r>
-      <w:r>
-        <w:t>Contact</w:t>
-      </w:r>
-      <w:r>
-        <w:rPr>
-          <w:spacing w:val="-6"/>
-        </w:rPr>
-        <w:t xml:space="preserve"> </w:t>
-      </w:r>
-      <w:r>
-        <w:t>Number/s:</w:t>
-      </w:r>
-      <w:r>
-        <w:rPr>
-          <w:spacing w:val="-4"/>
-        </w:rPr>
-        <w:t xml:space="preserve"> </w:t>
-      </w:r>
-      <w:r>
-        <w:rPr>
-          <w:u w:val="single"/>
-        </w:rPr>
-        <w:t>{</w:t>
-      </w:r>
-      <w:proofErr w:type="spellStart"/>
-      <w:r>
-        <w:rPr>
-          <w:u w:val="single"/>
-        </w:rPr>
-        <w:t>guardianPhone</w:t>
-      </w:r>
-      <w:proofErr w:type="spellEnd"/>
-      <w:r>
-        <w:rPr>
-          <w:u w:val="single"/>
-        </w:rPr>
-        <w:t>}</w:t>
-      </w:r>
-    </w:p>
-    <w:p>
-      <w:pPr>
-        <w:rPr>
-          <w:rFonts w:ascii="Cambria" w:hAnsi="Cambria" w:cs="Times New Roman"/>
+        <w:t xml:space="preserve">Contact No/s of Point/Focal </w:t>
+      </w:r>
+      <w:r>
+        <w:rPr>
+          <w:rFonts w:ascii="Times New Roman" w:hAnsi="Times New Roman" w:cs="Times New Roman"/>
           <w:b/>
           <w:bCs/>
         </w:rPr>
-      </w:pPr>
-    </w:p>
-    <w:p>
-      <w:pPr>
+        <w:t>Person</w:t>
+      </w:r>
+      <w:r>
         <w:rPr>
           <w:rFonts w:ascii="Times New Roman" w:hAnsi="Times New Roman" w:cs="Times New Roman"/>
-          <w:b/>
-          <w:bCs/>
-        </w:rPr>
-      </w:pPr>
-    </w:p>
-    <w:p>
-      <w:pPr>
+        </w:rPr>
+        <w:t>:</w:t>
+      </w:r>
+      <w:r>
         <w:rPr>
           <w:rFonts w:ascii="Times New Roman" w:hAnsi="Times New Roman" w:cs="Times New Roman"/>
-          <w:b/>
-          <w:bCs/>
-        </w:rPr>
-      </w:pPr>
-    </w:p>
-    <w:p>
-      <w:pPr>
-        <w:rPr>
-          <w:rFonts w:ascii="Times New Roman" w:hAnsi="Times New Roman" w:cs="Times New Roman"/>
-          <w:b/>
-          <w:bCs/>
-        </w:rPr>
-      </w:pPr>
-    </w:p>
-    <w:p>
-      <w:pPr>
-        <w:rPr>
-          <w:rFonts w:ascii="Times New Roman" w:hAnsi="Times New Roman" w:cs="Times New Roman"/>
-          <w:b/>
-          <w:bCs/>
-        </w:rPr>
-      </w:pPr>
-      <w:r>
-        <w:rPr>
-          <w:rFonts w:ascii="Times New Roman" w:hAnsi="Times New Roman" w:cs="Times New Roman"/>
-          <w:b/>
-          <w:bCs/>
-        </w:rPr>
-        <w:br/>
-      </w:r>
-    </w:p>
-    <w:p>
-      <w:pPr>
-        <w:rPr>
-          <w:rFonts w:ascii="Times New Roman" w:hAnsi="Times New Roman" w:cs="Times New Roman"/>
-          <w:b/>
-          <w:bCs/>
-        </w:rPr>
-      </w:pPr>
-    </w:p>
-    <w:p>
-      <w:pPr>
-        <w:rPr>
-          <w:rFonts w:ascii="Times New Roman" w:hAnsi="Times New Roman" w:cs="Times New Roman"/>
-          <w:b/>
-          <w:bCs/>
-        </w:rPr>
-      </w:pPr>
-    </w:p>
-    <w:p>
-      <w:pPr>
-        <w:rPr>
-          <w:rFonts w:ascii="Times New Roman" w:hAnsi="Times New Roman" w:cs="Times New Roman"/>
-          <w:b/>
-          <w:bCs/>
-        </w:rPr>
-      </w:pPr>
-    </w:p>
-    <w:p>
-      <w:pPr>
-        <w:rPr>
-          <w:rFonts w:ascii="Times New Roman" w:hAnsi="Times New Roman" w:cs="Times New Roman"/>
-          <w:b/>
-          <w:bCs/>
-        </w:rPr>
-      </w:pPr>
-    </w:p>
-    <w:p>
-      <w:pPr>
-        <w:rPr>
-          <w:rFonts w:ascii="Times New Roman" w:hAnsi="Times New Roman" w:cs="Times New Roman"/>
-          <w:b/>
-          <w:bCs/>
-        </w:rPr>
-      </w:pPr>
-    </w:p>
-    <w:p>
-      <w:pPr>
-        <w:rPr>
-          <w:rFonts w:ascii="Times New Roman" w:hAnsi="Times New Roman" w:cs="Times New Roman"/>
-          <w:b/>
-          <w:bCs/>
-        </w:rPr>
-      </w:pPr>
-    </w:p>
-    <w:p>
-      <w:pPr>
-        <w:rPr>
-          <w:rFonts w:ascii="Times New Roman" w:hAnsi="Times New Roman" w:cs="Times New Roman"/>
-          <w:b/>
-          <w:bCs/>
-        </w:rPr>
-      </w:pPr>
-    </w:p>
-    <w:p>
-      <w:pPr>
-        <w:rPr>
-          <w:rFonts w:ascii="Times New Roman" w:hAnsi="Times New Roman" w:cs="Times New Roman"/>
-          <w:b/>
-          <w:bCs/>
-        </w:rPr>
-      </w:pPr>
-      <w:r>
-        <w:rPr>
-          <w:rFonts w:ascii="Times New Roman" w:hAnsi="Times New Roman" w:cs="Times New Roman"/>
-          <w:b/>
-          <w:bCs/>
-        </w:rPr>
-        <w:t>BRIEF BACKGROUND OF THE HOST TRAINING ESTABLISHMENT</w:t>
-      </w:r>
-    </w:p>
-    <w:p>
-      <w:pPr>
-        <w:rPr>
-          <w:rFonts w:ascii="Times New Roman" w:hAnsi="Times New Roman" w:cs="Times New Roman"/>
-        </w:rPr>
-      </w:pPr>
-      <w:r>
-        <w:rPr>
-          <w:rFonts w:ascii="Times New Roman" w:hAnsi="Times New Roman" w:cs="Times New Roman"/>
-          <w:b/>
-          <w:bCs/>
-        </w:rPr>
-        <w:t>Name of HTE:</w:t>
-      </w:r>
-      <w:r>
-        <w:rPr>
-          <w:rFonts w:ascii="Times New Roman" w:hAnsi="Times New Roman" w:cs="Times New Roman"/>
-        </w:rPr>
-        <w:t xml:space="preserve"> </w:t>
-      </w:r>
-      <w:r>
-        <w:rPr>
-          <w:rFonts w:ascii="Times New Roman" w:hAnsi="Times New Roman" w:cs="Times New Roman"/>
-        </w:rPr>
-        <w:t>{company}</w:t>
-      </w:r>
-    </w:p>
-    <w:p>
-      <w:pPr>
-        <w:rPr>
-          <w:rFonts w:ascii="Times New Roman" w:hAnsi="Times New Roman" w:cs="Times New Roman"/>
-        </w:rPr>
-      </w:pPr>
-      <w:r>
-        <w:rPr>
-          <w:rFonts w:ascii="Times New Roman" w:hAnsi="Times New Roman" w:cs="Times New Roman"/>
-          <w:b/>
-          <w:bCs/>
-        </w:rPr>
-        <w:t>HTE Address</w:t>
-      </w:r>
-      <w:r>
-        <w:rPr>
-          <w:rFonts w:ascii="Times New Roman" w:hAnsi="Times New Roman" w:cs="Times New Roman"/>
-        </w:rPr>
-        <w:t xml:space="preserve">: </w:t>
-      </w:r>
-      <w:r>
-        <w:rPr>
-          <w:rFonts w:ascii="Times New Roman" w:hAnsi="Times New Roman" w:cs="Times New Roman"/>
-        </w:rPr>
-        <w:t>{</w:t>
-      </w:r>
-      <w:proofErr w:type="spellStart"/>
-      <w:r>
-        <w:rPr>
-          <w:rFonts w:ascii="Times New Roman" w:hAnsi="Times New Roman" w:cs="Times New Roman"/>
-        </w:rPr>
-        <w:t>companyAddress</w:t>
-      </w:r>
-      <w:proofErr w:type="spellEnd"/>
-      <w:r>
-        <w:rPr>
-          <w:rFonts w:ascii="Times New Roman" w:hAnsi="Times New Roman" w:cs="Times New Roman"/>
-        </w:rPr>
-        <w:t>}</w:t>
-      </w:r>
-    </w:p>
-    <w:p>
-      <w:pPr>
-        <w:rPr>
-          <w:rFonts w:ascii="Times New Roman" w:hAnsi="Times New Roman" w:cs="Times New Roman"/>
-        </w:rPr>
-      </w:pPr>
-      <w:r>
-        <w:rPr>
-          <w:rFonts w:ascii="Times New Roman" w:hAnsi="Times New Roman" w:cs="Times New Roman"/>
-          <w:b/>
-          <w:bCs/>
-        </w:rPr>
-        <w:t>HTE Point/Focal Person:</w:t>
-      </w:r>
-      <w:r>
-        <w:rPr>
-          <w:rFonts w:ascii="Times New Roman" w:hAnsi="Times New Roman" w:cs="Times New Roman"/>
-        </w:rPr>
-        <w:t xml:space="preserve"> </w:t>
-      </w:r>
-      <w:r>
-        <w:rPr>
-          <w:rFonts w:ascii="Times New Roman" w:hAnsi="Times New Roman" w:cs="Times New Roman"/>
-        </w:rPr>
-        <w:t>{supervisor}</w:t>
-      </w:r>
-    </w:p>
-    <w:p>
-      <w:pPr>
-        <w:rPr>
-          <w:rFonts w:ascii="Times New Roman" w:hAnsi="Times New Roman" w:cs="Times New Roman"/>
-        </w:rPr>
-      </w:pPr>
-      <w:r>
-        <w:rPr>
-          <w:rFonts w:ascii="Times New Roman" w:hAnsi="Times New Roman" w:cs="Times New Roman"/>
-          <w:b/>
-          <w:bCs/>
-        </w:rPr>
-        <w:t xml:space="preserve">Contact No/s of Point/Focal </w:t>
-      </w:r>
-      <w:r>
-        <w:rPr>
-          <w:rFonts w:ascii="Times New Roman" w:hAnsi="Times New Roman" w:cs="Times New Roman"/>
-          <w:b/>
-          <w:bCs/>
-        </w:rPr>
-        <w:t>Person</w:t>
-      </w:r>
-      <w:r>
-        <w:rPr>
-          <w:rFonts w:ascii="Times New Roman" w:hAnsi="Times New Roman" w:cs="Times New Roman"/>
-        </w:rPr>
-        <w:t>:</w:t>
-      </w:r>
-      <w:r>
-        <w:rPr>
-          <w:rFonts w:ascii="Times New Roman" w:hAnsi="Times New Roman" w:cs="Times New Roman"/>
-        </w:rPr>
-        <w:t xml:space="preserve"> {</w:t>
-      </w:r>
-      <w:proofErr w:type="spellStart"/>
-      <w:r>
-        <w:rPr>
-          <w:rFonts w:ascii="Times New Roman" w:hAnsi="Times New Roman" w:cs="Times New Roman"/>
-        </w:rPr>
-        <w:t>supervisorContact</w:t>
-      </w:r>
-      <w:proofErr w:type="spellEnd"/>
-      <w:r>
-        <w:rPr>
-          <w:rFonts w:ascii="Times New Roman" w:hAnsi="Times New Roman" w:cs="Times New Roman"/>
-        </w:rPr>
-        <w:t>}</w:t>
+        </w:rPr>
+        <w:t xml:space="preserve"> {supervisorContact}</w:t>
       </w:r>
     </w:p>
     <w:p>
@@ -1595,7 +1681,6 @@
     <w:tbl>
       <w:tblPr>
         <w:tblW w:w="0" w:type="auto"/>
-        <w:tblInd w:w="41" w:type="dxa"/>
         <w:tblBorders>
           <w:top w:val="single" w:sz="4" w:space="0" w:color="000000"/>
           <w:left w:val="single" w:sz="4" w:space="0" w:color="000000"/>
@@ -1619,30 +1704,18 @@
       </w:tblGrid>
       <w:tr>
         <w:trPr>
-          <w:trHeight w:val="494"/>
+          <w:trHeight w:val="719"/>
         </w:trPr>
         <w:tc>
           <w:tcPr>
             <w:tcW w:w="1601" w:type="dxa"/>
+            <w:vAlign w:val="center"/>
           </w:tcPr>
           <w:p>
             <w:pPr>
               <w:pStyle w:val="TableParagraph"/>
               <w:spacing w:line="229" w:lineRule="exact"/>
-              <w:ind w:left="5" w:right="326"/>
-              <w:jc w:val="center"/>
-              <w:rPr>
-                <w:b/>
-                <w:spacing w:val="-5"/>
-                <w:sz w:val="20"/>
-              </w:rPr>
-            </w:pPr>
-          </w:p>
-          <w:p>
-            <w:pPr>
-              <w:pStyle w:val="TableParagraph"/>
-              <w:spacing w:line="229" w:lineRule="exact"/>
-              <w:ind w:left="5" w:right="326"/>
+              <w:ind w:right="326"/>
               <w:jc w:val="center"/>
               <w:rPr>
                 <w:b/>
@@ -1662,6 +1735,7 @@
         <w:tc>
           <w:tcPr>
             <w:tcW w:w="1476" w:type="dxa"/>
+            <w:vAlign w:val="center"/>
           </w:tcPr>
           <w:p>
             <w:pPr>
@@ -1671,19 +1745,6 @@
               <w:jc w:val="center"/>
               <w:rPr>
                 <w:b/>
-                <w:spacing w:val="-4"/>
-                <w:sz w:val="20"/>
-              </w:rPr>
-            </w:pPr>
-          </w:p>
-          <w:p>
-            <w:pPr>
-              <w:pStyle w:val="TableParagraph"/>
-              <w:spacing w:line="229" w:lineRule="exact"/>
-              <w:ind w:right="322"/>
-              <w:jc w:val="center"/>
-              <w:rPr>
-                <w:b/>
                 <w:sz w:val="20"/>
               </w:rPr>
             </w:pPr>
@@ -1700,24 +1761,13 @@
         <w:tc>
           <w:tcPr>
             <w:tcW w:w="3077" w:type="dxa"/>
+            <w:vAlign w:val="center"/>
           </w:tcPr>
           <w:p>
             <w:pPr>
               <w:pStyle w:val="TableParagraph"/>
               <w:spacing w:line="229" w:lineRule="exact"/>
-              <w:ind w:left="107"/>
-              <w:rPr>
-                <w:b/>
-                <w:spacing w:val="-2"/>
-                <w:sz w:val="20"/>
-              </w:rPr>
-            </w:pPr>
-          </w:p>
-          <w:p>
-            <w:pPr>
-              <w:pStyle w:val="TableParagraph"/>
-              <w:spacing w:line="229" w:lineRule="exact"/>
-              <w:ind w:left="107"/>
+              <w:jc w:val="center"/>
               <w:rPr>
                 <w:b/>
                 <w:sz w:val="20"/>
@@ -1752,23 +1802,13 @@
         <w:tc>
           <w:tcPr>
             <w:tcW w:w="2316" w:type="dxa"/>
+            <w:vAlign w:val="center"/>
           </w:tcPr>
           <w:p>
             <w:pPr>
               <w:pStyle w:val="TableParagraph"/>
               <w:spacing w:line="229" w:lineRule="exact"/>
-              <w:ind w:left="107"/>
-              <w:rPr>
-                <w:b/>
-                <w:sz w:val="20"/>
-              </w:rPr>
-            </w:pPr>
-          </w:p>
-          <w:p>
-            <w:pPr>
-              <w:pStyle w:val="TableParagraph"/>
-              <w:spacing w:line="229" w:lineRule="exact"/>
-              <w:ind w:left="107"/>
+              <w:jc w:val="center"/>
               <w:rPr>
                 <w:b/>
                 <w:sz w:val="20"/>
@@ -1807,22 +1847,25 @@
         <w:tc>
           <w:tcPr>
             <w:tcW w:w="1601" w:type="dxa"/>
+            <w:vAlign w:val="center"/>
           </w:tcPr>
           <w:p>
             <w:pPr>
               <w:pStyle w:val="TableParagraph"/>
-              <w:rPr>
+              <w:ind w:right="326"/>
+              <w:jc w:val="center"/>
+              <w:rPr>
+                <w:spacing w:val="-2"/>
                 <w:sz w:val="20"/>
               </w:rPr>
             </w:pPr>
-          </w:p>
-          <w:p>
-            <w:pPr>
-              <w:pStyle w:val="TableParagraph"/>
-              <w:rPr>
+            <w:r>
+              <w:rPr>
+                <w:spacing w:val="-2"/>
                 <w:sz w:val="20"/>
               </w:rPr>
-            </w:pPr>
+              <w:t>{#entries}</w:t>
+            </w:r>
           </w:p>
           <w:p>
             <w:pPr>
@@ -1830,24 +1873,6 @@
               <w:ind w:left="3" w:right="326"/>
               <w:jc w:val="center"/>
               <w:rPr>
-                <w:spacing w:val="-2"/>
-                <w:sz w:val="20"/>
-              </w:rPr>
-            </w:pPr>
-            <w:r>
-              <w:rPr>
-                <w:spacing w:val="-2"/>
-                <w:sz w:val="20"/>
-              </w:rPr>
-              <w:t>{#entries}</w:t>
-            </w:r>
-          </w:p>
-          <w:p>
-            <w:pPr>
-              <w:pStyle w:val="TableParagraph"/>
-              <w:ind w:left="3" w:right="326"/>
-              <w:jc w:val="center"/>
-              <w:rPr>
                 <w:sz w:val="20"/>
               </w:rPr>
             </w:pPr>
@@ -1862,27 +1887,12 @@
         <w:tc>
           <w:tcPr>
             <w:tcW w:w="1476" w:type="dxa"/>
+            <w:vAlign w:val="center"/>
           </w:tcPr>
           <w:p>
             <w:pPr>
               <w:pStyle w:val="TableParagraph"/>
-              <w:rPr>
-                <w:sz w:val="20"/>
-              </w:rPr>
-            </w:pPr>
-          </w:p>
-          <w:p>
-            <w:pPr>
-              <w:pStyle w:val="TableParagraph"/>
-              <w:rPr>
-                <w:sz w:val="20"/>
-              </w:rPr>
-            </w:pPr>
-          </w:p>
-          <w:p>
-            <w:pPr>
-              <w:pStyle w:val="TableParagraph"/>
-              <w:ind w:left="5" w:right="322"/>
+              <w:ind w:right="322"/>
               <w:jc w:val="center"/>
               <w:rPr>
                 <w:sz w:val="20"/>
@@ -1900,22 +1910,16 @@
         <w:tc>
           <w:tcPr>
             <w:tcW w:w="3077" w:type="dxa"/>
+            <w:vAlign w:val="center"/>
           </w:tcPr>
-          <w:p>
-            <w:pPr>
-              <w:pStyle w:val="TableParagraph"/>
-              <w:rPr>
-                <w:sz w:val="20"/>
-              </w:rPr>
-            </w:pPr>
-          </w:p>
           <w:p>
             <w:pPr>
               <w:pStyle w:val="TableParagraph"/>
               <w:tabs>
                 <w:tab w:val="left" w:pos="828"/>
               </w:tabs>
-              <w:ind w:left="467" w:right="893"/>
+              <w:ind w:right="893"/>
+              <w:jc w:val="center"/>
               <w:rPr>
                 <w:sz w:val="20"/>
               </w:rPr>
@@ -1931,10 +1935,12 @@
         <w:tc>
           <w:tcPr>
             <w:tcW w:w="2316" w:type="dxa"/>
+            <w:vAlign w:val="center"/>
           </w:tcPr>
           <w:p>
             <w:pPr>
               <w:pStyle w:val="TableParagraph"/>
+              <w:jc w:val="center"/>
               <w:rPr>
                 <w:sz w:val="20"/>
               </w:rPr>
@@ -1943,30 +1949,23 @@
           <w:p>
             <w:pPr>
               <w:pStyle w:val="TableParagraph"/>
+              <w:jc w:val="center"/>
               <w:rPr>
                 <w:sz w:val="20"/>
               </w:rPr>
             </w:pPr>
+            <w:r>
+              <w:rPr>
+                <w:sz w:val="20"/>
+              </w:rPr>
+              <w:t>{hours}</w:t>
+            </w:r>
           </w:p>
           <w:p>
             <w:pPr>
               <w:pStyle w:val="TableParagraph"/>
               <w:ind w:left="643"/>
-              <w:rPr>
-                <w:sz w:val="20"/>
-              </w:rPr>
-            </w:pPr>
-            <w:r>
-              <w:rPr>
-                <w:sz w:val="20"/>
-              </w:rPr>
-              <w:t>{hours}</w:t>
-            </w:r>
-          </w:p>
-          <w:p>
-            <w:pPr>
-              <w:pStyle w:val="TableParagraph"/>
-              <w:ind w:left="643"/>
+              <w:jc w:val="center"/>
               <w:rPr>
                 <w:sz w:val="20"/>
               </w:rPr>
@@ -2034,29 +2033,13 @@
           <w:sz w:val="28"/>
           <w:u w:val="single"/>
         </w:rPr>
-        <w:t>{</w:t>
-      </w:r>
-      <w:proofErr w:type="spellStart"/>
+        <w:t>{totalHours}</w:t>
+      </w:r>
       <w:r>
         <w:rPr>
           <w:sz w:val="28"/>
           <w:u w:val="single"/>
         </w:rPr>
-        <w:t>totalHours</w:t>
-      </w:r>
-      <w:proofErr w:type="spellEnd"/>
-      <w:r>
-        <w:rPr>
-          <w:sz w:val="28"/>
-          <w:u w:val="single"/>
-        </w:rPr>
-        <w:t>}</w:t>
-      </w:r>
-      <w:r>
-        <w:rPr>
-          <w:sz w:val="28"/>
-          <w:u w:val="single"/>
-        </w:rPr>
         <w:t>‎ ‎ ‎ ‎ ‎ ‎ ‎ ‎‎‎‎‎‎‎‎‎‎‎‎‎‎‎‎‎‎‎</w:t>
       </w:r>
     </w:p>
@@ -2084,161 +2067,205 @@
         </w:rPr>
       </w:pPr>
     </w:p>
-    <w:p>
-      <w:pPr>
-        <w:tabs>
-          <w:tab w:val="left" w:pos="952"/>
-          <w:tab w:val="left" w:pos="3833"/>
-          <w:tab w:val="left" w:pos="4553"/>
-          <w:tab w:val="left" w:pos="5273"/>
-          <w:tab w:val="left" w:pos="8153"/>
-        </w:tabs>
-        <w:spacing w:before="1"/>
-        <w:ind w:left="292"/>
-        <w:rPr>
-          <w:sz w:val="28"/>
-        </w:rPr>
-      </w:pPr>
-      <w:r>
-        <w:rPr>
-          <w:sz w:val="28"/>
-          <w:u w:val="single"/>
-        </w:rPr>
-        <w:t xml:space="preserve">            {</w:t>
-      </w:r>
-      <w:proofErr w:type="spellStart"/>
-      <w:proofErr w:type="gramStart"/>
-      <w:r>
-        <w:rPr>
-          <w:sz w:val="28"/>
-          <w:u w:val="single"/>
-        </w:rPr>
-        <w:t>studentname</w:t>
-      </w:r>
-      <w:proofErr w:type="spellEnd"/>
-      <w:r>
-        <w:rPr>
-          <w:sz w:val="28"/>
-          <w:u w:val="single"/>
-        </w:rPr>
-        <w:t>}</w:t>
-      </w:r>
-      <w:r>
-        <w:rPr>
-          <w:sz w:val="28"/>
-          <w:u w:val="single"/>
-        </w:rPr>
-        <w:t xml:space="preserve">   </w:t>
-      </w:r>
-      <w:proofErr w:type="gramEnd"/>
-      <w:r>
-        <w:rPr>
-          <w:sz w:val="28"/>
-          <w:u w:val="single"/>
-        </w:rPr>
-        <w:t xml:space="preserve">          </w:t>
-      </w:r>
-      <w:r>
-        <w:rPr>
-          <w:sz w:val="28"/>
-        </w:rPr>
-        <w:t xml:space="preserve">     </w:t>
-      </w:r>
-      <w:r>
-        <w:rPr>
-          <w:sz w:val="28"/>
-        </w:rPr>
-        <w:tab/>
-      </w:r>
-      <w:r>
-        <w:rPr>
-          <w:sz w:val="28"/>
-        </w:rPr>
-        <w:t xml:space="preserve">        </w:t>
-      </w:r>
-      <w:r>
-        <w:rPr>
-          <w:sz w:val="28"/>
-          <w:u w:val="single"/>
-        </w:rPr>
-        <w:t xml:space="preserve">          </w:t>
-      </w:r>
-      <w:r>
-        <w:rPr>
-          <w:sz w:val="28"/>
-          <w:u w:val="single"/>
-        </w:rPr>
-        <w:t xml:space="preserve">        </w:t>
-      </w:r>
-      <w:r>
-        <w:rPr>
-          <w:sz w:val="28"/>
-          <w:u w:val="single"/>
-        </w:rPr>
-        <w:t xml:space="preserve"> </w:t>
-      </w:r>
-      <w:r>
-        <w:rPr>
-          <w:rFonts w:cstheme="minorHAnsi"/>
-          <w:sz w:val="28"/>
-          <w:szCs w:val="28"/>
-          <w:u w:val="single"/>
-        </w:rPr>
-        <w:t>{superviso</w:t>
-      </w:r>
-      <w:r>
-        <w:rPr>
-          <w:rFonts w:cstheme="minorHAnsi"/>
-          <w:sz w:val="28"/>
-          <w:szCs w:val="28"/>
-          <w:u w:val="single"/>
-        </w:rPr>
-        <w:t>r</w:t>
-      </w:r>
-      <w:r>
-        <w:rPr>
-          <w:rFonts w:cstheme="minorHAnsi"/>
-          <w:sz w:val="28"/>
-          <w:szCs w:val="28"/>
-          <w:u w:val="single"/>
-        </w:rPr>
-        <w:t>}</w:t>
-      </w:r>
-      <w:r>
-        <w:rPr>
-          <w:rFonts w:cstheme="minorHAnsi"/>
-          <w:sz w:val="28"/>
-          <w:szCs w:val="28"/>
-          <w:u w:val="single"/>
-        </w:rPr>
-        <w:t xml:space="preserve">‎‎ ‎ ‎ ‎ ‎ ‎ ‎ ‎ ‎ ‎ ‎ ‎ ‎ ‎ ‎ ‎ ‎ </w:t>
-      </w:r>
-      <w:r>
-        <w:rPr>
-          <w:sz w:val="28"/>
-          <w:u w:val="single"/>
-        </w:rPr>
-        <w:t xml:space="preserve">             </w:t>
-      </w:r>
-      <w:r>
-        <w:rPr>
-          <w:rFonts w:cstheme="minorHAnsi"/>
-          <w:sz w:val="28"/>
-          <w:szCs w:val="28"/>
-          <w:u w:val="single"/>
-        </w:rPr>
-        <w:t xml:space="preserve">   </w:t>
-      </w:r>
-      <w:r>
-        <w:rPr>
-          <w:rFonts w:cstheme="minorHAnsi"/>
-          <w:sz w:val="28"/>
-          <w:szCs w:val="28"/>
-          <w:u w:val="single"/>
-        </w:rPr>
-        <w:t xml:space="preserve">                    </w:t>
-      </w:r>
-    </w:p>
+    <w:tbl>
+      <w:tblPr>
+        <w:tblStyle w:val="TableGrid"/>
+        <w:tblW w:w="0" w:type="auto"/>
+        <w:tblBorders>
+          <w:top w:val="none" w:sz="0" w:space="0" w:color="auto"/>
+          <w:left w:val="none" w:sz="0" w:space="0" w:color="auto"/>
+          <w:bottom w:val="none" w:sz="0" w:space="0" w:color="auto"/>
+          <w:right w:val="none" w:sz="0" w:space="0" w:color="auto"/>
+          <w:insideH w:val="none" w:sz="0" w:space="0" w:color="auto"/>
+          <w:insideV w:val="none" w:sz="0" w:space="0" w:color="auto"/>
+        </w:tblBorders>
+        <w:tblLook w:val="04A0" w:firstRow="1" w:lastRow="0" w:firstColumn="1" w:lastColumn="0" w:noHBand="0" w:noVBand="1"/>
+      </w:tblPr>
+      <w:tblGrid>
+        <w:gridCol w:w="4675"/>
+        <w:gridCol w:w="4675"/>
+      </w:tblGrid>
+      <w:tr>
+        <w:trPr>
+          <w:trHeight w:val="737"/>
+        </w:trPr>
+        <w:tc>
+          <w:tcPr>
+            <w:tcW w:w="4675" w:type="dxa"/>
+          </w:tcPr>
+          <w:p>
+            <w:pPr>
+              <w:pStyle w:val="BodyText"/>
+              <w:spacing w:before="321"/>
+              <w:jc w:val="center"/>
+              <w:rPr>
+                <w:sz w:val="28"/>
+              </w:rPr>
+            </w:pPr>
+            <w:r>
+              <w:rPr>
+                <w:sz w:val="28"/>
+                <w:u w:val="single"/>
+              </w:rPr>
+              <w:t xml:space="preserve">         </w:t>
+            </w:r>
+            <w:r>
+              <w:rPr>
+                <w:sz w:val="28"/>
+                <w:u w:val="single"/>
+              </w:rPr>
+              <w:t>{studentname}</w:t>
+            </w:r>
+            <w:r>
+              <w:rPr>
+                <w:sz w:val="28"/>
+                <w:u w:val="single"/>
+              </w:rPr>
+              <w:t xml:space="preserve">______                  </w:t>
+            </w:r>
+          </w:p>
+        </w:tc>
+        <w:tc>
+          <w:tcPr>
+            <w:tcW w:w="4675" w:type="dxa"/>
+          </w:tcPr>
+          <w:p>
+            <w:pPr>
+              <w:pStyle w:val="BodyText"/>
+              <w:spacing w:before="321"/>
+              <w:jc w:val="center"/>
+              <w:rPr>
+                <w:sz w:val="28"/>
+              </w:rPr>
+            </w:pPr>
+            <w:r>
+              <w:rPr>
+                <w:rFonts w:cstheme="minorHAnsi"/>
+                <w:sz w:val="28"/>
+                <w:szCs w:val="28"/>
+                <w:u w:val="single"/>
+              </w:rPr>
+              <w:t xml:space="preserve">             </w:t>
+            </w:r>
+            <w:r>
+              <w:rPr>
+                <w:rFonts w:cstheme="minorHAnsi"/>
+                <w:sz w:val="28"/>
+                <w:szCs w:val="28"/>
+                <w:u w:val="single"/>
+              </w:rPr>
+              <w:t>{superviso</w:t>
+            </w:r>
+            <w:r>
+              <w:rPr>
+                <w:rFonts w:cstheme="minorHAnsi"/>
+                <w:sz w:val="28"/>
+                <w:szCs w:val="28"/>
+                <w:u w:val="single"/>
+              </w:rPr>
+              <w:t>r</w:t>
+            </w:r>
+            <w:r>
+              <w:rPr>
+                <w:rFonts w:cstheme="minorHAnsi"/>
+                <w:sz w:val="28"/>
+                <w:szCs w:val="28"/>
+                <w:u w:val="single"/>
+              </w:rPr>
+              <w:t>}‎‎ ‎ ‎ ‎ ‎ ‎ ‎ ‎ ‎ ‎ ‎ ‎ ‎ ‎ ‎ ‎ ‎</w:t>
+            </w:r>
+          </w:p>
+        </w:tc>
+      </w:tr>
+      <w:tr>
+        <w:trPr>
+          <w:trHeight w:val="899"/>
+        </w:trPr>
+        <w:tc>
+          <w:tcPr>
+            <w:tcW w:w="4675" w:type="dxa"/>
+          </w:tcPr>
+          <w:p>
+            <w:pPr>
+              <w:pStyle w:val="BodyText"/>
+              <w:spacing w:before="321"/>
+              <w:jc w:val="center"/>
+            </w:pPr>
+            <w:r>
+              <w:t>Student Intern</w:t>
+            </w:r>
+          </w:p>
+          <w:p>
+            <w:pPr>
+              <w:pStyle w:val="BodyText"/>
+              <w:spacing w:before="321"/>
+              <w:jc w:val="center"/>
+              <w:rPr>
+                <w:sz w:val="28"/>
+              </w:rPr>
+            </w:pPr>
+            <w:r>
+              <w:t>Printed Name</w:t>
+            </w:r>
+          </w:p>
+        </w:tc>
+        <w:tc>
+          <w:tcPr>
+            <w:tcW w:w="4675" w:type="dxa"/>
+          </w:tcPr>
+          <w:p>
+            <w:pPr>
+              <w:pStyle w:val="BodyText"/>
+              <w:spacing w:before="321"/>
+              <w:jc w:val="center"/>
+            </w:pPr>
+            <w:r>
+              <w:t>HTE Point/Focal Person</w:t>
+            </w:r>
+          </w:p>
+          <w:p>
+            <w:pPr>
+              <w:pStyle w:val="BodyText"/>
+              <w:spacing w:before="321"/>
+              <w:jc w:val="center"/>
+              <w:rPr>
+                <w:sz w:val="28"/>
+              </w:rPr>
+            </w:pPr>
+            <w:r>
+              <w:t>Signature</w:t>
+            </w:r>
+            <w:r>
+              <w:rPr>
+                <w:spacing w:val="-14"/>
+              </w:rPr>
+              <w:t xml:space="preserve"> </w:t>
+            </w:r>
+            <w:r>
+              <w:t>over</w:t>
+            </w:r>
+            <w:r>
+              <w:rPr>
+                <w:spacing w:val="-12"/>
+              </w:rPr>
+              <w:t xml:space="preserve"> </w:t>
+            </w:r>
+            <w:r>
+              <w:t>Printed</w:t>
+            </w:r>
+            <w:r>
+              <w:rPr>
+                <w:spacing w:val="-14"/>
+              </w:rPr>
+              <w:t xml:space="preserve"> </w:t>
+            </w:r>
+            <w:r>
+              <w:t>Name</w:t>
+            </w:r>
+          </w:p>
+        </w:tc>
+      </w:tr>
+    </w:tbl>
     <w:p>
       <w:pPr>
         <w:pStyle w:val="BodyText"/>
@@ -2247,18 +2274,11 @@
           <w:tab w:val="left" w:pos="5633"/>
         </w:tabs>
         <w:spacing w:before="37" w:line="247" w:lineRule="auto"/>
-        <w:ind w:left="720" w:right="659" w:hanging="516"/>
-        <w:jc w:val="center"/>
-      </w:pPr>
-      <w:r>
-        <w:t xml:space="preserve">     Student Intern</w:t>
-      </w:r>
-      <w:r>
-        <w:tab/>
-      </w:r>
-      <w:r>
-        <w:t xml:space="preserve">HTE Point/Focal Person </w:t>
-      </w:r>
+        <w:ind w:right="659"/>
+        <w:rPr>
+          <w:spacing w:val="-2"/>
+        </w:rPr>
+      </w:pPr>
     </w:p>
     <w:p>
       <w:pPr>
@@ -2268,58 +2288,7 @@
           <w:tab w:val="left" w:pos="5633"/>
         </w:tabs>
         <w:spacing w:before="37" w:line="247" w:lineRule="auto"/>
-        <w:ind w:left="720" w:right="659" w:hanging="516"/>
-        <w:jc w:val="center"/>
-      </w:pPr>
-      <w:r>
-        <w:tab/>
-      </w:r>
-      <w:r>
-        <w:t>Printed Name</w:t>
-      </w:r>
-      <w:r>
-        <w:tab/>
-        <w:t>Signature</w:t>
-      </w:r>
-      <w:r>
-        <w:rPr>
-          <w:spacing w:val="-14"/>
-        </w:rPr>
-        <w:t xml:space="preserve"> </w:t>
-      </w:r>
-      <w:proofErr w:type="gramStart"/>
-      <w:r>
-        <w:t>over</w:t>
-      </w:r>
-      <w:proofErr w:type="gramEnd"/>
-      <w:r>
-        <w:rPr>
-          <w:spacing w:val="-12"/>
-        </w:rPr>
-        <w:t xml:space="preserve"> </w:t>
-      </w:r>
-      <w:r>
-        <w:t>Printed</w:t>
-      </w:r>
-      <w:r>
-        <w:rPr>
-          <w:spacing w:val="-14"/>
-        </w:rPr>
-        <w:t xml:space="preserve"> </w:t>
-      </w:r>
-      <w:r>
-        <w:t>Name</w:t>
-      </w:r>
-    </w:p>
-    <w:p>
-      <w:pPr>
-        <w:pStyle w:val="BodyText"/>
-        <w:tabs>
-          <w:tab w:val="left" w:pos="4982"/>
-          <w:tab w:val="left" w:pos="5633"/>
-        </w:tabs>
-        <w:spacing w:before="37" w:line="247" w:lineRule="auto"/>
-        <w:ind w:left="720" w:right="659" w:hanging="516"/>
+        <w:ind w:right="659"/>
       </w:pPr>
       <w:r>
         <w:rPr>
@@ -2377,23 +2346,13 @@
         </w:rPr>
         <w:t>{%</w:t>
       </w:r>
-      <w:proofErr w:type="spellStart"/>
       <w:r>
         <w:rPr>
           <w:rFonts w:cstheme="minorHAnsi"/>
           <w:sz w:val="24"/>
           <w:szCs w:val="24"/>
         </w:rPr>
-        <w:t>journalEntriesImages</w:t>
-      </w:r>
-      <w:proofErr w:type="spellEnd"/>
-      <w:r>
-        <w:rPr>
-          <w:rFonts w:cstheme="minorHAnsi"/>
-          <w:sz w:val="24"/>
-          <w:szCs w:val="24"/>
-        </w:rPr>
-        <w:t>}</w:t>
+        <w:t>journalEntriesImages}</w:t>
       </w:r>
     </w:p>
     <w:p>
@@ -3933,6 +3892,7 @@
   <w:style w:type="paragraph" w:default="1" w:styleId="Normal">
     <w:name w:val="Normal"/>
     <w:qFormat/>
+    <w:rsid w:val="009037A2"/>
   </w:style>
   <w:style w:type="paragraph" w:styleId="Heading1">
     <w:name w:val="heading 1"/>
@@ -4135,6 +4095,7 @@
   <w:style w:type="character" w:default="1" w:styleId="DefaultParagraphFont">
     <w:name w:val="Default Paragraph Font"/>
     <w:uiPriority w:val="1"/>
+    <w:semiHidden/>
     <w:unhideWhenUsed/>
   </w:style>
   <w:style w:type="table" w:default="1" w:styleId="TableNormal">
@@ -4538,6 +4499,25 @@
       <w:rFonts w:ascii="Arial" w:eastAsia="Arial" w:hAnsi="Arial" w:cs="Arial"/>
     </w:rPr>
   </w:style>
+  <w:style w:type="table" w:styleId="TableGrid">
+    <w:name w:val="Table Grid"/>
+    <w:basedOn w:val="TableNormal"/>
+    <w:uiPriority w:val="39"/>
+    <w:rsid w:val="009037A2"/>
+    <w:pPr>
+      <w:spacing w:after="0" w:line="240" w:lineRule="auto"/>
+    </w:pPr>
+    <w:tblPr>
+      <w:tblBorders>
+        <w:top w:val="single" w:sz="4" w:space="0" w:color="auto"/>
+        <w:left w:val="single" w:sz="4" w:space="0" w:color="auto"/>
+        <w:bottom w:val="single" w:sz="4" w:space="0" w:color="auto"/>
+        <w:right w:val="single" w:sz="4" w:space="0" w:color="auto"/>
+        <w:insideH w:val="single" w:sz="4" w:space="0" w:color="auto"/>
+        <w:insideV w:val="single" w:sz="4" w:space="0" w:color="auto"/>
+      </w:tblBorders>
+    </w:tblPr>
+  </w:style>
 </w:styles>
 </file>
 

</xml_diff>

<commit_message>
feat: supervisor device reset approval, coordinator settings, and digital signatures
</commit_message>
<xml_diff>
--- a/public/JournalTemplate.docx
+++ b/public/JournalTemplate.docx
@@ -235,12 +235,21 @@
         </w:rPr>
         <w:t xml:space="preserve"> </w:t>
       </w:r>
+      <w:proofErr w:type="spellStart"/>
       <w:r>
         <w:rPr>
           <w:sz w:val="32"/>
           <w:szCs w:val="32"/>
         </w:rPr>
-        <w:t>Bacolor,</w:t>
+        <w:t>Bacolor</w:t>
+      </w:r>
+      <w:proofErr w:type="spellEnd"/>
+      <w:r>
+        <w:rPr>
+          <w:sz w:val="32"/>
+          <w:szCs w:val="32"/>
+        </w:rPr>
+        <w:t>,</w:t>
       </w:r>
       <w:r>
         <w:rPr>
@@ -390,7 +399,55 @@
           <w:sz w:val="28"/>
           <w:u w:val="single"/>
         </w:rPr>
-        <w:t>{firstName} {middleInitial}. {lastName}</w:t>
+        <w:t>{</w:t>
+      </w:r>
+      <w:proofErr w:type="spellStart"/>
+      <w:r>
+        <w:rPr>
+          <w:sz w:val="28"/>
+          <w:u w:val="single"/>
+        </w:rPr>
+        <w:t>firstName</w:t>
+      </w:r>
+      <w:proofErr w:type="spellEnd"/>
+      <w:r>
+        <w:rPr>
+          <w:sz w:val="28"/>
+          <w:u w:val="single"/>
+        </w:rPr>
+        <w:t>} {</w:t>
+      </w:r>
+      <w:proofErr w:type="spellStart"/>
+      <w:r>
+        <w:rPr>
+          <w:sz w:val="28"/>
+          <w:u w:val="single"/>
+        </w:rPr>
+        <w:t>middleInitial</w:t>
+      </w:r>
+      <w:proofErr w:type="spellEnd"/>
+      <w:r>
+        <w:rPr>
+          <w:sz w:val="28"/>
+          <w:u w:val="single"/>
+        </w:rPr>
+        <w:t>}. {</w:t>
+      </w:r>
+      <w:proofErr w:type="spellStart"/>
+      <w:r>
+        <w:rPr>
+          <w:sz w:val="28"/>
+          <w:u w:val="single"/>
+        </w:rPr>
+        <w:t>lastName</w:t>
+      </w:r>
+      <w:proofErr w:type="spellEnd"/>
+      <w:r>
+        <w:rPr>
+          <w:sz w:val="28"/>
+          <w:u w:val="single"/>
+        </w:rPr>
+        <w:t>}</w:t>
       </w:r>
       <w:r>
         <w:rPr>
@@ -711,7 +768,7 @@
           <w:sz w:val="28"/>
           <w:u w:val="single"/>
         </w:rPr>
-        <w:t>JOHN PAULO L. BALUYUT</w:t>
+        <w:t>{COORDINATOR}</w:t>
       </w:r>
       <w:r>
         <w:rPr>
@@ -763,7 +820,15 @@
     </w:p>
     <w:p>
       <w:pPr>
-        <w:ind w:left="2880"/>
+        <w:rPr>
+          <w:b/>
+          <w:spacing w:val="-10"/>
+          <w:sz w:val="28"/>
+        </w:rPr>
+      </w:pPr>
+    </w:p>
+    <w:p>
+      <w:pPr>
         <w:rPr>
           <w:b/>
           <w:spacing w:val="-10"/>
@@ -889,7 +954,31 @@
               <w:t>Name:</w:t>
             </w:r>
             <w:r>
-              <w:t xml:space="preserve"> {lastName}, {firstName} {middleInitial}                </w:t>
+              <w:t xml:space="preserve"> {</w:t>
+            </w:r>
+            <w:proofErr w:type="spellStart"/>
+            <w:r>
+              <w:t>lastName</w:t>
+            </w:r>
+            <w:proofErr w:type="spellEnd"/>
+            <w:r>
+              <w:t>}, {</w:t>
+            </w:r>
+            <w:proofErr w:type="spellStart"/>
+            <w:r>
+              <w:t>firstName</w:t>
+            </w:r>
+            <w:proofErr w:type="spellEnd"/>
+            <w:r>
+              <w:t>} {</w:t>
+            </w:r>
+            <w:proofErr w:type="spellStart"/>
+            <w:r>
+              <w:t>middleInitial</w:t>
+            </w:r>
+            <w:proofErr w:type="spellEnd"/>
+            <w:r>
+              <w:t xml:space="preserve">}                </w:t>
             </w:r>
           </w:p>
         </w:tc>
@@ -1020,7 +1109,15 @@
               <w:t>Date of Birth:</w:t>
             </w:r>
             <w:r>
-              <w:t xml:space="preserve"> {dateOfBirth}                                  </w:t>
+              <w:t xml:space="preserve"> {</w:t>
+            </w:r>
+            <w:proofErr w:type="spellStart"/>
+            <w:r>
+              <w:t>dateOfBirth</w:t>
+            </w:r>
+            <w:proofErr w:type="spellEnd"/>
+            <w:r>
+              <w:t xml:space="preserve">}                                  </w:t>
             </w:r>
           </w:p>
         </w:tc>
@@ -1075,7 +1172,15 @@
               <w:t>Civil Status:</w:t>
             </w:r>
             <w:r>
-              <w:t xml:space="preserve"> {civilStatus}</w:t>
+              <w:t xml:space="preserve"> {</w:t>
+            </w:r>
+            <w:proofErr w:type="spellStart"/>
+            <w:r>
+              <w:t>civilStatus</w:t>
+            </w:r>
+            <w:proofErr w:type="spellEnd"/>
+            <w:r>
+              <w:t>}</w:t>
             </w:r>
           </w:p>
         </w:tc>
@@ -1136,7 +1241,15 @@
               <w:t xml:space="preserve"> </w:t>
             </w:r>
             <w:r>
-              <w:t>{fatherName}</w:t>
+              <w:t>{</w:t>
+            </w:r>
+            <w:proofErr w:type="spellStart"/>
+            <w:r>
+              <w:t>fatherName</w:t>
+            </w:r>
+            <w:proofErr w:type="spellEnd"/>
+            <w:r>
+              <w:t>}</w:t>
             </w:r>
           </w:p>
         </w:tc>
@@ -1192,7 +1305,21 @@
               <w:rPr>
                 <w:spacing w:val="40"/>
               </w:rPr>
-              <w:t>{fatherOccupation}</w:t>
+              <w:t>{</w:t>
+            </w:r>
+            <w:proofErr w:type="spellStart"/>
+            <w:r>
+              <w:rPr>
+                <w:spacing w:val="40"/>
+              </w:rPr>
+              <w:t>fatherOccupation</w:t>
+            </w:r>
+            <w:proofErr w:type="spellEnd"/>
+            <w:r>
+              <w:rPr>
+                <w:spacing w:val="40"/>
+              </w:rPr>
+              <w:t>}</w:t>
             </w:r>
           </w:p>
         </w:tc>
@@ -1223,7 +1350,15 @@
               <w:t xml:space="preserve"> </w:t>
             </w:r>
             <w:r>
-              <w:t>{fatherPhone}</w:t>
+              <w:t>{</w:t>
+            </w:r>
+            <w:proofErr w:type="spellStart"/>
+            <w:r>
+              <w:t>fatherPhone</w:t>
+            </w:r>
+            <w:proofErr w:type="spellEnd"/>
+            <w:r>
+              <w:t>}</w:t>
             </w:r>
           </w:p>
         </w:tc>
@@ -1259,7 +1394,15 @@
               <w:t xml:space="preserve"> </w:t>
             </w:r>
             <w:r>
-              <w:t>{motherName}</w:t>
+              <w:t>{</w:t>
+            </w:r>
+            <w:proofErr w:type="spellStart"/>
+            <w:r>
+              <w:t>motherName</w:t>
+            </w:r>
+            <w:proofErr w:type="spellEnd"/>
+            <w:r>
+              <w:t>}</w:t>
             </w:r>
           </w:p>
         </w:tc>
@@ -1310,7 +1453,15 @@
               <w:t xml:space="preserve"> </w:t>
             </w:r>
             <w:r>
-              <w:t>{motherOccupation}</w:t>
+              <w:t>{</w:t>
+            </w:r>
+            <w:proofErr w:type="spellStart"/>
+            <w:r>
+              <w:t>motherOccupation</w:t>
+            </w:r>
+            <w:proofErr w:type="spellEnd"/>
+            <w:r>
+              <w:t>}</w:t>
             </w:r>
           </w:p>
         </w:tc>
@@ -1341,7 +1492,15 @@
               <w:t xml:space="preserve"> </w:t>
             </w:r>
             <w:r>
-              <w:t>{motherPhone}</w:t>
+              <w:t>{</w:t>
+            </w:r>
+            <w:proofErr w:type="spellStart"/>
+            <w:r>
+              <w:t>motherPhone</w:t>
+            </w:r>
+            <w:proofErr w:type="spellEnd"/>
+            <w:r>
+              <w:t>}</w:t>
             </w:r>
           </w:p>
         </w:tc>
@@ -1377,7 +1536,15 @@
               <w:t xml:space="preserve"> </w:t>
             </w:r>
             <w:r>
-              <w:t>{guardianName}</w:t>
+              <w:t>{</w:t>
+            </w:r>
+            <w:proofErr w:type="spellStart"/>
+            <w:r>
+              <w:t>guardianName</w:t>
+            </w:r>
+            <w:proofErr w:type="spellEnd"/>
+            <w:r>
+              <w:t>}</w:t>
             </w:r>
           </w:p>
         </w:tc>
@@ -1428,7 +1595,15 @@
               <w:t xml:space="preserve"> </w:t>
             </w:r>
             <w:r>
-              <w:t>{guardianRelationship}</w:t>
+              <w:t>{</w:t>
+            </w:r>
+            <w:proofErr w:type="spellStart"/>
+            <w:r>
+              <w:t>guardianRelationship</w:t>
+            </w:r>
+            <w:proofErr w:type="spellEnd"/>
+            <w:r>
+              <w:t>}</w:t>
             </w:r>
           </w:p>
         </w:tc>
@@ -1474,7 +1649,15 @@
               <w:t xml:space="preserve"> </w:t>
             </w:r>
             <w:r>
-              <w:t>{guardianPhone}</w:t>
+              <w:t>{</w:t>
+            </w:r>
+            <w:proofErr w:type="spellStart"/>
+            <w:r>
+              <w:t>guardianPhone</w:t>
+            </w:r>
+            <w:proofErr w:type="spellEnd"/>
+            <w:r>
+              <w:t>}</w:t>
             </w:r>
           </w:p>
         </w:tc>
@@ -1532,7 +1715,15 @@
         <w:t>HTE Address</w:t>
       </w:r>
       <w:r>
-        <w:t>: {companyAddress}</w:t>
+        <w:t>: {</w:t>
+      </w:r>
+      <w:proofErr w:type="spellStart"/>
+      <w:r>
+        <w:t>companyAddress</w:t>
+      </w:r>
+      <w:proofErr w:type="spellEnd"/>
+      <w:r>
+        <w:t>}</w:t>
       </w:r>
     </w:p>
     <w:p>
@@ -1562,7 +1753,15 @@
         <w:t>Contact No/s of Point/Focal Person</w:t>
       </w:r>
       <w:r>
-        <w:t>: {supervisorContact}</w:t>
+        <w:t>: {</w:t>
+      </w:r>
+      <w:proofErr w:type="spellStart"/>
+      <w:r>
+        <w:t>supervisorContact</w:t>
+      </w:r>
+      <w:proofErr w:type="spellEnd"/>
+      <w:r>
+        <w:t>}</w:t>
       </w:r>
     </w:p>
     <w:p>
@@ -1603,6 +1802,45 @@
       <w:pPr>
         <w:jc w:val="both"/>
       </w:pPr>
+      <w:r>
+        <w:tab/>
+      </w:r>
+      <w:r>
+        <w:tab/>
+      </w:r>
+      <w:r>
+        <w:tab/>
+      </w:r>
+      <w:r>
+        <w:tab/>
+      </w:r>
+      <w:r>
+        <w:tab/>
+      </w:r>
+      <w:r>
+        <w:tab/>
+      </w:r>
+      <w:r>
+        <w:tab/>
+      </w:r>
+      <w:r>
+        <w:tab/>
+      </w:r>
+      <w:r>
+        <w:tab/>
+        <w:t xml:space="preserve">  {</w:t>
+      </w:r>
+      <w:r>
+        <w:t>%</w:t>
+      </w:r>
+      <w:proofErr w:type="spellStart"/>
+      <w:r>
+        <w:t>studentSignature</w:t>
+      </w:r>
+      <w:proofErr w:type="spellEnd"/>
+      <w:r>
+        <w:t>}</w:t>
+      </w:r>
     </w:p>
     <w:p>
       <w:pPr>
@@ -2193,23 +2431,23 @@
           <w:sz w:val="28"/>
           <w:u w:val="single"/>
         </w:rPr>
-        <w:t>{totalHours}‎ ‎ ‎ ‎ ‎ ‎ ‎ ‎‎‎‎‎‎‎‎‎‎‎‎‎‎‎‎‎‎‎</w:t>
-      </w:r>
-    </w:p>
-    <w:p>
-      <w:pPr>
-        <w:ind w:left="14"/>
-        <w:jc w:val="both"/>
+        <w:t>{</w:t>
+      </w:r>
+      <w:proofErr w:type="spellStart"/>
+      <w:r>
         <w:rPr>
           <w:sz w:val="28"/>
-        </w:rPr>
-      </w:pPr>
-      <w:r>
-        <w:rPr>
-          <w:spacing w:val="-2"/>
+          <w:u w:val="single"/>
+        </w:rPr>
+        <w:t>totalHours</w:t>
+      </w:r>
+      <w:proofErr w:type="spellEnd"/>
+      <w:r>
+        <w:rPr>
           <w:sz w:val="28"/>
-        </w:rPr>
-        <w:t>Noted:</w:t>
+          <w:u w:val="single"/>
+        </w:rPr>
+        <w:t>}‎ ‎ ‎ ‎ ‎ ‎ ‎ ‎‎‎‎‎‎‎‎‎‎‎‎‎‎‎‎‎‎‎</w:t>
       </w:r>
     </w:p>
     <w:p>
@@ -2237,8 +2475,8 @@
         <w:tblLook w:val="04A0" w:firstRow="1" w:lastRow="0" w:firstColumn="1" w:lastColumn="0" w:noHBand="0" w:noVBand="1"/>
       </w:tblPr>
       <w:tblGrid>
-        <w:gridCol w:w="4547"/>
-        <w:gridCol w:w="4453"/>
+        <w:gridCol w:w="4543"/>
+        <w:gridCol w:w="4447"/>
       </w:tblGrid>
       <w:tr>
         <w:trPr>
@@ -2246,7 +2484,28 @@
         </w:trPr>
         <w:tc>
           <w:tcPr>
-            <w:tcW w:w="4675" w:type="dxa"/>
+            <w:tcW w:w="4543" w:type="dxa"/>
+          </w:tcPr>
+          <w:p>
+            <w:pPr>
+              <w:ind w:left="14"/>
+              <w:jc w:val="both"/>
+              <w:rPr>
+                <w:sz w:val="28"/>
+              </w:rPr>
+            </w:pPr>
+            <w:r>
+              <w:rPr>
+                <w:spacing w:val="-2"/>
+                <w:sz w:val="28"/>
+              </w:rPr>
+              <w:t>Noted:</w:t>
+            </w:r>
+          </w:p>
+        </w:tc>
+        <w:tc>
+          <w:tcPr>
+            <w:tcW w:w="4447" w:type="dxa"/>
           </w:tcPr>
           <w:p>
             <w:pPr>
@@ -2255,54 +2514,109 @@
               <w:jc w:val="both"/>
               <w:rPr>
                 <w:sz w:val="28"/>
+                <w:szCs w:val="28"/>
+                <w:u w:val="single"/>
               </w:rPr>
             </w:pPr>
-            <w:r>
-              <w:rPr>
-                <w:sz w:val="28"/>
-                <w:u w:val="single"/>
-              </w:rPr>
-              <w:t xml:space="preserve">         {studentname}______                  </w:t>
-            </w:r>
           </w:p>
         </w:tc>
+      </w:tr>
+      <w:tr>
+        <w:trPr>
+          <w:trHeight w:val="737"/>
+        </w:trPr>
         <w:tc>
           <w:tcPr>
-            <w:tcW w:w="4675" w:type="dxa"/>
+            <w:tcW w:w="4543" w:type="dxa"/>
           </w:tcPr>
           <w:p>
             <w:pPr>
               <w:pStyle w:val="BodyText"/>
               <w:spacing w:before="321"/>
-              <w:jc w:val="both"/>
               <w:rPr>
                 <w:sz w:val="28"/>
+                <w:u w:val="single"/>
               </w:rPr>
             </w:pPr>
             <w:r>
               <w:rPr>
+                <w:szCs w:val="22"/>
+                <w:u w:val="single"/>
+              </w:rPr>
+              <w:t xml:space="preserve">                     </w:t>
+            </w:r>
+            <w:r>
+              <w:rPr>
+                <w:szCs w:val="22"/>
+                <w:u w:val="single"/>
+              </w:rPr>
+              <w:t>{</w:t>
+            </w:r>
+            <w:proofErr w:type="spellStart"/>
+            <w:r>
+              <w:rPr>
+                <w:szCs w:val="22"/>
+                <w:u w:val="single"/>
+              </w:rPr>
+              <w:t>studentname</w:t>
+            </w:r>
+            <w:proofErr w:type="spellEnd"/>
+            <w:r>
+              <w:rPr>
+                <w:szCs w:val="22"/>
+                <w:u w:val="single"/>
+              </w:rPr>
+              <w:t>}</w:t>
+            </w:r>
+            <w:r>
+              <w:rPr>
+                <w:szCs w:val="22"/>
+                <w:u w:val="single"/>
+              </w:rPr>
+              <w:t xml:space="preserve">                     </w:t>
+            </w:r>
+          </w:p>
+        </w:tc>
+        <w:tc>
+          <w:tcPr>
+            <w:tcW w:w="4447" w:type="dxa"/>
+          </w:tcPr>
+          <w:p>
+            <w:pPr>
+              <w:pStyle w:val="BodyText"/>
+              <w:spacing w:before="321"/>
+              <w:jc w:val="center"/>
+              <w:rPr>
                 <w:sz w:val="28"/>
-                <w:szCs w:val="28"/>
+              </w:rPr>
+            </w:pPr>
+            <w:r>
+              <w:rPr>
                 <w:u w:val="single"/>
               </w:rPr>
-              <w:t xml:space="preserve">             {supervisor}‎‎ ‎ ‎ ‎ ‎ ‎ ‎ ‎ ‎ ‎ ‎ ‎ ‎ ‎ ‎ ‎ ‎</w:t>
+              <w:t xml:space="preserve">             </w:t>
+            </w:r>
+            <w:r>
+              <w:rPr>
+                <w:u w:val="single"/>
+              </w:rPr>
+              <w:t>{supervisor}‎‎ ‎ ‎ ‎ ‎ ‎ ‎ ‎ ‎ ‎ ‎ ‎ ‎ ‎ ‎ ‎ ‎</w:t>
             </w:r>
           </w:p>
         </w:tc>
       </w:tr>
       <w:tr>
         <w:trPr>
-          <w:trHeight w:val="899"/>
+          <w:trHeight w:val="725"/>
         </w:trPr>
         <w:tc>
           <w:tcPr>
-            <w:tcW w:w="4675" w:type="dxa"/>
+            <w:tcW w:w="4543" w:type="dxa"/>
           </w:tcPr>
           <w:p>
             <w:pPr>
               <w:pStyle w:val="BodyText"/>
-              <w:spacing w:before="321"/>
-              <w:jc w:val="both"/>
+              <w:jc w:val="center"/>
             </w:pPr>
             <w:r>
               <w:t>Student Intern</w:t>
@@ -2311,8 +2625,7 @@
           <w:p>
             <w:pPr>
               <w:pStyle w:val="BodyText"/>
-              <w:spacing w:before="321"/>
-              <w:jc w:val="both"/>
+              <w:jc w:val="center"/>
               <w:rPr>
                 <w:sz w:val="28"/>
               </w:rPr>
@@ -2324,13 +2637,12 @@
         </w:tc>
         <w:tc>
           <w:tcPr>
-            <w:tcW w:w="4675" w:type="dxa"/>
+            <w:tcW w:w="4447" w:type="dxa"/>
           </w:tcPr>
           <w:p>
             <w:pPr>
               <w:pStyle w:val="BodyText"/>
-              <w:spacing w:before="321"/>
-              <w:jc w:val="both"/>
+              <w:jc w:val="center"/>
             </w:pPr>
             <w:r>
               <w:t>HTE Point/Focal Person</w:t>
@@ -2339,8 +2651,7 @@
           <w:p>
             <w:pPr>
               <w:pStyle w:val="BodyText"/>
-              <w:spacing w:before="321"/>
-              <w:jc w:val="both"/>
+              <w:jc w:val="center"/>
               <w:rPr>
                 <w:sz w:val="28"/>
               </w:rPr>
@@ -2408,12 +2719,6 @@
           <w:spacing w:val="-2"/>
         </w:rPr>
       </w:pPr>
-      <w:r>
-        <w:rPr>
-          <w:spacing w:val="-2"/>
-        </w:rPr>
-        <w:t>{/months}</w:t>
-      </w:r>
     </w:p>
     <w:p>
       <w:pPr>
@@ -2444,6 +2749,12 @@
           <w:spacing w:val="-2"/>
         </w:rPr>
       </w:pPr>
+      <w:r>
+        <w:rPr>
+          <w:spacing w:val="-2"/>
+        </w:rPr>
+        <w:t>{/months}</w:t>
+      </w:r>
     </w:p>
     <w:p>
       <w:pPr>
@@ -3025,7 +3336,30 @@
         <w:spacing w:before="37"/>
         <w:ind w:right="659"/>
         <w:jc w:val="both"/>
-      </w:pPr>
+        <w:rPr>
+          <w:spacing w:val="-2"/>
+        </w:rPr>
+      </w:pPr>
+    </w:p>
+    <w:p>
+      <w:pPr>
+        <w:widowControl/>
+        <w:autoSpaceDE/>
+        <w:autoSpaceDN/>
+        <w:rPr>
+          <w:rFonts w:ascii="Calibri"/>
+          <w:sz w:val="16"/>
+          <w:szCs w:val="24"/>
+        </w:rPr>
+      </w:pPr>
+      <w:r>
+        <w:rPr>
+          <w:rFonts w:ascii="Calibri"/>
+          <w:sz w:val="16"/>
+          <w:szCs w:val="24"/>
+        </w:rPr>
+        <w:br w:type="page"/>
+      </w:r>
     </w:p>
     <w:p>
       <w:pPr>
@@ -3056,16 +3390,34 @@
           <w:sz w:val="24"/>
           <w:szCs w:val="24"/>
         </w:rPr>
-        <w:t>{%journalEntriesImages}</w:t>
-      </w:r>
-    </w:p>
-    <w:p>
-      <w:pPr>
-        <w:pStyle w:val="BodyText"/>
-        <w:spacing w:before="4"/>
+        <w:t>{%</w:t>
+      </w:r>
+      <w:proofErr w:type="spellStart"/>
+      <w:r>
+        <w:rPr>
+          <w:sz w:val="24"/>
+          <w:szCs w:val="24"/>
+        </w:rPr>
+        <w:t>journalEntriesImages</w:t>
+      </w:r>
+      <w:proofErr w:type="spellEnd"/>
+      <w:r>
+        <w:rPr>
+          <w:sz w:val="24"/>
+          <w:szCs w:val="24"/>
+        </w:rPr>
+        <w:t>}</w:t>
+      </w:r>
+    </w:p>
+    <w:p>
+      <w:pPr>
+        <w:widowControl/>
+        <w:autoSpaceDE/>
+        <w:autoSpaceDN/>
         <w:rPr>
           <w:rFonts w:ascii="Calibri"/>
           <w:sz w:val="16"/>
+          <w:szCs w:val="24"/>
         </w:rPr>
       </w:pPr>
     </w:p>

</xml_diff>